<commit_message>
Drop the thermal-expansion note under the RMSE table
It said the row measures Ladrillo's fit relative to BRICK 2.0 rather than absolute accuracy, then
pointed at the depth-scope discussion below, which makes the same point with the numbers. A note
that defers to the text it duplicates is not doing work.

The depth-scope argument itself is untouched and still in the Observational Comparison text.

Co-Authored-By: Claude Opus 5 <noreply@anthropic.com>
</commit_message>
<xml_diff>
--- a/deliverables/LadrilloUpdateDescription_L24.docx
+++ b/deliverables/LadrilloUpdateDescription_L24.docx
@@ -2181,18 +2181,6 @@
       </w:r>
       <w:r>
         <w:t xml:space="preserve">weight in the earliest, sparsest-observation window than anywhere else.</w:t>
-      </w:r>
-    </w:p>
-    <w:p>
-      <w:pPr>
-        <w:pStyle w:val="BodyText"/>
-      </w:pPr>
-      <w:r>
-        <w:rPr>
-          <w:i/>
-          <w:iCs/>
-        </w:rPr>
-        <w:t xml:space="preserve">Thermal expansion in both models is driven by FaIR's full-depth ocean heat against a 0–2000 m target, so this row measures Ladrillo's fit relative to BRICK 2.0, not absolute accuracy — see the depth-scope discussion below.</w:t>
       </w:r>
     </w:p>
     <w:p>

</xml_diff>

<commit_message>
Apply Marcus's second 9/11 comments: captions cut to essentials, TE depth band on FIG 1, Fig 9b dropped, FIG 10 climate-swap figure, three false sentences fixed
Eight of nine comments applied; the ninth (a single MAGICC-climate figure)
is FIG 10 (plot_vv_climate_swap.py), for which BRICK 2.0 was run on MAGICC's
climate on the seven markers. On review two sentences were also false
('closer on every ice component'; 'narrower than FACTS on every component')
and the TE paragraph's apparent contradiction was wording. CHANGELOG 09-11g.

Co-Authored-By: Claude Opus 5 <noreply@anthropic.com>
</commit_message>
<xml_diff>
--- a/deliverables/LadrilloUpdateDescription_L24.docx
+++ b/deliverables/LadrilloUpdateDescription_L24.docx
@@ -2,7 +2,7 @@
 <file path=word/document.xml><?xml version="1.0" encoding="utf-8"?>
 <w:document xmlns:w="http://schemas.openxmlformats.org/wordprocessingml/2006/main" xmlns:m="http://schemas.openxmlformats.org/officeDocument/2006/math" xmlns:r="http://schemas.openxmlformats.org/officeDocument/2006/relationships" xmlns:o="urn:schemas-microsoft-com:office:office" xmlns:v="urn:schemas-microsoft-com:vml" xmlns:w10="urn:schemas-microsoft-com:office:word" xmlns:a="http://schemas.openxmlformats.org/drawingml/2006/main" xmlns:pic="http://schemas.openxmlformats.org/drawingml/2006/picture" xmlns:wp="http://schemas.openxmlformats.org/drawingml/2006/wordprocessingDrawing">
   <w:body>
-    <w:bookmarkStart w:id="46" w:name="ladrillo-sea-level-rise-emulator"/>
+    <w:bookmarkStart w:id="49" w:name="ladrillo-sea-level-rise-emulator"/>
     <w:p>
       <w:pPr>
         <w:pStyle w:val="Heading1"/>
@@ -367,7 +367,7 @@
         <w:t xml:space="preserve"> </w:t>
       </w:r>
       <w:r>
-        <w:t xml:space="preserve">The observed Greenland contribution rises quickly from the 1930s to the 1960s, nearly stalls from the 1960s to 1990, then accelerates; BRICK 2.0's single-channel response to global temperature yields an almost uniform rate across the century (0.46–0.49 cm/decade in every 30-year period against an observed 0.67 then 0.23), so it runs about 1 cm low through the 1950s–60s and 0.2 cm low since 2010. Ladrillo reproduces the shape because its fast surface-mass-balance channel responds to Greenland's local warming of about 1.2 °C during 1920–45 (in contrast to 0.2 °C globally), then local cooling through 1990 while the globe warmed. Meanwhile, the slow discharge channel carries the long-term trend. MAGICC similarly splits Greenland into SMB and SID and parameterises against SICOPOLIS, but with 17 parameters between the two, of which 9 vary and each of those takes only 4 distinct values.</w:t>
+        <w:t xml:space="preserve">The observed Greenland contribution rises quickly from the 1930s to the 1960s, nearly stalls from the 1960s to 1990, then accelerates; BRICK 2.0's single-channel response to global temperature yields an almost uniform rate across the century (0.46–0.49 cm/decade in every 30-year period against an observed 0.67 then 0.23), so it runs about 1 cm low through the 1950s–60s and 0.2 cm low since 2010. Ladrillo reproduces the shape because its fast surface-mass-balance channel responds to Greenland's local warming of about 1.2 °C during 1920–45 (in contrast to 0.2 °C globally), then local cooling through 1990 while the globe warmed. Meanwhile, the slow discharge channel carries the long-term trend. MAGICC similarly splits Greenland into SMB and SID and parameterises against SICOPOLIS, but with 17 parameters between the two, of which 9 vary and each of those takes only 4 distinct values. MAGICC’s Greenland melt module starts in 1990, and underestimates melt relative to observations over the 1990-2026 period.</w:t>
       </w:r>
     </w:p>
     <w:bookmarkEnd w:id="10"/>
@@ -407,8 +407,8 @@
         <w:tblLook w:firstRow="1" w:lastRow="0" w:firstColumn="0" w:lastColumn="0" w:noHBand="0" w:noVBand="0" w:val="0020"/>
       </w:tblPr>
       <w:tblGrid>
-        <w:gridCol w:w="1320"/>
-        <w:gridCol w:w="4092"/>
+        <w:gridCol w:w="1188"/>
+        <w:gridCol w:w="4224"/>
         <w:gridCol w:w="2508"/>
       </w:tblGrid>
       <w:tr>
@@ -457,28 +457,30 @@
               <w:pStyle w:val="Compact"/>
             </w:pPr>
             <w:r>
-              <w:rPr>
-                <w:b/>
-                <w:bCs/>
-              </w:rPr>
-              <w:t xml:space="preserve">Dangendorf 2024</w:t>
+              <w:t xml:space="preserve">Dangendorf 2024 GMSL</w:t>
+            </w:r>
+          </w:p>
+        </w:tc>
+        <w:tc>
+          <w:tcPr/>
+          <w:p>
+            <w:pPr>
+              <w:pStyle w:val="Compact"/>
+            </w:pPr>
+            <w:r>
+              <w:t xml:space="preserve">Zenodo</w:t>
             </w:r>
             <w:r>
               <w:t xml:space="preserve"> </w:t>
             </w:r>
             <w:r>
-              <w:t xml:space="preserve">GMSL</w:t>
-            </w:r>
-          </w:p>
-        </w:tc>
-        <w:tc>
-          <w:tcPr/>
-          <w:p>
-            <w:pPr>
-              <w:pStyle w:val="Compact"/>
-            </w:pPr>
-            <w:r>
-              <w:t xml:space="preserve">Zenodo</w:t>
+              <w:rPr>
+                <w:rStyle w:val="VerbatimChar"/>
+              </w:rPr>
+              <w:t xml:space="preserve">10.5281/zenodo.10621070</w:t>
+            </w:r>
+            <w:r>
+              <w:t xml:space="preserve">; GMSL derived from</w:t>
             </w:r>
             <w:r>
               <w:t xml:space="preserve"> </w:t>
@@ -487,38 +489,10 @@
               <w:rPr>
                 <w:rStyle w:val="VerbatimChar"/>
               </w:rPr>
-              <w:t xml:space="preserve">10.5281/zenodo.10621070</w:t>
-            </w:r>
-            <w:r>
-              <w:t xml:space="preserve">; GMSL derived from</w:t>
-            </w:r>
-            <w:r>
-              <w:t xml:space="preserve"> </w:t>
-            </w:r>
-            <w:r>
-              <w:rPr>
-                <w:rStyle w:val="VerbatimChar"/>
-              </w:rPr>
               <w:t xml:space="preserve">Fields.nc</w:t>
             </w:r>
             <w:r>
-              <w:t xml:space="preserve">,</w:t>
-            </w:r>
-            <w:r>
-              <w:t xml:space="preserve"> </w:t>
-            </w:r>
-            <w:r>
-              <w:rPr>
-                <w:b/>
-                <w:bCs/>
-              </w:rPr>
-              <w:t xml:space="preserve">not</w:t>
-            </w:r>
-            <w:r>
-              <w:t xml:space="preserve"> </w:t>
-            </w:r>
-            <w:r>
-              <w:t xml:space="preserve">the record's</w:t>
+              <w:t xml:space="preserve">, not the record's</w:t>
             </w:r>
             <w:r>
               <w:t xml:space="preserve"> </w:t>
@@ -572,41 +546,18 @@
               <w:pStyle w:val="Compact"/>
             </w:pPr>
             <w:r>
-              <w:rPr>
-                <w:b/>
-                <w:bCs/>
-              </w:rPr>
-              <w:t xml:space="preserve">GlaMBIE</w:t>
-            </w:r>
-            <w:r>
-              <w:t xml:space="preserve"> </w:t>
-            </w:r>
-            <w:r>
-              <w:t xml:space="preserve">glacier series (2019 onward)</w:t>
-            </w:r>
-          </w:p>
-        </w:tc>
-        <w:tc>
-          <w:tcPr/>
-          <w:p>
-            <w:pPr>
-              <w:pStyle w:val="Compact"/>
-            </w:pPr>
-            <w:r>
-              <w:t xml:space="preserve">Dataset</w:t>
-            </w:r>
-            <w:r>
-              <w:t xml:space="preserve"> </w:t>
-            </w:r>
-            <w:r>
-              <w:rPr>
-                <w:b/>
-                <w:bCs/>
-              </w:rPr>
-              <w:t xml:space="preserve">1.0.0</w:t>
-            </w:r>
-            <w:r>
-              <w:t xml:space="preserve">, DOI</w:t>
+              <w:t xml:space="preserve">GlaMBIE glacier series (2019 onward)</w:t>
+            </w:r>
+          </w:p>
+        </w:tc>
+        <w:tc>
+          <w:tcPr/>
+          <w:p>
+            <w:pPr>
+              <w:pStyle w:val="Compact"/>
+            </w:pPr>
+            <w:r>
+              <w:t xml:space="preserve">Dataset 1.0.0, DOI</w:t>
             </w:r>
             <w:r>
               <w:t xml:space="preserve"> </w:t>
@@ -651,10 +602,6 @@
               <w:pStyle w:val="Compact"/>
             </w:pPr>
             <w:r>
-              <w:rPr>
-                <w:b/>
-                <w:bCs/>
-              </w:rPr>
               <w:t xml:space="preserve">JPL GRACE / GRACE-FO mascons</w:t>
             </w:r>
           </w:p>
@@ -666,20 +613,7 @@
               <w:pStyle w:val="Compact"/>
             </w:pPr>
             <w:r>
-              <w:t xml:space="preserve">Release</w:t>
-            </w:r>
-            <w:r>
-              <w:t xml:space="preserve"> </w:t>
-            </w:r>
-            <w:r>
-              <w:rPr>
-                <w:b/>
-                <w:bCs/>
-              </w:rPr>
-              <w:t xml:space="preserve">RL06.3Mv04 CRI</w:t>
-            </w:r>
-            <w:r>
-              <w:t xml:space="preserve">, DOI</w:t>
+              <w:t xml:space="preserve">Release RL06.3Mv04 CRI, DOI</w:t>
             </w:r>
             <w:r>
               <w:t xml:space="preserve"> </w:t>
@@ -724,17 +658,7 @@
               <w:pStyle w:val="Compact"/>
             </w:pPr>
             <w:r>
-              <w:rPr>
-                <w:b/>
-                <w:bCs/>
-              </w:rPr>
-              <w:t xml:space="preserve">Mouginot</w:t>
-            </w:r>
-            <w:r>
-              <w:t xml:space="preserve"> </w:t>
-            </w:r>
-            <w:r>
-              <w:t xml:space="preserve">Greenland sector shares</w:t>
+              <w:t xml:space="preserve">Mouginot Greenland sector shares</w:t>
             </w:r>
           </w:p>
         </w:tc>
@@ -784,17 +708,7 @@
               <w:pStyle w:val="Compact"/>
             </w:pPr>
             <w:r>
-              <w:rPr>
-                <w:b/>
-                <w:bCs/>
-              </w:rPr>
-              <w:t xml:space="preserve">Rignot 2019</w:t>
-            </w:r>
-            <w:r>
-              <w:t xml:space="preserve"> </w:t>
-            </w:r>
-            <w:r>
-              <w:t xml:space="preserve">Antarctic SMB, area-corrected ×0.888</w:t>
+              <w:t xml:space="preserve">Rignot 2019 Antarctic SMB, area-corrected ×0.888</w:t>
             </w:r>
           </w:p>
         </w:tc>
@@ -839,17 +753,7 @@
               <w:pStyle w:val="Compact"/>
             </w:pPr>
             <w:r>
-              <w:rPr>
-                <w:b/>
-                <w:bCs/>
-              </w:rPr>
-              <w:t xml:space="preserve">Glacier inventory</w:t>
-            </w:r>
-            <w:r>
-              <w:t xml:space="preserve"> </w:t>
-            </w:r>
-            <w:r>
-              <w:t xml:space="preserve">likelihood + a 19th-century flow constraint,</w:t>
+              <w:t xml:space="preserve">Glacier inventory likelihood + a 19th-century flow constraint,</w:t>
             </w:r>
             <w:r>
               <w:t xml:space="preserve"> </w:t>
@@ -888,48 +792,19 @@
               <w:t xml:space="preserve"> </w:t>
             </w:r>
             <w:r>
-              <w:t xml:space="preserve">12:168) reconciled per Hock 2023, at the RGI ~2000 outline epoch, entered as published values; region polygons GTN-G Glacier Regions</w:t>
+              <w:t xml:space="preserve">12:168) reconciled per Hock 2023, at the RGI ~2000 outline epoch, entered as published values; region polygons GTN-G Glacier Regions 2023, DOI</w:t>
             </w:r>
             <w:r>
               <w:t xml:space="preserve"> </w:t>
             </w:r>
             <w:r>
               <w:rPr>
-                <w:b/>
-                <w:bCs/>
-              </w:rPr>
-              <w:t xml:space="preserve">2023</w:t>
-            </w:r>
-            <w:r>
-              <w:t xml:space="preserve">, DOI</w:t>
-            </w:r>
-            <w:r>
-              <w:t xml:space="preserve"> </w:t>
-            </w:r>
-            <w:r>
-              <w:rPr>
                 <w:rStyle w:val="VerbatimChar"/>
               </w:rPr>
               <w:t xml:space="preserve">10.5904/gtng-glacreg-2023-07</w:t>
             </w:r>
             <w:r>
-              <w:t xml:space="preserve">, on the</w:t>
-            </w:r>
-            <w:r>
-              <w:t xml:space="preserve"> </w:t>
-            </w:r>
-            <w:r>
-              <w:rPr>
-                <w:b/>
-                <w:bCs/>
-              </w:rPr>
-              <w:t xml:space="preserve">RGI6</w:t>
-            </w:r>
-            <w:r>
-              <w:t xml:space="preserve"> </w:t>
-            </w:r>
-            <w:r>
-              <w:t xml:space="preserve">scheme. 19th-c flow: Leclercq/Oerlemans/Cogley 2011, DOI</w:t>
+              <w:t xml:space="preserve">, on the RGI6 scheme. 19th-c flow: Leclercq/Oerlemans/Cogley 2011, DOI</w:t>
             </w:r>
             <w:r>
               <w:t xml:space="preserve"> </w:t>
@@ -962,17 +837,7 @@
               <w:pStyle w:val="Compact"/>
             </w:pPr>
             <w:r>
-              <w:rPr>
-                <w:b/>
-                <w:bCs/>
-              </w:rPr>
-              <w:t xml:space="preserve">CMIP6 regional amplification</w:t>
-            </w:r>
-            <w:r>
-              <w:t xml:space="preserve"> </w:t>
-            </w:r>
-            <w:r>
-              <w:t xml:space="preserve">(34–41 models)</w:t>
+              <w:t xml:space="preserve">CMIP6 regional amplification (34–41 models)</w:t>
             </w:r>
           </w:p>
         </w:tc>
@@ -1007,17 +872,7 @@
               <w:pStyle w:val="Compact"/>
             </w:pPr>
             <w:r>
-              <w:rPr>
-                <w:b/>
-                <w:bCs/>
-              </w:rPr>
-              <w:t xml:space="preserve">Paleo constraints</w:t>
-            </w:r>
-            <w:r>
-              <w:t xml:space="preserve"> </w:t>
-            </w:r>
-            <w:r>
-              <w:t xml:space="preserve">on DAIS geometry, in a standardised correlation form</w:t>
+              <w:t xml:space="preserve">Paleo constraints on DAIS geometry, in a standardised correlation form</w:t>
             </w:r>
           </w:p>
         </w:tc>
@@ -1083,17 +938,7 @@
               <w:t xml:space="preserve"> </w:t>
             </w:r>
             <w:r>
-              <w:rPr>
-                <w:b/>
-                <w:bCs/>
-              </w:rPr>
-              <w:t xml:space="preserve">IGCC 2025-indicators</w:t>
-            </w:r>
-            <w:r>
-              <w:t xml:space="preserve"> </w:t>
-            </w:r>
-            <w:r>
-              <w:t xml:space="preserve">GMSL</w:t>
+              <w:t xml:space="preserve">IGCC 2025-indicators GMSL</w:t>
             </w:r>
           </w:p>
         </w:tc>
@@ -1183,10 +1028,13 @@
           <w:b/>
           <w:bCs/>
         </w:rPr>
-        <w:t xml:space="preserve">Deliberately removed: IMBIE</w:t>
-      </w:r>
-      <w:r>
-        <w:t xml:space="preserve">, dropped from the Antarctic likelihood to avoid double-weighting the same mass-balance information already entering through other terms.</w:t>
+        <w:t xml:space="preserve">Deliberately removed: IMBIE.</w:t>
+      </w:r>
+      <w:r>
+        <w:t xml:space="preserve"> </w:t>
+      </w:r>
+      <w:r>
+        <w:t xml:space="preserve">Dropped from the Antarctic likelihood to avoid double-weighting the same mass-balance information already entering through other terms.</w:t>
       </w:r>
     </w:p>
     <w:p>
@@ -1204,14 +1052,43 @@
         <w:t xml:space="preserve"> </w:t>
       </w:r>
       <w:r>
+        <w:t xml:space="preserve">FaIR 2.2.4 (fair-calibrate 1.6.0), driven by CMIP7 historical emissions 1750–2023 spliced at 2023.5 to MESSAGE-GLOBIOM SSP2-4.5 and harmonized per species. The calibration's fit window runs to 2026, so its last three years are driven by the scenario rather than by the historical emissions inventory — a difference bounded at about 0.002 W/m².</w:t>
+      </w:r>
+    </w:p>
+    <w:p>
+      <w:pPr>
+        <w:pStyle w:val="BodyText"/>
+      </w:pPr>
+      <w:r>
         <w:rPr>
           <w:b/>
           <w:bCs/>
         </w:rPr>
-        <w:t xml:space="preserve">FaIR 2.2.4 (fair-calibrate 1.6.0)</w:t>
-      </w:r>
-      <w:r>
-        <w:t xml:space="preserve">, driven by CMIP7 historical emissions 1750–2023 spliced at 2023.5 to MESSAGE-GLOBIOM SSP2-4.5 and harmonized per species. The calibration's fit window runs to 2026, so its last three years are driven by the scenario rather than by the historical emissions inventory — a difference bounded at about 0.002 W/m².</w:t>
+        <w:t xml:space="preserve">Sampler.</w:t>
+      </w:r>
+      <w:r>
+        <w:t xml:space="preserve"> </w:t>
+      </w:r>
+      <w:r>
+        <w:t xml:space="preserve">Over-dispersed chain starts.</w:t>
+      </w:r>
+    </w:p>
+    <w:bookmarkEnd w:id="12"/>
+    <w:bookmarkStart w:id="13" w:name="ladrillo-calibration-approach-updates"/>
+    <w:p>
+      <w:pPr>
+        <w:pStyle w:val="Heading2"/>
+      </w:pPr>
+      <w:r>
+        <w:t xml:space="preserve">Ladrillo Calibration Approach Updates</w:t>
+      </w:r>
+    </w:p>
+    <w:p>
+      <w:pPr>
+        <w:pStyle w:val="FirstParagraph"/>
+      </w:pPr>
+      <w:r>
+        <w:t xml:space="preserve">58 parameters are sampled: 17 Antarctic, 9 Greenland, 19 glacier, 13 remaining (thermal expansion, two discrepancy bases, and four AR(1) noise pairs). Four Antarctic changes distinguish Ladrillo's calibration from BRICK 2.0's — the three described below, plus an SMB likelihood term anchoring the Antarctic flux scale to Rignot 2019. The Antarctic changes have not been tested individually, so the AIS changes cannot be formally attributed by parameter.</w:t>
       </w:r>
     </w:p>
     <w:p>
@@ -1223,56 +1100,13 @@
           <w:b/>
           <w:bCs/>
         </w:rPr>
-        <w:t xml:space="preserve">Sampler.</w:t>
-      </w:r>
-      <w:r>
-        <w:t xml:space="preserve"> </w:t>
-      </w:r>
-      <w:r>
-        <w:t xml:space="preserve">Over-dispersed chain starts.</w:t>
-      </w:r>
-    </w:p>
-    <w:bookmarkEnd w:id="12"/>
-    <w:bookmarkStart w:id="13" w:name="ladrillo-calibration-approach-updates"/>
-    <w:p>
-      <w:pPr>
-        <w:pStyle w:val="Heading2"/>
-      </w:pPr>
-      <w:r>
-        <w:t xml:space="preserve">Ladrillo Calibration Approach Updates</w:t>
-      </w:r>
-    </w:p>
-    <w:p>
-      <w:pPr>
-        <w:pStyle w:val="FirstParagraph"/>
-      </w:pPr>
-      <w:r>
-        <w:rPr>
-          <w:b/>
-          <w:bCs/>
-        </w:rPr>
-        <w:t xml:space="preserve">58 parameters are sampled</w:t>
-      </w:r>
-      <w:r>
-        <w:t xml:space="preserve">: 17 Antarctic, 9 Greenland, 19 glacier, 13 remaining (thermal expansion, two discrepancy bases, and four AR(1) noise pairs). Four Antarctic changes distinguish Ladrillo's calibration from BRICK 2.0's — the three described below, plus an SMB likelihood term anchoring the Antarctic flux scale to Rignot 2019. The Antarctic changes have not been tested individually, so the AIS changes cannot be formally attributed by parameter.</w:t>
-      </w:r>
-    </w:p>
-    <w:p>
-      <w:pPr>
-        <w:pStyle w:val="BodyText"/>
-      </w:pPr>
-      <w:r>
-        <w:rPr>
-          <w:b/>
-          <w:bCs/>
-        </w:rPr>
-        <w:t xml:space="preserve">The seven DAIS geometry parameters</w:t>
-      </w:r>
-      <w:r>
-        <w:t xml:space="preserve"> </w:t>
-      </w:r>
-      <w:r>
-        <w:t xml:space="preserve">(</w:t>
+        <w:t xml:space="preserve">The seven DAIS geometry parameters.</w:t>
+      </w:r>
+      <w:r>
+        <w:t xml:space="preserve"> </w:t>
+      </w:r>
+      <w:r>
+        <w:t xml:space="preserve">The seven parameters (</w:t>
       </w:r>
       <w:r>
         <w:rPr>
@@ -1533,19 +1367,7 @@
         <w:t xml:space="preserve"> </w:t>
       </w:r>
       <w:r>
-        <w:t xml:space="preserve">Component hindcasts against the observations, 1900–2026, in cm relative to a 1995–2005 baseline. Ladrillo L24 (solid, with its 5–95% band) and BRICK 2.0 (dashed) are both integrated from 1850, plotted from 1900, and driven by the same ssp245harm forcing. The Greenland panel also shows MAGICC-SLR (v7.5.3 + Nauels 2025, dotted, with its 5–95% band) from 1991, the first year its Greenland module is active; it runs on its own emissions-driven climate. The total panel also shows IGCC 2025-indicators GMSL (tag</w:t>
-      </w:r>
-      <w:r>
-        <w:t xml:space="preserve"> </w:t>
-      </w:r>
-      <w:r>
-        <w:rPr>
-          <w:rStyle w:val="VerbatimChar"/>
-        </w:rPr>
-        <w:t xml:space="preserve">v2026.06.02</w:t>
-      </w:r>
-      <w:r>
-        <w:t xml:space="preserve">) as an independent consensus check, not a calibration target. Land-water storage is observational — neither model predicts it, so panel (e) shows the observed series alone and both totals carry it.</w:t>
+        <w:t xml:space="preserve">Component hindcasts against the observations, 1900–2026, in cm relative to a 1995–2005 baseline. Ladrillo L24 (solid, with its 5–95% band) and BRICK 2.0 (dashed) are both run starting in 1850, plotted from 1900, and driven by the same ssp245harm forcing. The Greenland panel also shows MAGICC-SLR (v7.5.3 + Nauels 2025, dotted, with its 5–95% band) from 1991, the first year its Greenland module is active; it runs on its own emissions-driven climate. The total panel also shows IGCC 2025-indicators GMSL, which is not a calibration target. On the thermal-expansion panel the hatched band above the observation is the most the ocean below 2000 m could add to a 0–2000 m observation (IGCC deep-ocean heat times the observed upper-ocean expansion coefficient; an upper bound). Land-water storage is observational — neither model predicts it, so panel (e) shows the observed series alone and both totals carry it.</w:t>
       </w:r>
     </w:p>
     <w:p>
@@ -2078,31 +1900,15 @@
         <w:pStyle w:val="BodyText"/>
       </w:pPr>
       <w:r>
-        <w:t xml:space="preserve">Ladrillo is closer than BRICK 2.0 on every component in the two earliest windows yet further from the total there, and the reason is compensating error. Over 1900–1919 BRICK's Antarctic undershoot (−2.90 cm) and glacier overshoot (+3.28 cm) are opposite in sign and nearly equal, so its four component biases sum to +0.62 cm out of 7.57 cm of absolute error — about 90% cancels. Ladrillo's biases are small but almost all positive, summing to +1.95 cm out of 1.97 cm, so essentially none cancels. The same pattern holds over 1920–1949. The observational budget's own non-closure is common to both arms and small in these windows (−0.31 and +0.17 cm), so it cannot account for the difference. The component rows are therefore the skill statement; the total row additionally reflects whether a model's errors happen to oppose one another. Ladrillo uses the observed LWS time series directly, whereas native BRICK subtracts LWS prior to calibration, so its components represent sea level excluding LWS; the observed series is added to both totals to put them on the same basis as the LWS-inclusive observational total. Separately, BRICK 2.0 runs on its own published posterior against our extended targets, so part of its bias is target vintage — a caveat that carries</w:t>
-      </w:r>
-      <w:r>
-        <w:t xml:space="preserve"> </w:t>
-      </w:r>
-      <w:r>
-        <w:rPr>
-          <w:i/>
-          <w:iCs/>
-        </w:rPr>
-        <w:t xml:space="preserve">more</w:t>
-      </w:r>
-      <w:r>
-        <w:t xml:space="preserve"> </w:t>
-      </w:r>
-      <w:r>
-        <w:t xml:space="preserve">weight in the earliest, sparsest-observation window than anywhere else.</w:t>
-      </w:r>
-    </w:p>
-    <w:p>
-      <w:pPr>
-        <w:pStyle w:val="BodyText"/>
-      </w:pPr>
-      <w:r>
-        <w:t xml:space="preserve">Ladrillo is closer to the observations than BRICK 2.0 on every ice component, particularly in early eras. Cumulative total sea level rise, comparing the 1900–1904 mean with the 2020–2024 mean: observed +21.00 cm, Ladrillo +19.84, BRICK 2.0 +21.34 — Ladrillo undershoots by 1.2 cm, BRICK overshoots by 0.3. Over the shorter, more recent window — the level at 2024 relative to the 1995–2005 baseline — both models still run high, but only slightly: observed +7.81 cm, Ladrillo +8.16 (+0.36) and BRICK 2.0 +8.34 (+0.54), with IGCC's independent GMSL estimate between them at +8.21. Each of those means is taken over the three years 2022–2024, the years for which the observational total exists.</w:t>
+        <w:t xml:space="preserve">Ladrillo is closer than BRICK 2.0 on every component in the two earliest windows yet further from the total there, and the reason is compensating error. Over 1900–1919 BRICK's Antarctic undershoot (−2.90 cm) and glacier overshoot (+3.28 cm) are opposite in sign and nearly equal, so its four component biases sum to +0.62 cm out of 7.57 cm of absolute error. Ladrillo's biases are small but almost all positive, summing to +1.95 cm out of 1.97 cm. The same pattern holds over 1920–1949. The observational budget's own non-closure is common to both arms and small in these windows (−0.31 and +0.17 cm), so it cannot account for the difference. The component rows are therefore the skill statement; the total row additionally reflects whether a model's errors cancel after calibration. Ladrillo uses the observed LWS time series directly, whereas native BRICK subtracts LWS prior to calibration, so its components represent sea level excluding LWS; the observed series is added to both totals to put them on the same basis as the LWS-inclusive observational total. Separately, BRICK 2.0 runs on its own published posterior against our extended targets, so part of its bias is target vintage.</w:t>
+      </w:r>
+    </w:p>
+    <w:p>
+      <w:pPr>
+        <w:pStyle w:val="BodyText"/>
+      </w:pPr>
+      <w:r>
+        <w:t xml:space="preserve">Ladrillo is closer to the observations than BRICK 2.0 on every ice component in every window except glaciers over 1950–1992, and the gains are largest in the early eras. Cumulative total sea level rise, comparing the 1900–1904 mean with the 2020–2024 mean: observed +21.00 cm, Ladrillo +19.84, BRICK 2.0 +21.34 — Ladrillo undershoots by 1.2 cm, BRICK overshoots by 0.3. Over the shorter, more recent window — the level at 2024 relative to the 1995–2005 baseline — both models still run high, but only slightly: observed +7.81 cm, Ladrillo +8.16 (+0.36) and BRICK 2.0 +8.34 (+0.54), with IGCC's independent GMSL estimate between them at +8.21. Each of those means is taken over the three years 2022–2024, the years for which the observational total exists.</w:t>
       </w:r>
     </w:p>
     <w:p>
@@ -2114,33 +1920,17 @@
           <w:b/>
           <w:bCs/>
         </w:rPr>
-        <w:t xml:space="preserve">For thermal expansion Ladrillo overshoots, and the cause is FaIR.</w:t>
-      </w:r>
-      <w:r>
-        <w:t xml:space="preserve"> </w:t>
-      </w:r>
-      <w:r>
-        <w:t xml:space="preserve">In both Ladrillo and BRICK thermal expansion is</w:t>
-      </w:r>
-      <w:r>
-        <w:t xml:space="preserve"> </w:t>
-      </w:r>
-      <w:r>
-        <w:rPr>
-          <w:i/>
-          <w:iCs/>
-        </w:rPr>
-        <w:t xml:space="preserve">exactly</w:t>
-      </w:r>
-      <w:r>
-        <w:t xml:space="preserve"> </w:t>
-      </w:r>
-      <w:r>
-        <w:t xml:space="preserve">proportional to the ocean heat they are given. When given the FaIR driver, both models overestimate recent thermal expansion (BRICK 2.0 misses the 1993-2026 thermal expansion rate by 1.17× compared to Ladrillo's 1.27×). However, when using observed OHC Ladrillo reproduces steric changes within 4% at every era. Roughly half the apparent miss is depth scope: FaIR's ocean heat is full-depth while the steric target is 0–2000 m, and correcting on IGCC's own &gt;2000 m layer narrows the 1993–2026 rate ratio from 1.27× to as little as 1.15× — an upper bound on the correction, not a point estimate, since deep water expands less per joule than the heat ratio implies. A depth-resolved coefficient was tested and failed, though that may reflect observational uncertainty — the two spliced observed-OHC series we use, Zanna+Cheng and Zanna+IGCC, differ by 51% on 1950–1993 ocean heat gain (35% on five-year mean endpoints).</w:t>
+        <w:t xml:space="preserve">For thermal expansion Ladrillo overshoots, and the cause is the ocean heat it is given.</w:t>
+      </w:r>
+      <w:r>
+        <w:t xml:space="preserve"> </w:t>
+      </w:r>
+      <w:r>
+        <w:t xml:space="preserve">In both Ladrillo and BRICK thermal expansion is exactly proportional to ocean heat, and the expansion coefficient is not the problem: Ladrillo's is within 3% of the value the observations themselves imply. On the FaIR driver both models overestimate the 1993–2026 thermal-expansion rate (Ladrillo 1.27×, BRICK 2.0 1.17×), because FaIR's ocean heat uptake over that period is 1.22–1.29× the observed 0–2000 m products the target is built from. That excess has two parts of similar size. FaIR's ocean heat is full-depth while the steric target is 0–2000 m, and IGCC's own accounting puts the ocean below 2000 m at 10% of the heat uptake, so a full-depth model is expected to run about 1.10× a 0–2000 m target; the hatched band on FIG 1 shows the most this could add to the observation (0.3 cm by 2024, against Ladrillo's 0.8 cm excess). The remaining 1.10× is FaIR's full-depth heat uptake exceeding IGCC's full-depth estimate — a climate-model question, not a sea-level one, which is why BRICK 2.0 misses by nearly the same amount. Driving Ladrillo with observed 0–2000 m ocean heat — the target's own scope — removes both parts and reproduces the steric record within 4% in every era.</w:t>
       </w:r>
     </w:p>
     <w:bookmarkEnd w:id="17"/>
-    <w:bookmarkStart w:id="45" w:name="ladrillo-projection-comparison"/>
+    <w:bookmarkStart w:id="48" w:name="ladrillo-projection-comparison"/>
     <w:p>
       <w:pPr>
         <w:pStyle w:val="Heading2"/>
@@ -2154,47 +1944,15 @@
         <w:pStyle w:val="FirstParagraph"/>
       </w:pPr>
       <w:r>
-        <w:t xml:space="preserve">The van Vuuren markers are the</w:t>
-      </w:r>
-      <w:r>
-        <w:t xml:space="preserve"> </w:t>
-      </w:r>
-      <w:r>
-        <w:rPr>
-          <w:b/>
-          <w:bCs/>
-        </w:rPr>
-        <w:t xml:space="preserve">primary</w:t>
-      </w:r>
-      <w:r>
-        <w:t xml:space="preserve"> </w:t>
-      </w:r>
-      <w:r>
-        <w:t xml:space="preserve">comparison; the SSPs are a secondary set and the control, being the only scenarios with a prior result to check the pipeline against. All Ladrillo bands are the</w:t>
-      </w:r>
-      <w:r>
-        <w:t xml:space="preserve"> </w:t>
-      </w:r>
-      <w:r>
-        <w:rPr>
-          <w:b/>
-          <w:bCs/>
-        </w:rPr>
-        <w:t xml:space="preserve">joint</w:t>
-      </w:r>
-      <w:r>
-        <w:t xml:space="preserve"> </w:t>
-      </w:r>
-      <w:r>
-        <w:t xml:space="preserve">(posterior × FaIR-forcing) arm, width-comparable to MAGICC and FACTS; BRICK 2.0's joint band uses the same cubes, splice pivot and pair seed. Bars are 17–83% (thick) and 5–95% (thin). All four sources carry climate uncertainty — Ladrillo from 841 FaIR configs, MAGICC-SLR from its 600-member AR6 drawnset, FACTS from its own internal ensembles — so the widths are the same kind of object and are comparable; they are not the same ensemble, and both joint arms are prior propagations rather than refits, since each posterior was calibrated under fixed forcing. FACTS is reported relative to baseyear 2005, treated as comparable to the 1995–2014 mean, which is the standing convention for this comparison. In the trajectory figure the two arms share cubes, splice pivot, re-reference and pairing seed, so their widths are directly comparable, but Ladrillo is thinned to 8000 draws against BRICK 2.0's 1000.</w:t>
-      </w:r>
-    </w:p>
-    <w:p>
-      <w:pPr>
-        <w:pStyle w:val="BodyText"/>
-      </w:pPr>
-      <w:r>
-        <w:t xml:space="preserve">On glaciers, Ladrillo and MAGICC-SLR share the Nauels 2017 transient, so that panel compares reservoir count, driver and posterior within one formulation family rather than two independent methods; BRICK 2.0 and FACTS are independent there. At Greenland all four formulations differ. At Antarctica and thermal expansion the lineage runs the other way: Ladrillo and BRICK 2.0 share a formulation — DAIS for the ice sheet, and expansion proportional to ocean heat — and differ in calibration, so agreement between those two is corroboration rather than independent evidence, while FACTS (LARMIP, DeConto, Bamber, AR5 and emulated ice-sheet modules; a two-layer expansion model) and MAGICC-SLR are separate on both.</w:t>
+        <w:t xml:space="preserve">The van Vuuren markers are the primary comparison; the SSPs are a secondary set and the control, being the only scenarios with a prior result to check the pipeline against. All Ladrillo bands are the joint (posterior × FaIR-forcing) arm, width-comparable to MAGICC and FACTS; BRICK 2.0's joint band uses the same cubes, splice pivot and pair seed. Bars are 17–83% (thick) and 5–95% (thin). All four sources carry climate uncertainty — Ladrillo from 841 FaIR configs, MAGICC-SLR from its 600-member AR6 drawnset, FACTS from its own internal ensembles — so the widths are the same kind of object and are comparable; they are not the same ensemble, and both joint arms are prior propagations rather than refits, since each posterior was calibrated under fixed forcing. FACTS is reported relative to baseyear 2005, treated as comparable to the 1995–2014 mean, which is the standing convention for this comparison. In the trajectory figure the two arms share cubes, splice pivot, re-reference and pairing seed, so their widths are directly comparable, but Ladrillo is thinned to 8000 draws against BRICK 2.0's 1000.</w:t>
+      </w:r>
+    </w:p>
+    <w:p>
+      <w:pPr>
+        <w:pStyle w:val="BodyText"/>
+      </w:pPr>
+      <w:r>
+        <w:t xml:space="preserve">On glaciers, Ladrillo and MAGICC-SLR share the Nauels 2017 transient, so differences between Ladrillo and MAGICC reflect differences in reservoir count, driver and posterior; BRICK 2.0 and FACTS are independent there. At Greenland all four formulations differ. For Antarctica and thermal expansion Ladrillo and BRICK 2.0 share a formulation — DAIS for the ice sheet, and expansion proportional to ocean heat — and differ in calibration, while FACTS (LARMIP, DeConto, Bamber, AR5 and emulated ice-sheet modules; a two-layer expansion model) and MAGICC-SLR are separate on both.</w:t>
       </w:r>
     </w:p>
     <w:p>
@@ -2259,20 +2017,7 @@
         <w:t xml:space="preserve"> </w:t>
       </w:r>
       <w:r>
-        <w:t xml:space="preserve">Ladrillo L24 compared against BRICK 2.0, FACTS and MAGICC-SLR across the seven van Vuuren markers at</w:t>
-      </w:r>
-      <w:r>
-        <w:t xml:space="preserve"> </w:t>
-      </w:r>
-      <w:r>
-        <w:rPr>
-          <w:b/>
-          <w:bCs/>
-        </w:rPr>
-        <w:t xml:space="preserve">2100</w:t>
-      </w:r>
-      <w:r>
-        <w:t xml:space="preserve">, by component. FACTS is drawn per module; its four workflows differ only in the Antarctic module, so the Total panel shows them as one bracket spanning the workflow medians (thin line: the union of their 5–95%).</w:t>
+        <w:t xml:space="preserve">Ladrillo L24 compared against BRICK 2.0, FACTS and MAGICC-SLR across the seven van Vuuren markers at 2100, by component. FACTS is drawn per module; its four workflows differ only in the Antarctic module, so the Total panel shows them as one bracket spanning the workflow medians (thin line: the union of their 5–95%).</w:t>
       </w:r>
     </w:p>
     <w:p>
@@ -2337,20 +2082,7 @@
         <w:t xml:space="preserve"> </w:t>
       </w:r>
       <w:r>
-        <w:t xml:space="preserve">The same comparison at</w:t>
-      </w:r>
-      <w:r>
-        <w:t xml:space="preserve"> </w:t>
-      </w:r>
-      <w:r>
-        <w:rPr>
-          <w:b/>
-          <w:bCs/>
-        </w:rPr>
-        <w:t xml:space="preserve">2150</w:t>
-      </w:r>
-      <w:r>
-        <w:t xml:space="preserve">.</w:t>
+        <w:t xml:space="preserve">The same comparison at 2150.</w:t>
       </w:r>
     </w:p>
     <w:p>
@@ -2415,20 +2147,7 @@
         <w:t xml:space="preserve"> </w:t>
       </w:r>
       <w:r>
-        <w:t xml:space="preserve">The same comparison at</w:t>
-      </w:r>
-      <w:r>
-        <w:t xml:space="preserve"> </w:t>
-      </w:r>
-      <w:r>
-        <w:rPr>
-          <w:b/>
-          <w:bCs/>
-        </w:rPr>
-        <w:t xml:space="preserve">2300</w:t>
-      </w:r>
-      <w:r>
-        <w:t xml:space="preserve">.</w:t>
+        <w:t xml:space="preserve">The same comparison at 2300.</w:t>
       </w:r>
     </w:p>
     <w:p>
@@ -2558,7 +2277,7 @@
         <w:t xml:space="preserve"> </w:t>
       </w:r>
       <w:r>
-        <w:t xml:space="preserve">Ladrillo glacier contribution to 2300 across the seven van Vuuren markers: GMST forcing (a), cumulative glacier melt (b), and the melt rate on the peak-and-decline pathways (c). Regrowth appears where temperature declines, because the three reservoirs equilibrate to the prevailing temperature rather than melting toward a fixed ceiling.</w:t>
+        <w:t xml:space="preserve">Ladrillo glacier contribution to 2300 across the seven van Vuuren markers: GMST forcing (a), cumulative glacier melt (b), and the melt rate on the peak-and-decline pathways (c). Regrowth appears when temperature declines below the reservoir equilibrium.</w:t>
       </w:r>
     </w:p>
     <w:bookmarkStart w:id="42" w:name="secondary-the-ssps"/>
@@ -2632,20 +2351,7 @@
         <w:t xml:space="preserve"> </w:t>
       </w:r>
       <w:r>
-        <w:t xml:space="preserve">The SSP comparison at</w:t>
-      </w:r>
-      <w:r>
-        <w:t xml:space="preserve"> </w:t>
-      </w:r>
-      <w:r>
-        <w:rPr>
-          <w:b/>
-          <w:bCs/>
-        </w:rPr>
-        <w:t xml:space="preserve">2100</w:t>
-      </w:r>
-      <w:r>
-        <w:t xml:space="preserve">.</w:t>
+        <w:t xml:space="preserve">The SSP comparison at 2100.</w:t>
       </w:r>
     </w:p>
     <w:p>
@@ -2710,20 +2416,7 @@
         <w:t xml:space="preserve"> </w:t>
       </w:r>
       <w:r>
-        <w:t xml:space="preserve">The SSP comparison at</w:t>
-      </w:r>
-      <w:r>
-        <w:t xml:space="preserve"> </w:t>
-      </w:r>
-      <w:r>
-        <w:rPr>
-          <w:b/>
-          <w:bCs/>
-        </w:rPr>
-        <w:t xml:space="preserve">2300</w:t>
-      </w:r>
-      <w:r>
-        <w:t xml:space="preserve">, with FACTS run to 2300 on the same shared driver as at 2100 and 2150. The FACTS AR5 glacier module sits at its ceiling (31.6 cm) under SSP2-4.5 and SSP5-8.5.</w:t>
+        <w:t xml:space="preserve">The SSP comparison at 2300. The FACTS AR5 glacier module is completely melted (31.6 cm SLE) under SSP5-8.5.</w:t>
       </w:r>
     </w:p>
     <w:p>
@@ -2733,7 +2426,7 @@
       <w:r>
         <w:drawing>
           <wp:inline>
-            <wp:extent cx="5334000" cy="2133600"/>
+            <wp:extent cx="5334000" cy="3349255"/>
             <wp:effectExtent b="0" l="0" r="0" t="0"/>
             <wp:docPr descr="Total sea level by SSP" title="" id="40" name="Picture"/>
             <a:graphic>
@@ -2754,7 +2447,7 @@
                   <pic:spPr bwMode="auto">
                     <a:xfrm>
                       <a:off x="0" y="0"/>
-                      <a:ext cx="5334000" cy="2133600"/>
+                      <a:ext cx="5334000" cy="3349255"/>
                     </a:xfrm>
                     <a:prstGeom prst="rect">
                       <a:avLst/>
@@ -2788,113 +2481,166 @@
         <w:t xml:space="preserve"> </w:t>
       </w:r>
       <w:r>
-        <w:t xml:space="preserve">Total sea level by SSP, Ladrillo L24 joint band. Totals at 2300:</w:t>
-      </w:r>
-      <w:r>
-        <w:t xml:space="preserve"> </w:t>
-      </w:r>
+        <w:t xml:space="preserve">Total sea level by SSP, Ladrillo L24 joint band. Totals at 2300: 72.6 cm (SSP1-2.6), 249.2 cm (SSP2-4.5), 516.7 cm (SSP5-8.5).</w:t>
+      </w:r>
+    </w:p>
+    <w:bookmarkEnd w:id="42"/>
+    <w:bookmarkStart w:id="46" w:name="Xce0668475c0b0274c977dd37ba90259edcfba33"/>
+    <w:p>
+      <w:pPr>
+        <w:pStyle w:val="Heading3"/>
+      </w:pPr>
+      <w:r>
+        <w:t xml:space="preserve">Ladrillo compared to MAGICC on MAGICC's own climate</w:t>
+      </w:r>
+    </w:p>
+    <w:p>
+      <w:pPr>
+        <w:pStyle w:val="FirstParagraph"/>
+      </w:pPr>
+      <w:r>
+        <w:t xml:space="preserve">Comparing two sea-level models on different climate drivers confounds the module with the forcing. Ladrillo and BRICK 2.0 were therefore re-run on MAGICC's climate to test which differences were due to sea level module versus climate module.</w:t>
+      </w:r>
+    </w:p>
+    <w:p>
+      <w:pPr>
+        <w:pStyle w:val="BodyText"/>
+      </w:pPr>
+      <w:r>
+        <w:drawing>
+          <wp:inline>
+            <wp:extent cx="5334000" cy="3234812"/>
+            <wp:effectExtent b="0" l="0" r="0" t="0"/>
+            <wp:docPr descr="Ladrillo and BRICK 2.0 on the FaIR driver and on MAGICC's climate, vs MAGICC-SLR" title="" id="44" name="Picture"/>
+            <a:graphic>
+              <a:graphicData uri="http://schemas.openxmlformats.org/drawingml/2006/picture">
+                <pic:pic>
+                  <pic:nvPicPr>
+                    <pic:cNvPr descr="figures/vv_climate_swap_L24_2300.png" id="45" name="Picture"/>
+                    <pic:cNvPicPr>
+                      <a:picLocks noChangeArrowheads="1" noChangeAspect="1"/>
+                    </pic:cNvPicPr>
+                  </pic:nvPicPr>
+                  <pic:blipFill>
+                    <a:blip r:embed="rId43"/>
+                    <a:stretch>
+                      <a:fillRect/>
+                    </a:stretch>
+                  </pic:blipFill>
+                  <pic:spPr bwMode="auto">
+                    <a:xfrm>
+                      <a:off x="0" y="0"/>
+                      <a:ext cx="5334000" cy="3234812"/>
+                    </a:xfrm>
+                    <a:prstGeom prst="rect">
+                      <a:avLst/>
+                    </a:prstGeom>
+                    <a:noFill/>
+                    <a:ln w="9525">
+                      <a:noFill/>
+                      <a:headEnd/>
+                      <a:tailEnd/>
+                    </a:ln>
+                  </pic:spPr>
+                </pic:pic>
+              </a:graphicData>
+            </a:graphic>
+          </wp:inline>
+        </w:drawing>
+      </w:r>
+    </w:p>
+    <w:p>
+      <w:pPr>
+        <w:pStyle w:val="BodyText"/>
+      </w:pPr>
       <w:r>
         <w:rPr>
           <w:b/>
           <w:bCs/>
         </w:rPr>
-        <w:t xml:space="preserve">72.6 cm</w:t>
-      </w:r>
-      <w:r>
-        <w:t xml:space="preserve"> </w:t>
-      </w:r>
-      <w:r>
-        <w:t xml:space="preserve">(SSP1-2.6),</w:t>
-      </w:r>
-      <w:r>
-        <w:t xml:space="preserve"> </w:t>
-      </w:r>
+        <w:t xml:space="preserve">FIG 10.</w:t>
+      </w:r>
+      <w:r>
+        <w:t xml:space="preserve"> </w:t>
+      </w:r>
+      <w:r>
+        <w:t xml:space="preserve">Ladrillo L24 and BRICK 2.0 at 2300 on the seven van Vuuren markers, each drawn twice — on the shared FaIR driver (filled) and on MAGICC's own 600-member climate (open), with the connector showing the swap — against MAGICC-SLR. Same posterior, tap and draws on both climates; FACTS has no MAGICC-climate arm and is not drawn.</w:t>
+      </w:r>
+    </w:p>
+    <w:bookmarkEnd w:id="46"/>
+    <w:bookmarkStart w:id="47" w:name="Xb1f1a1c0c28d67f2c08db4461f961e4b25b61a7"/>
+    <w:p>
+      <w:pPr>
+        <w:pStyle w:val="Heading3"/>
+      </w:pPr>
+      <w:r>
+        <w:t xml:space="preserve">Physical intuition — how Ladrillo behaves by scenario class</w:t>
+      </w:r>
+    </w:p>
+    <w:p>
+      <w:pPr>
+        <w:pStyle w:val="FirstParagraph"/>
+      </w:pPr>
       <w:r>
         <w:rPr>
           <w:b/>
           <w:bCs/>
         </w:rPr>
-        <w:t xml:space="preserve">249.2 cm</w:t>
-      </w:r>
-      <w:r>
-        <w:t xml:space="preserve"> </w:t>
-      </w:r>
-      <w:r>
-        <w:t xml:space="preserve">(SSP2-4.5),</w:t>
-      </w:r>
-      <w:r>
-        <w:t xml:space="preserve"> </w:t>
-      </w:r>
+        <w:t xml:space="preserve">High scenarios.</w:t>
+      </w:r>
+      <w:r>
+        <w:t xml:space="preserve"> </w:t>
+      </w:r>
+      <w:r>
+        <w:t xml:space="preserve">At the High marker the three models agree at 2100 (Ladrillo 72 cm, BRICK 2.0 82, MAGICC-SLR 62). By 2300 Ladrillo and BRICK 2.0 sit together (439 and 414 cm, median) well below MAGICC-SLR (570 cm), and the gap is Antarctica: 255 and 248 cm against MAGICC's 382. Driving both on MAGICC's own climate moves their totals by only 15–20 cm (to 425 and 393; FIG 10), so the difference is the ice-sheet modules, not the climate. Ladrillo's 2300 spread is dominated by the prior for</w:t>
+      </w:r>
+      <w:r>
+        <w:t xml:space="preserve"> </w:t>
+      </w:r>
+      <w:r>
+        <w:rPr>
+          <w:rStyle w:val="VerbatimChar"/>
+        </w:rPr>
+        <w:t xml:space="preserve">antarctic_lambda</w:t>
+      </w:r>
+      <w:r>
+        <w:t xml:space="preserve">.</w:t>
+      </w:r>
+    </w:p>
+    <w:p>
+      <w:pPr>
+        <w:pStyle w:val="BodyText"/>
+      </w:pPr>
       <w:r>
         <w:rPr>
           <w:b/>
           <w:bCs/>
         </w:rPr>
-        <w:t xml:space="preserve">516.7 cm</w:t>
-      </w:r>
-      <w:r>
-        <w:t xml:space="preserve"> </w:t>
-      </w:r>
-      <w:r>
-        <w:t xml:space="preserve">(SSP5-8.5).</w:t>
-      </w:r>
-    </w:p>
-    <w:bookmarkEnd w:id="42"/>
-    <w:bookmarkStart w:id="43" w:name="Xce0668475c0b0274c977dd37ba90259edcfba33"/>
-    <w:p>
-      <w:pPr>
-        <w:pStyle w:val="Heading3"/>
-      </w:pPr>
-      <w:r>
-        <w:t xml:space="preserve">Ladrillo compared to MAGICC on MAGICC's own climate</w:t>
-      </w:r>
-    </w:p>
-    <w:p>
-      <w:pPr>
-        <w:pStyle w:val="FirstParagraph"/>
-      </w:pPr>
-      <w:r>
-        <w:t xml:space="preserve">Comparing two sea-level models on different climate drivers confounds the module with the forcing. Ladrillo was therefore re-run on MAGICC's climate to test which differences were due to sea level module versus climate module.</w:t>
-      </w:r>
-    </w:p>
-    <w:bookmarkEnd w:id="43"/>
-    <w:bookmarkStart w:id="44" w:name="Xb1f1a1c0c28d67f2c08db4461f961e4b25b61a7"/>
-    <w:p>
-      <w:pPr>
-        <w:pStyle w:val="Heading3"/>
-      </w:pPr>
-      <w:r>
-        <w:t xml:space="preserve">Physical intuition — how Ladrillo behaves by scenario class</w:t>
-      </w:r>
-    </w:p>
-    <w:p>
-      <w:pPr>
-        <w:pStyle w:val="FirstParagraph"/>
+        <w:t xml:space="preserve">Low scenarios.</w:t>
+      </w:r>
+      <w:r>
+        <w:t xml:space="preserve"> </w:t>
+      </w:r>
+      <w:r>
+        <w:t xml:space="preserve">Ladrillo sits at the low end of the comparison set on level — at vvVL its 2300 total median is 58 cm, above only MAGICC-SLR's 46 cm and below BRICK 2.0's 81 and the FACTS workflows' 107–190. On spread it is narrower than BRICK 2.0 on every component, and narrower than every FACTS module on glaciers, Greenland and thermal expansion; at Antarctica the LARMIP and DeConto modules are narrower (5–95% widths of 103 and 113 cm against Ladrillo's 134). MAGICC-SLR is the narrow outlier throughout (2300 total 5–95% width 67 cm against Ladrillo's 163, BRICK 2.0's 182 and 144–561 across the FACTS workflows).</w:t>
+      </w:r>
+    </w:p>
+    <w:p>
+      <w:pPr>
+        <w:pStyle w:val="BodyText"/>
       </w:pPr>
       <w:r>
         <w:rPr>
           <w:b/>
           <w:bCs/>
         </w:rPr>
-        <w:t xml:space="preserve">High scenarios.</w:t>
-      </w:r>
-      <w:r>
-        <w:t xml:space="preserve"> </w:t>
-      </w:r>
-      <w:r>
-        <w:t xml:space="preserve">Ladrillo is comparable to the other models at 2100. By 2300 it separates upward from BRICK 2.0 (due largely to Antarctic threshold behavior) but stays below MAGICC-SLR's steeper rise (439 cm vs. 570 cm, median). Its 2300 spread is dominated by the prior for</w:t>
-      </w:r>
-      <w:r>
-        <w:t xml:space="preserve"> </w:t>
-      </w:r>
-      <w:r>
-        <w:rPr>
-          <w:rStyle w:val="VerbatimChar"/>
-        </w:rPr>
-        <w:t xml:space="preserve">antarctic_lambda</w:t>
-      </w:r>
-      <w:r>
-        <w:t xml:space="preserve">.</w:t>
+        <w:t xml:space="preserve">Peak-and-decline scenarios.</w:t>
+      </w:r>
+      <w:r>
+        <w:t xml:space="preserve"> </w:t>
+      </w:r>
+      <w:r>
+        <w:t xml:space="preserve">The glacier change is evident here because it allows regrowth, though on Ladrillo's own FaIR climate that regrowth is very small: measured from each marker's peak to 2300, it reaches only 0.18 cm at vvLN and 0.13 cm at vvML, and is essentially nil on the other markers. The capacity is larger than the realised amount — driven instead by MAGICC's colder climate, the same module regrows 2.2 cm at vvLN — so what limits regrowth here is how far the scenario cools, not the module's willingness to regrow.</w:t>
       </w:r>
     </w:p>
     <w:p>
@@ -2906,54 +2652,18 @@
           <w:b/>
           <w:bCs/>
         </w:rPr>
-        <w:t xml:space="preserve">Low scenarios.</w:t>
-      </w:r>
-      <w:r>
-        <w:t xml:space="preserve"> </w:t>
-      </w:r>
-      <w:r>
-        <w:t xml:space="preserve">Ladrillo sits at the low end of the comparison set on level — at vvVL its 2300 total median is 58 cm, above only MAGICC-SLR's 46 cm and below BRICK 2.0's 81 and FACTS's 148. On spread it is narrower than both BRICK 2.0 and FACTS on every component; MAGICC-SLR is the narrow outlier throughout (2300 total 5–95% width 67 cm against Ladrillo's 163, BRICK 2.0's 182 and FACTS's 259), and it is only against MAGICC-SLR that Ladrillo's Antarctic and thermal-expansion bands are the wider ones.</w:t>
-      </w:r>
-    </w:p>
-    <w:p>
-      <w:pPr>
-        <w:pStyle w:val="BodyText"/>
-      </w:pPr>
-      <w:r>
-        <w:rPr>
-          <w:b/>
-          <w:bCs/>
-        </w:rPr>
-        <w:t xml:space="preserve">Peak-and-decline scenarios.</w:t>
-      </w:r>
-      <w:r>
-        <w:t xml:space="preserve"> </w:t>
-      </w:r>
-      <w:r>
-        <w:t xml:space="preserve">The glacier change is evident here because it allows regrowth, though on Ladrillo's own FaIR climate that regrowth is very small: measured from each marker's peak to 2300, it reaches only 0.18 cm at vvLN and 0.13 cm at vvML, and is essentially nil on the other markers. The capacity is larger than the realised amount — driven instead by MAGICC's colder climate, the same module regrows 2.2 cm at vvLN — so what limits regrowth here is how far the scenario cools, not the module's willingness to regrow.</w:t>
-      </w:r>
-    </w:p>
-    <w:p>
-      <w:pPr>
-        <w:pStyle w:val="BodyText"/>
-      </w:pPr>
-      <w:r>
-        <w:rPr>
-          <w:b/>
-          <w:bCs/>
-        </w:rPr>
         <w:t xml:space="preserve">MAGICC regrows substantially more than Ladrillo.</w:t>
       </w:r>
       <w:r>
         <w:t xml:space="preserve"> </w:t>
       </w:r>
       <w:r>
-        <w:t xml:space="preserve">About ¾ of the regrowth difference is model structure and ¼ the climate module**.** Measured on realised regrowth (peak-to-2300) at vvLN, the scenario where regrowth is largest: MAGICC regrows 8.59 cm against Ladrillo's 0.18 cm, and driving Ladrillo's module with MAGICC's own climate decreases the gap by 2.02 cm. When driving the two models with MAGICC’s own temperature, Ladrillo’s committed equilibrium regrowth is also somewhat less than MAGICC’s, but MAGICC reaches its regrowth limits in the two coldest van Vuuren scenarios. So while the gap with MAGICC is mainly a rate effect (at 1.5 K the SLOWP and R19 regions have median response times of ~270 yr and ~470 yr, the latter very poorly constrained at 80–3200 yr across the posterior; all three blocks respond about three times faster at 3 K) this rate effect is compounded by an equilibrium effect.</w:t>
-      </w:r>
-    </w:p>
-    <w:bookmarkEnd w:id="44"/>
-    <w:bookmarkEnd w:id="45"/>
-    <w:bookmarkEnd w:id="46"/>
+        <w:t xml:space="preserve">About ¾ of the regrowth difference is model structure and ¼ the climate module. Measured on realised regrowth (peak-to-2300) at vvLN, the scenario where regrowth is largest: MAGICC regrows 8.59 cm against Ladrillo's 0.18 cm, and driving Ladrillo's module with MAGICC's own climate decreases the gap by 2.02 cm. When driving the two models with MAGICC’s own temperature, Ladrillo’s committed equilibrium regrowth is also somewhat less than MAGICC’s, but MAGICC reaches its regrowth limits in the two coldest van Vuuren scenarios. So while the gap with MAGICC is mainly a rate effect (at 1.5 K the SLOWP and R19 regions have median response times of ~270 yr and ~470 yr, the latter very poorly constrained at 80–3200 yr across the posterior; all three blocks respond about three times faster at 3 K) this rate effect is compounded by an equilibrium effect.</w:t>
+      </w:r>
+    </w:p>
+    <w:bookmarkEnd w:id="47"/>
+    <w:bookmarkEnd w:id="48"/>
+    <w:bookmarkEnd w:id="49"/>
     <w:sectPr>
       <w:footnotePr>
         <w:numRestart w:val="eachSect"/>

</xml_diff>

<commit_message>
Apply Marcus's 9/12 comments: MAGICC's vvLN Greenland tail is a sub-preindustrial SMB artefact; BRICK samples the same lambda; glacier inventory scopes; SLEIP-metric rate; responsiveness figure in as FIG 7
Co-Authored-By: Claude Opus 5 <noreply@anthropic.com>
</commit_message>
<xml_diff>
--- a/deliverables/LadrilloUpdateDescription_L24.docx
+++ b/deliverables/LadrilloUpdateDescription_L24.docx
@@ -2,7 +2,7 @@
 <file path=word/document.xml><?xml version="1.0" encoding="utf-8"?>
 <w:document xmlns:w="http://schemas.openxmlformats.org/wordprocessingml/2006/main" xmlns:m="http://schemas.openxmlformats.org/officeDocument/2006/math" xmlns:r="http://schemas.openxmlformats.org/officeDocument/2006/relationships" xmlns:o="urn:schemas-microsoft-com:office:office" xmlns:v="urn:schemas-microsoft-com:vml" xmlns:w10="urn:schemas-microsoft-com:office:word" xmlns:a="http://schemas.openxmlformats.org/drawingml/2006/main" xmlns:pic="http://schemas.openxmlformats.org/drawingml/2006/picture" xmlns:wp="http://schemas.openxmlformats.org/drawingml/2006/wordprocessingDrawing">
   <w:body>
-    <w:bookmarkStart w:id="49" w:name="ladrillo-sea-level-rise-emulator"/>
+    <w:bookmarkStart w:id="52" w:name="ladrillo-sea-level-rise-emulator"/>
     <w:p>
       <w:pPr>
         <w:pStyle w:val="Heading1"/>
@@ -24,15 +24,7 @@
         <w:pStyle w:val="BodyText"/>
       </w:pPr>
       <w:r>
-        <w:t xml:space="preserve">Ladrillo is comparable in quality to other sea level emulators, and occupies its own niche. Unlike MAGICC, Ladrillo is designed to work with the FaIR model. Unlike FACTS, Ladrillo has a simplified structure. Ladrillo does a good job matching historical observations, with the primary weakness being thermal expansion, though that is inherited from FaIR and does not appear when running with OHC from observation. For future projections, Ladrillo matches physical expectations and is comparable to the other models despite different structural approaches. BRICK's design philosophy is to calibrate on historical data products rather than to emulate projections from process-based models, which is what makes it a line of evidence relatively independent of the large Earth system and ice sheet models. Ladrillo extends that philosophy where the data reach — the Antarctic likelihood now runs from 1900 rather than IMBIE's 1992–2017 window, and Dangendorf, GlaMBIE, GRACE and Mouginot are added — but departs from it for the two parameters described below, both in regimes with no observational constraints.</w:t>
-      </w:r>
-    </w:p>
-    <w:p>
-      <w:pPr>
-        <w:pStyle w:val="BodyText"/>
-      </w:pPr>
-      <w:r>
-        <w:t xml:space="preserve">There are two key parameters not constrained by observations that are included in Ladrillo. The first is a Greenland tap that triggers above a threshold temperature and is informed by SICOPOLIS. The second is the use of local temperature amplification relative to global that is informed by CMIP6 in addition to historic observations, and is relevant for Antarctic melt.</w:t>
+        <w:t xml:space="preserve">Ladrillo is comparable in quality to other sea level emulators, and occupies its own niche. Unlike MAGICC, Ladrillo is designed to work with the FaIR model. Unlike FACTS, Ladrillo has a simplified structure. Ladrillo does a good job matching historical observations, with the primary weakness being thermal expansion, though that is inherited from FaIR and does not appear when running with OHC from observation. For future projections, Ladrillo matches physical expectations and is comparable to the other models despite different structural approaches. BRICK's design philosophy is to calibrate on historical data products rather than to emulate projections from process-based models, which is what makes it a line of evidence relatively independent of the large Earth system and ice sheet models. Ladrillo extends that philosophy where the data reach — the Antarctic likelihood now runs from 1900 rather than IMBIE's 1992–2017 window, and Dangendorf, GlaMBIE, GRACE and Mouginot are added — but departs from it for two key parameters not constrained by observations. The first is a Greenland tap that triggers above a threshold temperature and is informed by SICOPOLIS. The second is the use of local temperature amplification relative to global that is informed by CMIP6 in addition to historic observations, and is relevant for Antarctic melt.</w:t>
       </w:r>
     </w:p>
     <w:p>
@@ -185,7 +177,7 @@
         <w:pStyle w:val="BodyText"/>
       </w:pPr>
       <w:r>
-        <w:t xml:space="preserve">(The three blocks cover 18 of the 19 RGI regions; RGI 05, Greenland Periphery, is excluded — Frederikse's glacier target excludes it and it falls inside the Greenland ice-sheet mask.)</w:t>
+        <w:t xml:space="preserve">These three blocks cover 18 of the 19 RGI regions; RGI 05, Greenland Periphery, is excluded — Frederikse's glacier target excludes it and it falls inside the Greenland ice-sheet mask.</w:t>
       </w:r>
     </w:p>
     <w:p>
@@ -203,7 +195,7 @@
         <w:t xml:space="preserve"> </w:t>
       </w:r>
       <w:r>
-        <w:t xml:space="preserve">BRICK 2.0 and Ladrillo now have completely different glacier modules. MAGICC and Ladrillo both use the formulation from Nauels 2017 Eq. 3; where they differ is the three regions used in Ladrillo. MAGICC's committed 1850 melt is 28–136 mm, Ladrillo's 63–146 mm. The two models also start from different total glacier inventories. BRICK 2.0's calibrated initial volume centres on 0.42 m SLE (5–95% 0.32–0.52), inherited from the Wigley and Raper (2005) assumed maximum of 0.41 m; Ladrillo constrains the remaining stock at 2000 to 0.290 ± 0.060 m SLE on its target scope (Farinotti 2019 excluding RGI regions 5 and 19, plus 0.069 for region 19), with Millan 2022 agreeing to 1% on the matched scope. The full-RGI Farinotti value is 0.324 ± 0.084 m.</w:t>
+        <w:t xml:space="preserve">BRICK 2.0 and Ladrillo now have completely different glacier modules. MAGICC and Ladrillo both use the formulation from Nauels 2017 Eq. 3; where they differ is the three regions used in Ladrillo. MAGICC's committed 1850 melt is 28–136 mm, Ladrillo's 63–146 mm. The two models also start from different total glacier inventories. BRICK 2.0's calibrated initial volume centres on 0.42 m SLE (5–95% 0.32–0.52), inherited from the Wigley and Raper (2005) assumed maximum of 0.41 m; Ladrillo constrains the remaining stock at 2000 to 0.290 ± 0.060 m SLE on its target scope (Farinotti 2019 excluding RGI regions 5 and 19, plus 0.069 for region 19), with Millan 2022 agreeing to 1% on the matched scope. The full-RGI Farinotti value is 0.324 ± 0.084 m. The comparators' inventories are larger and differ in scope: FACTS's AR5 glacier module caps cumulative melt at 315.7 mm SLE (AR5 Table 4.2's 412 mm less 96.3 mm; its regional fingerprints include the Greenland periphery and no Antarctic periphery), which every SSP5-8.5 sample reaches by 2300; MAGICC's tabulated equilibrium curves reach 356–451 mm SLE across their 15 tunes. Ladrillo's glaciers exclude RGI 05 (about 0.034 m SLE, carried inside its Greenland ice-sheet mask), so its glacier contribution is structurally smaller than the comparators' by that region's melt.</w:t>
       </w:r>
     </w:p>
     <w:p>
@@ -1011,14 +1003,6 @@
         </w:tc>
       </w:tr>
     </w:tbl>
-    <w:p>
-      <w:pPr>
-        <w:pStyle w:val="BodyText"/>
-      </w:pPr>
-      <w:r>
-        <w:t xml:space="preserve">Two kinds of source carry no dataset version. Rignot 2019 and the Farinotti/Hock inventory are values taken from published papers rather than from versioned data products, so the citation is the version. The CMIP6 panel and the NOAA thermosteric series are live products with no release string; for those the download date is the version and is given.</w:t>
-      </w:r>
-    </w:p>
     <w:p>
       <w:pPr>
         <w:pStyle w:val="BodyText"/>
@@ -1908,7 +1892,7 @@
         <w:pStyle w:val="BodyText"/>
       </w:pPr>
       <w:r>
-        <w:t xml:space="preserve">Ladrillo is closer to the observations than BRICK 2.0 on every ice component in every window except glaciers over 1950–1992, and the gains are largest in the early eras. Cumulative total sea level rise, comparing the 1900–1904 mean with the 2020–2024 mean: observed +21.00 cm, Ladrillo +19.84, BRICK 2.0 +21.34 — Ladrillo undershoots by 1.2 cm, BRICK overshoots by 0.3. Over the shorter, more recent window — the level at 2024 relative to the 1995–2005 baseline — both models still run high, but only slightly: observed +7.81 cm, Ladrillo +8.16 (+0.36) and BRICK 2.0 +8.34 (+0.54), with IGCC's independent GMSL estimate between them at +8.21. Each of those means is taken over the three years 2022–2024, the years for which the observational total exists.</w:t>
+        <w:t xml:space="preserve">Ladrillo is closer to the observations than BRICK 2.0 on every ice component in every window except glaciers over 1950–1992, and the gains are largest in the early eras. Cumulative total sea level rise, comparing the 1900–1904 mean with the 2020–2024 mean: observed +21.00 cm, Ladrillo +19.84, BRICK 2.0 +21.34 — Ladrillo undershoots by 1.2 cm, BRICK overshoots by 0.3. Over the shorter, more recent window — the mean over 2022-2024 relative to the 1995–2005 baseline — both models still run high, but only slightly: observed +7.81 cm, Ladrillo +8.16 (+0.36) and BRICK 2.0 +8.34 (+0.54), with IGCC's independent GMSL estimate between them at +8.21. On the 2006–2025 rate of total sea level, the metric the SLEIP intercomparison reports, Ladrillo gives 3.74 mm/yr and BRICK 2.0 3.89 against 3.92 for the observational target and 3.99 for IGCC (same linear fit, same window).</w:t>
       </w:r>
     </w:p>
     <w:p>
@@ -1930,7 +1914,7 @@
       </w:r>
     </w:p>
     <w:bookmarkEnd w:id="17"/>
-    <w:bookmarkStart w:id="48" w:name="ladrillo-projection-comparison"/>
+    <w:bookmarkStart w:id="51" w:name="ladrillo-projection-comparison"/>
     <w:p>
       <w:pPr>
         <w:pStyle w:val="Heading2"/>
@@ -2212,7 +2196,7 @@
         <w:t xml:space="preserve"> </w:t>
       </w:r>
       <w:r>
-        <w:t xml:space="preserve">Component trajectories across the van Vuuren markers, joint band.</w:t>
+        <w:t xml:space="preserve">Component trajectories across the van Vuuren markers, joint band, Ladrillo relative to BRICK2.0.</w:t>
       </w:r>
     </w:p>
     <w:p>
@@ -2280,30 +2264,21 @@
         <w:t xml:space="preserve">Ladrillo glacier contribution to 2300 across the seven van Vuuren markers: GMST forcing (a), cumulative glacier melt (b), and the melt rate on the peak-and-decline pathways (c). Regrowth appears when temperature declines below the reservoir equilibrium.</w:t>
       </w:r>
     </w:p>
-    <w:bookmarkStart w:id="42" w:name="secondary-the-ssps"/>
-    <w:p>
-      <w:pPr>
-        <w:pStyle w:val="Heading3"/>
-      </w:pPr>
-      <w:r>
-        <w:t xml:space="preserve">Secondary: the SSPs</w:t>
-      </w:r>
-    </w:p>
-    <w:p>
-      <w:pPr>
-        <w:pStyle w:val="FirstParagraph"/>
+    <w:p>
+      <w:pPr>
+        <w:pStyle w:val="BodyText"/>
       </w:pPr>
       <w:r>
         <w:drawing>
           <wp:inline>
-            <wp:extent cx="5334000" cy="3090041"/>
+            <wp:extent cx="5334000" cy="3097161"/>
             <wp:effectExtent b="0" l="0" r="0" t="0"/>
-            <wp:docPr descr="Component comparison at 2100" title="" id="34" name="Picture"/>
+            <wp:docPr descr="Scenario responsiveness by component" title="" id="34" name="Picture"/>
             <a:graphic>
               <a:graphicData uri="http://schemas.openxmlformats.org/drawingml/2006/picture">
                 <pic:pic>
                   <pic:nvPicPr>
-                    <pic:cNvPr descr="figures/model_comparison_components_L24_2100.png" id="35" name="Picture"/>
+                    <pic:cNvPr descr="figures/vv_responsiveness_L24.png" id="35" name="Picture"/>
                     <pic:cNvPicPr>
                       <a:picLocks noChangeArrowheads="1" noChangeAspect="1"/>
                     </pic:cNvPicPr>
@@ -2317,7 +2292,7 @@
                   <pic:spPr bwMode="auto">
                     <a:xfrm>
                       <a:off x="0" y="0"/>
-                      <a:ext cx="5334000" cy="3090041"/>
+                      <a:ext cx="5334000" cy="3097161"/>
                     </a:xfrm>
                     <a:prstGeom prst="rect">
                       <a:avLst/>
@@ -2351,24 +2326,41 @@
         <w:t xml:space="preserve"> </w:t>
       </w:r>
       <w:r>
-        <w:t xml:space="preserve">The SSP comparison at 2100.</w:t>
-      </w:r>
-    </w:p>
-    <w:p>
-      <w:pPr>
-        <w:pStyle w:val="BodyText"/>
+        <w:t xml:space="preserve">Scenario responsiveness by component: the High-minus-Very-Low difference of medians at 2100, 2150 and 2300 for each model, FACTS per module (open triangles: structured expert judgement). Ladrillo, BRICK 2.0 and FACTS share the FaIR driver (High − Very Low GMST gap 1.7/3.1/5.5 K at the three horizons); MAGICC-SLR responds to its own climate (2.0/3.6/5.9 K).</w:t>
+      </w:r>
+    </w:p>
+    <w:p>
+      <w:pPr>
+        <w:pStyle w:val="BodyText"/>
+      </w:pPr>
+      <w:r>
+        <w:t xml:space="preserve">Two features of FIGs 2–4 and 7 are properties of the comparators rather than of the climate response. MAGICC-SLR's Greenland band at the Low-to-Negative marker reaches 144 cm at 2300 (95th percentile) against 25 cm at the Low marker, although the medians are 13 and 14 cm: on MAGICC's own climate that marker cools below preindustrial by 2300 in 597 of 600 members, and MAGICC's Greenland surface-mass-balance parameterisation, fitted for warming, turns positive there — the members with the strongest cooling (−1.5 to −2 K) give the largest Greenland rise (up to +343 cm from surface mass balance alone). And the FACTS DeConto and Bamber modules select their projections from the integrated 2000–2099 temperature, so their post-2100 values do not respond to the climate path after 2100 (High and High-to-Low give identical Antarctic values at 2300).</w:t>
+      </w:r>
+    </w:p>
+    <w:bookmarkStart w:id="45" w:name="secondary-the-ssps"/>
+    <w:p>
+      <w:pPr>
+        <w:pStyle w:val="Heading3"/>
+      </w:pPr>
+      <w:r>
+        <w:t xml:space="preserve">Secondary: the SSPs</w:t>
+      </w:r>
+    </w:p>
+    <w:p>
+      <w:pPr>
+        <w:pStyle w:val="FirstParagraph"/>
       </w:pPr>
       <w:r>
         <w:drawing>
           <wp:inline>
             <wp:extent cx="5334000" cy="3090041"/>
             <wp:effectExtent b="0" l="0" r="0" t="0"/>
-            <wp:docPr descr="Component comparison at 2300" title="" id="37" name="Picture"/>
+            <wp:docPr descr="Component comparison at 2100" title="" id="37" name="Picture"/>
             <a:graphic>
               <a:graphicData uri="http://schemas.openxmlformats.org/drawingml/2006/picture">
                 <pic:pic>
                   <pic:nvPicPr>
-                    <pic:cNvPr descr="figures/model_comparison_components_L24_2300.png" id="38" name="Picture"/>
+                    <pic:cNvPr descr="figures/model_comparison_components_L24_2100.png" id="38" name="Picture"/>
                     <pic:cNvPicPr>
                       <a:picLocks noChangeArrowheads="1" noChangeAspect="1"/>
                     </pic:cNvPicPr>
@@ -2416,7 +2408,7 @@
         <w:t xml:space="preserve"> </w:t>
       </w:r>
       <w:r>
-        <w:t xml:space="preserve">The SSP comparison at 2300. The FACTS AR5 glacier module is completely melted (31.6 cm SLE) under SSP5-8.5.</w:t>
+        <w:t xml:space="preserve">The SSP comparison at 2100.</w:t>
       </w:r>
     </w:p>
     <w:p>
@@ -2426,20 +2418,85 @@
       <w:r>
         <w:drawing>
           <wp:inline>
-            <wp:extent cx="5334000" cy="3349255"/>
+            <wp:extent cx="5334000" cy="3090041"/>
             <wp:effectExtent b="0" l="0" r="0" t="0"/>
-            <wp:docPr descr="Total sea level by SSP" title="" id="40" name="Picture"/>
+            <wp:docPr descr="Component comparison at 2300" title="" id="40" name="Picture"/>
             <a:graphic>
               <a:graphicData uri="http://schemas.openxmlformats.org/drawingml/2006/picture">
                 <pic:pic>
                   <pic:nvPicPr>
-                    <pic:cNvPr descr="figures/ladrillo_L24_fig2_ssp_total.png" id="41" name="Picture"/>
+                    <pic:cNvPr descr="figures/model_comparison_components_L24_2300.png" id="41" name="Picture"/>
                     <pic:cNvPicPr>
                       <a:picLocks noChangeArrowheads="1" noChangeAspect="1"/>
                     </pic:cNvPicPr>
                   </pic:nvPicPr>
                   <pic:blipFill>
                     <a:blip r:embed="rId39"/>
+                    <a:stretch>
+                      <a:fillRect/>
+                    </a:stretch>
+                  </pic:blipFill>
+                  <pic:spPr bwMode="auto">
+                    <a:xfrm>
+                      <a:off x="0" y="0"/>
+                      <a:ext cx="5334000" cy="3090041"/>
+                    </a:xfrm>
+                    <a:prstGeom prst="rect">
+                      <a:avLst/>
+                    </a:prstGeom>
+                    <a:noFill/>
+                    <a:ln w="9525">
+                      <a:noFill/>
+                      <a:headEnd/>
+                      <a:tailEnd/>
+                    </a:ln>
+                  </pic:spPr>
+                </pic:pic>
+              </a:graphicData>
+            </a:graphic>
+          </wp:inline>
+        </w:drawing>
+      </w:r>
+    </w:p>
+    <w:p>
+      <w:pPr>
+        <w:pStyle w:val="BodyText"/>
+      </w:pPr>
+      <w:r>
+        <w:rPr>
+          <w:b/>
+          <w:bCs/>
+        </w:rPr>
+        <w:t xml:space="preserve">FIG 9.</w:t>
+      </w:r>
+      <w:r>
+        <w:t xml:space="preserve"> </w:t>
+      </w:r>
+      <w:r>
+        <w:t xml:space="preserve">The SSP comparison at 2300. The FACTS AR5 glacier module is completely melted (31.6 cm SLE) under SSP5-8.5.</w:t>
+      </w:r>
+    </w:p>
+    <w:p>
+      <w:pPr>
+        <w:pStyle w:val="BodyText"/>
+      </w:pPr>
+      <w:r>
+        <w:drawing>
+          <wp:inline>
+            <wp:extent cx="5334000" cy="3349255"/>
+            <wp:effectExtent b="0" l="0" r="0" t="0"/>
+            <wp:docPr descr="Total sea level by SSP" title="" id="43" name="Picture"/>
+            <a:graphic>
+              <a:graphicData uri="http://schemas.openxmlformats.org/drawingml/2006/picture">
+                <pic:pic>
+                  <pic:nvPicPr>
+                    <pic:cNvPr descr="figures/ladrillo_L24_fig2_ssp_total.png" id="44" name="Picture"/>
+                    <pic:cNvPicPr>
+                      <a:picLocks noChangeArrowheads="1" noChangeAspect="1"/>
+                    </pic:cNvPicPr>
+                  </pic:nvPicPr>
+                  <pic:blipFill>
+                    <a:blip r:embed="rId42"/>
                     <a:stretch>
                       <a:fillRect/>
                     </a:stretch>
@@ -2475,7 +2532,7 @@
           <w:b/>
           <w:bCs/>
         </w:rPr>
-        <w:t xml:space="preserve">FIG 9.</w:t>
+        <w:t xml:space="preserve">FIG 10.</w:t>
       </w:r>
       <w:r>
         <w:t xml:space="preserve"> </w:t>
@@ -2484,8 +2541,8 @@
         <w:t xml:space="preserve">Total sea level by SSP, Ladrillo L24 joint band. Totals at 2300: 72.6 cm (SSP1-2.6), 249.2 cm (SSP2-4.5), 516.7 cm (SSP5-8.5).</w:t>
       </w:r>
     </w:p>
-    <w:bookmarkEnd w:id="42"/>
-    <w:bookmarkStart w:id="46" w:name="Xce0668475c0b0274c977dd37ba90259edcfba33"/>
+    <w:bookmarkEnd w:id="45"/>
+    <w:bookmarkStart w:id="49" w:name="Xce0668475c0b0274c977dd37ba90259edcfba33"/>
     <w:p>
       <w:pPr>
         <w:pStyle w:val="Heading3"/>
@@ -2511,18 +2568,18 @@
           <wp:inline>
             <wp:extent cx="5334000" cy="3234812"/>
             <wp:effectExtent b="0" l="0" r="0" t="0"/>
-            <wp:docPr descr="Ladrillo and BRICK 2.0 on the FaIR driver and on MAGICC's climate, vs MAGICC-SLR" title="" id="44" name="Picture"/>
+            <wp:docPr descr="Ladrillo and BRICK 2.0 on the FaIR driver and on MAGICC's climate, vs MAGICC-SLR" title="" id="47" name="Picture"/>
             <a:graphic>
               <a:graphicData uri="http://schemas.openxmlformats.org/drawingml/2006/picture">
                 <pic:pic>
                   <pic:nvPicPr>
-                    <pic:cNvPr descr="figures/vv_climate_swap_L24_2300.png" id="45" name="Picture"/>
+                    <pic:cNvPr descr="figures/vv_climate_swap_L24_2300.png" id="48" name="Picture"/>
                     <pic:cNvPicPr>
                       <a:picLocks noChangeArrowheads="1" noChangeAspect="1"/>
                     </pic:cNvPicPr>
                   </pic:nvPicPr>
                   <pic:blipFill>
-                    <a:blip r:embed="rId43"/>
+                    <a:blip r:embed="rId46"/>
                     <a:stretch>
                       <a:fillRect/>
                     </a:stretch>
@@ -2558,7 +2615,7 @@
           <w:b/>
           <w:bCs/>
         </w:rPr>
-        <w:t xml:space="preserve">FIG 10.</w:t>
+        <w:t xml:space="preserve">FIG 11.</w:t>
       </w:r>
       <w:r>
         <w:t xml:space="preserve"> </w:t>
@@ -2567,8 +2624,8 @@
         <w:t xml:space="preserve">Ladrillo L24 and BRICK 2.0 at 2300 on the seven van Vuuren markers, each drawn twice — on the shared FaIR driver (filled) and on MAGICC's own 600-member climate (open), with the connector showing the swap — against MAGICC-SLR. Same posterior, tap and draws on both climates; FACTS has no MAGICC-climate arm and is not drawn.</w:t>
       </w:r>
     </w:p>
-    <w:bookmarkEnd w:id="46"/>
-    <w:bookmarkStart w:id="47" w:name="Xb1f1a1c0c28d67f2c08db4461f961e4b25b61a7"/>
+    <w:bookmarkEnd w:id="49"/>
+    <w:bookmarkStart w:id="50" w:name="Xb1f1a1c0c28d67f2c08db4461f961e4b25b61a7"/>
     <w:p>
       <w:pPr>
         <w:pStyle w:val="Heading3"/>
@@ -2592,7 +2649,7 @@
         <w:t xml:space="preserve"> </w:t>
       </w:r>
       <w:r>
-        <w:t xml:space="preserve">At the High marker the three models agree at 2100 (Ladrillo 72 cm, BRICK 2.0 82, MAGICC-SLR 62). By 2300 Ladrillo and BRICK 2.0 sit together (439 and 414 cm, median) well below MAGICC-SLR (570 cm), and the gap is Antarctica: 255 and 248 cm against MAGICC's 382. Driving both on MAGICC's own climate moves their totals by only 15–20 cm (to 425 and 393; FIG 10), so the difference is the ice-sheet modules, not the climate. Ladrillo's 2300 spread is dominated by the prior for</w:t>
+        <w:t xml:space="preserve">At the High marker the three models agree at 2100 (Ladrillo 72 cm, BRICK 2.0 82, MAGICC-SLR 62). By 2300 Ladrillo and BRICK 2.0 sit together (439 and 414 cm, median) well below MAGICC-SLR (570 cm), and the gap is Antarctica: 255 and 248 cm against MAGICC's 382. Driving both on MAGICC's own climate moves their totals by only 15–20 cm (to 425 and 393; FIG 11), so the difference is the ice-sheet modules, not the climate. Ladrillo's 2300 Antarctic spread is dominated by the prior for</w:t>
       </w:r>
       <w:r>
         <w:t xml:space="preserve"> </w:t>
@@ -2604,7 +2661,7 @@
         <w:t xml:space="preserve">antarctic_lambda</w:t>
       </w:r>
       <w:r>
-        <w:t xml:space="preserve">.</w:t>
+        <w:t xml:space="preserve">, the DAIS fast-dynamics rate; BRICK 2.0 samples the same parameter from the same fast-dynamics ensemble (mean 0.0104, sd 0.0036 in both), which is why the two Antarctic spreads are alike (5–95% widths of 329 and 405 cm at SSP5-8.5 in 2300).</w:t>
       </w:r>
     </w:p>
     <w:p>
@@ -2661,9 +2718,9 @@
         <w:t xml:space="preserve">About ¾ of the regrowth difference is model structure and ¼ the climate module. Measured on realised regrowth (peak-to-2300) at vvLN, the scenario where regrowth is largest: MAGICC regrows 8.59 cm against Ladrillo's 0.18 cm, and driving Ladrillo's module with MAGICC's own climate decreases the gap by 2.02 cm. When driving the two models with MAGICC’s own temperature, Ladrillo’s committed equilibrium regrowth is also somewhat less than MAGICC’s, but MAGICC reaches its regrowth limits in the two coldest van Vuuren scenarios. So while the gap with MAGICC is mainly a rate effect (at 1.5 K the SLOWP and R19 regions have median response times of ~270 yr and ~470 yr, the latter very poorly constrained at 80–3200 yr across the posterior; all three blocks respond about three times faster at 3 K) this rate effect is compounded by an equilibrium effect.</w:t>
       </w:r>
     </w:p>
-    <w:bookmarkEnd w:id="47"/>
-    <w:bookmarkEnd w:id="48"/>
-    <w:bookmarkEnd w:id="49"/>
+    <w:bookmarkEnd w:id="50"/>
+    <w:bookmarkEnd w:id="51"/>
+    <w:bookmarkEnd w:id="52"/>
     <w:sectPr>
       <w:footnotePr>
         <w:numRestart w:val="eachSect"/>

</xml_diff>

<commit_message>
Units unified to cm; FACTS post-2100 behaviour per module read from the code and stated in the document
Co-Authored-By: Claude Opus 5 <noreply@anthropic.com>
</commit_message>
<xml_diff>
--- a/deliverables/LadrilloUpdateDescription_L24.docx
+++ b/deliverables/LadrilloUpdateDescription_L24.docx
@@ -195,7 +195,7 @@
         <w:t xml:space="preserve"> </w:t>
       </w:r>
       <w:r>
-        <w:t xml:space="preserve">BRICK 2.0 and Ladrillo now have completely different glacier modules. MAGICC and Ladrillo both use the formulation from Nauels 2017 Eq. 3; where they differ is the three regions used in Ladrillo. MAGICC's committed 1850 melt is 28–136 mm, Ladrillo's 63–146 mm. The two models also start from different total glacier inventories. BRICK 2.0's calibrated initial volume centres on 0.42 m SLE (5–95% 0.32–0.52), inherited from the Wigley and Raper (2005) assumed maximum of 0.41 m; Ladrillo constrains the remaining stock at 2000 to 0.290 ± 0.060 m SLE on its target scope (Farinotti 2019 excluding RGI regions 5 and 19, plus 0.069 for region 19), with Millan 2022 agreeing to 1% on the matched scope. The full-RGI Farinotti value is 0.324 ± 0.084 m. The comparators' inventories are larger and differ in scope: FACTS's AR5 glacier module caps cumulative melt at 315.7 mm SLE (AR5 Table 4.2's 412 mm less 96.3 mm; its regional fingerprints include the Greenland periphery and no Antarctic periphery), which every SSP5-8.5 sample reaches by 2300; MAGICC's tabulated equilibrium curves reach 356–451 mm SLE across their 15 tunes. Ladrillo's glaciers exclude RGI 05 (about 0.034 m SLE, carried inside its Greenland ice-sheet mask), so its glacier contribution is structurally smaller than the comparators' by that region's melt.</w:t>
+        <w:t xml:space="preserve">BRICK 2.0 and Ladrillo now have completely different glacier modules. MAGICC and Ladrillo both use the formulation from Nauels 2017 Eq. 3; where they differ is the three regions used in Ladrillo. MAGICC's committed 1850 melt is 2.8–13.6 cm, Ladrillo's 6.3–14.6 cm. The two models also start from different total glacier inventories. BRICK 2.0's calibrated initial volume centres on 42 cm SLE (5–95% 32–52), inherited from the Wigley and Raper (2005) assumed maximum of 41 cm; Ladrillo constrains the remaining stock at 2000 to 29.0 ± 6.0 cm SLE on its target scope (Farinotti 2019 excluding RGI regions 5 and 19, plus 6.9 cm for region 19), with Millan 2022 agreeing to 1% on the matched scope. The full-RGI Farinotti value is 32.4 ± 8.4 cm. The comparators' inventories are larger and differ in scope: FACTS's AR5 glacier module caps cumulative melt at 31.6 cm SLE (AR5 Table 4.2's 41.2 cm less 9.63 cm; its regional fingerprints include the Greenland periphery and no Antarctic periphery), which every SSP5-8.5 sample reaches by 2300; MAGICC's tabulated equilibrium curves reach 35.6–45.1 cm SLE across their 15 tunes. Ladrillo's glaciers exclude RGI 05 (about 3.4 cm SLE, carried inside its Greenland ice-sheet mask), so its glacier contribution is structurally smaller than the comparators' by that region's melt.</w:t>
       </w:r>
     </w:p>
     <w:p>
@@ -341,7 +341,7 @@
         <w:t xml:space="preserve"> </w:t>
       </w:r>
       <w:r>
-        <w:t xml:space="preserve">A post-2100 commitment above a threshold: V = 5.64 m, τ = 800 yr, onset 4.69 K, two stages, whole-sheet. The tap does not fire until temperatures exceed the onset. It cannot be calibrated on observations, so the parameters were informed by ISMIP6 at 2100 and SICOPOLIS at 2300 and 3001. It is included in every projection here, contributing 35.1 cm to the SSP5-8.5 total at 2300 on the joint arm this document reports throughout, and nothing at SSP1-2.6 (exactly zero) or SSP2-4.5 (+0.04 cm).</w:t>
+        <w:t xml:space="preserve">A post-2100 commitment above a threshold: V = 564 cm, τ = 800 yr, onset 4.69 K, two stages, whole-sheet. The tap does not fire until temperatures exceed the onset. It cannot be calibrated on observations, so the parameters were informed by ISMIP6 at 2100 and SICOPOLIS at 2300 and 3001. It is included in every projection here, contributing 35.1 cm to the SSP5-8.5 total at 2300 on the joint arm this document reports throughout, and nothing at SSP1-2.6 (exactly zero) or SSP2-4.5 (+0.04 cm).</w:t>
       </w:r>
     </w:p>
     <w:p>
@@ -754,13 +754,13 @@
               <w:rPr>
                 <w:rStyle w:val="VerbatimChar"/>
               </w:rPr>
-              <w:t xml:space="preserve">S(1900) − S(1850) ~ N(0.020, 0.009)</w:t>
+              <w:t xml:space="preserve">S(1900) − S(1850) ~ N(2.0, 0.9)</w:t>
             </w:r>
             <w:r>
               <w:t xml:space="preserve"> </w:t>
             </w:r>
             <w:r>
-              <w:t xml:space="preserve">m SLE</w:t>
+              <w:t xml:space="preserve">cm SLE</w:t>
             </w:r>
           </w:p>
         </w:tc>
@@ -1171,7 +1171,7 @@
         <w:t xml:space="preserve">ais_c</w:t>
       </w:r>
       <w:r>
-        <w:t xml:space="preserve">) are freed under a joint paleo prior. Ladrillo's pre-1990 Antarctic hindcast is far closer to the record than BRICK 2.0's — 1920–1949 bias −0.0096 cm against −1.9579 cm, and 1950–1992 +0.0027 cm against −0.7053 cm. BRICK 2.0 also samples its DAIS geometry; a key difference is the constraint, since its Antarctic likelihood is IMBIE 1992–2017 while Ladrillo fits an Antarctic series from 1900.</w:t>
+        <w:t xml:space="preserve">) are freed under a joint paleo prior. Ladrillo's pre-1990 Antarctic hindcast is far closer to the record than BRICK 2.0's — 1920–1949 bias −0.01 cm against −1.93 cm, and 1950–1992 +0.003 cm against −0.71 cm. BRICK 2.0 also samples its DAIS geometry; a key difference is the constraint, since its Antarctic likelihood is IMBIE 1992–2017 while Ladrillo fits an Antarctic series from 1900.</w:t>
       </w:r>
     </w:p>
     <w:p>
@@ -1892,7 +1892,7 @@
         <w:pStyle w:val="BodyText"/>
       </w:pPr>
       <w:r>
-        <w:t xml:space="preserve">Ladrillo is closer to the observations than BRICK 2.0 on every ice component in every window except glaciers over 1950–1992, and the gains are largest in the early eras. Cumulative total sea level rise, comparing the 1900–1904 mean with the 2020–2024 mean: observed +21.00 cm, Ladrillo +19.84, BRICK 2.0 +21.34 — Ladrillo undershoots by 1.2 cm, BRICK overshoots by 0.3. Over the shorter, more recent window — the mean over 2022-2024 relative to the 1995–2005 baseline — both models still run high, but only slightly: observed +7.81 cm, Ladrillo +8.16 (+0.36) and BRICK 2.0 +8.34 (+0.54), with IGCC's independent GMSL estimate between them at +8.21. On the 2006–2025 rate of total sea level, the metric the SLEIP intercomparison reports, Ladrillo gives 3.74 mm/yr and BRICK 2.0 3.89 against 3.92 for the observational target and 3.99 for IGCC (same linear fit, same window).</w:t>
+        <w:t xml:space="preserve">Ladrillo is closer to the observations than BRICK 2.0 on every ice component in every window except glaciers over 1950–1992, and the gains are largest in the early eras. Cumulative total sea level rise, comparing the 1900–1904 mean with the 2020–2024 mean: observed +21.00 cm, Ladrillo +19.84, BRICK 2.0 +21.34 — Ladrillo undershoots by 1.2 cm, BRICK overshoots by 0.3. Over the shorter, more recent window — the mean over 2022-2024 relative to the 1995–2005 baseline — both models still run high, but only slightly: observed +7.81 cm, Ladrillo +8.16 (+0.36) and BRICK 2.0 +8.34 (+0.54), with IGCC's independent GMSL estimate between them at +8.21. On the 2006–2025 rate of total sea level, the metric the SLEIP intercomparison reports, Ladrillo gives 0.374 cm/yr and BRICK 2.0 0.389 against 0.392 for the observational target and 0.399 for IGCC (same linear fit, same window).</w:t>
       </w:r>
     </w:p>
     <w:p>
@@ -2334,7 +2334,7 @@
         <w:pStyle w:val="BodyText"/>
       </w:pPr>
       <w:r>
-        <w:t xml:space="preserve">Two features of FIGs 2–4 and 7 are properties of the comparators rather than of the climate response. MAGICC-SLR's Greenland band at the Low-to-Negative marker reaches 144 cm at 2300 (95th percentile) against 25 cm at the Low marker, although the medians are 13 and 14 cm: on MAGICC's own climate that marker cools below preindustrial by 2300 in 597 of 600 members, and MAGICC's Greenland surface-mass-balance parameterisation, fitted for warming, turns positive there — the members with the strongest cooling (−1.5 to −2 K) give the largest Greenland rise (up to +343 cm from surface mass balance alone). And the FACTS DeConto and Bamber modules select their projections from the integrated 2000–2099 temperature, so their post-2100 values do not respond to the climate path after 2100 (High and High-to-Low give identical Antarctic values at 2300).</w:t>
+        <w:t xml:space="preserve">Two features of FIGs 2–4 and 7 are worth highlighting. MAGICC-SLR's Greenland band for the Low-to-Negative scenario reaches 144 cm at 2300 (95th percentile) compared to 25 cm for the Low scenario, although the medians are 13 and 14 cm: for MAGICC's own climate the Low-to-Negative scenario cools below preindustrial by 2300, and MAGICC's Greenland surface-mass-balance parameterisation, fitted for warming, turns positive there — the members with the strongest cooling (−1.5 to −2 K) give the largest Greenland melt (up to +343 cm from surface mass balance alone). And only part of FACTS responds to the climate after 2100: its thermal expansion, AR5 glacier and LARMIP Antarctic modules do, and the AR5 Antarctic surface mass balance does; but its Greenland module (FittedISMIP) extrapolates the 2080–2100 rate linearly to 2300, the AR5 Antarctic dynamics term is a prescribed function of time, and the DeConto and Bamber modules choose their projections from the temperature integrated over 2000–2099 (High and High-to-Low give identical Antarctic values at 2300). At 2150 and 2300, therefore, FACTS is a climate-responsive comparator for thermal expansion, glaciers and the LARMIP Antarctic module only.</w:t>
       </w:r>
     </w:p>
     <w:bookmarkStart w:id="45" w:name="secondary-the-ssps"/>

</xml_diff>

<commit_message>
FACTS past 2100: drop every module and total that is not climate-driven (Marcus's rule); Greenland cannot be made climate-driven, LARMIP forgets pre-2100 forcing at 2300
Co-Authored-By: Claude Opus 5 <noreply@anthropic.com>
</commit_message>
<xml_diff>
--- a/deliverables/LadrilloUpdateDescription_L24.docx
+++ b/deliverables/LadrilloUpdateDescription_L24.docx
@@ -2001,7 +2001,7 @@
         <w:t xml:space="preserve"> </w:t>
       </w:r>
       <w:r>
-        <w:t xml:space="preserve">Ladrillo L24 compared against BRICK 2.0, FACTS and MAGICC-SLR across the seven van Vuuren markers at 2100, by component. FACTS is drawn per module; its four workflows differ only in the Antarctic module, so the Total panel shows them as one bracket spanning the workflow medians (thin line: the union of their 5–95%).</w:t>
+        <w:t xml:space="preserve">Ladrillo L24 compared against BRICK 2.0, FACTS and MAGICC-SLR across the seven van Vuuren markers at 2100, by component. FACTS is drawn per module; its four workflows differ only in the Antarctic module, so the Total panel shows them as one bracket spanning the workflow medians (thin line: the union of their 5–95%). At 2150 and 2300 (FIGs 3, 4 and 9) only FACTS's climate-driven modules are drawn.</w:t>
       </w:r>
     </w:p>
     <w:p>
@@ -2334,7 +2334,7 @@
         <w:pStyle w:val="BodyText"/>
       </w:pPr>
       <w:r>
-        <w:t xml:space="preserve">Two features of FIGs 2–4 and 7 are worth highlighting. MAGICC-SLR's Greenland band for the Low-to-Negative scenario reaches 144 cm at 2300 (95th percentile) compared to 25 cm for the Low scenario, although the medians are 13 and 14 cm: for MAGICC's own climate the Low-to-Negative scenario cools below preindustrial by 2300, and MAGICC's Greenland surface-mass-balance parameterisation, fitted for warming, turns positive there — the members with the strongest cooling (−1.5 to −2 K) give the largest Greenland melt (up to +343 cm from surface mass balance alone). And only part of FACTS responds to the climate after 2100: its thermal expansion, AR5 glacier and LARMIP Antarctic modules do, and the AR5 Antarctic surface mass balance does; but its Greenland module (FittedISMIP) extrapolates the 2080–2100 rate linearly to 2300, the AR5 Antarctic dynamics term is a prescribed function of time, and the DeConto and Bamber modules choose their projections from the temperature integrated over 2000–2099 (High and High-to-Low give identical Antarctic values at 2300). At 2150 and 2300, therefore, FACTS is a climate-responsive comparator for thermal expansion, glaciers and the LARMIP Antarctic module only.</w:t>
+        <w:t xml:space="preserve">FACTS is drawn in full at 2100, but past 2100 only the modules that respond to the climate are shown. Its Greenland module (FittedISMIP) is an emulator fitted to 2015–2100 ISMIP6 runs whose rate carries an explicit quadratic term in time; FACTS extrapolates it linearly after 2100, and letting it run on the temperature path instead sends High-to-Low Greenland from 47 to 112 cm at 2300 while the climate cools — the time term, not the temperature. The Bamber and DeConto modules select their projections from the temperature integrated over 2000–2099, the AR5 Antarctic dynamics term is a prescribed function of time, and LARMIP's response functions are 200 years long and zero beyond, so at 2300 it has forgotten every pre-2100 forcing year (its response at lag 200 is still at full strength). Modules whose components are not climate-driven at a horizon, and every workflow total (each carries FittedISMIP), are therefore dropped from that horizon: at 2150 FACTS is drawn for glaciers, thermal expansion, land-water storage and LARMIP Antarctica; at 2300 for glaciers, thermal expansion and land-water storage only. The same rule applies to the benchmark. One further feature of the comparison is worth highlighting. MAGICC-SLR's Greenland band for the Low-to-Negative scenario reaches 144 cm at 2300 (95th percentile) compared to 25 cm for the Low scenario, although the medians are 13 and 14 cm: for MAGICC's own climate the Low-to-Negative scenario cools below preindustrial by 2300, and MAGICC's Greenland surface-mass-balance parameterisation, fitted for warming, turns positive there — the members with the strongest cooling (−1.5 to −2 K) give the largest Greenland melt (up to +343 cm from surface mass balance alone).</w:t>
       </w:r>
     </w:p>
     <w:bookmarkStart w:id="45" w:name="secondary-the-ssps"/>
@@ -2679,7 +2679,7 @@
         <w:t xml:space="preserve"> </w:t>
       </w:r>
       <w:r>
-        <w:t xml:space="preserve">Ladrillo sits at the low end of the comparison set on level — at vvVL its 2300 total median is 58 cm, above only MAGICC-SLR's 46 cm and below BRICK 2.0's 81 and the FACTS workflows' 107–190. On spread it is narrower than BRICK 2.0 on every component, and narrower than every FACTS module on glaciers, Greenland and thermal expansion; at Antarctica the LARMIP and DeConto modules are narrower (5–95% widths of 103 and 113 cm against Ladrillo's 134). MAGICC-SLR is the narrow outlier throughout (2300 total 5–95% width 67 cm against Ladrillo's 163, BRICK 2.0's 182 and 144–561 across the FACTS workflows).</w:t>
+        <w:t xml:space="preserve">Ladrillo sits at the low end of the comparison set on level — at vvVL its 2300 total median is 58 cm, above only MAGICC-SLR's 46 cm and below BRICK 2.0's 81. On spread it is narrower than BRICK 2.0 on every component and narrower than the FACTS glacier and thermal-expansion modules (the only FACTS modules drawn at 2300); MAGICC-SLR is the narrow outlier throughout (2300 total 5–95% width 67 cm against Ladrillo's 163 and BRICK 2.0's 182).</w:t>
       </w:r>
     </w:p>
     <w:p>

</xml_diff>

<commit_message>
Table 1: attributes of the seven SLEIP emulators and Ladrillo (SLEIP Tables 2/6 + our FACTS/inventory measurements); old tables renumbered
Co-Authored-By: Claude Opus 5 <noreply@anthropic.com>
</commit_message>
<xml_diff>
--- a/deliverables/LadrilloUpdateDescription_L24.docx
+++ b/deliverables/LadrilloUpdateDescription_L24.docx
@@ -24,18 +24,1177 @@
         <w:pStyle w:val="BodyText"/>
       </w:pPr>
       <w:r>
-        <w:t xml:space="preserve">Ladrillo occupies a distinct niche among current sea level emulators. Of the seven emulators in the SLEIP intercomparison, four carry a hindcast of every component from 1900 or earlier — BRICK 2.0, SURFER, MP25 and Ladrillo. SURFER's historical total runs outside the observational range in SLEIP's own assessment, and MP25 is a statistical fit to the Frederikse reconstruction that projects only to 2100; MAGICC-SLR and FRISIA start their ice sheets in 1990 and 2002, ProFSea in 2007. Beyond 2100, FACTS's ice-sheet modules either extrapolate or sample from 21st-century projections, so it does not respond to the climate path at the horizons where sea level commitment is decided, and MAGICC-SLR can only be run on MAGICC's own climate. Ladrillo keeps BRICK's design philosophy — physically based components calibrated on the historical record, a line of evidence independent of the large ice-sheet models — extends the observational constraint (an Antarctic likelihood from 1900 rather than IMBIE's 1992–2017; Dangendorf, GlaMBIE, GRACE and Mouginot added), and couples to a current FaIR (2.2.4, calibration 1.6.0) with a shared 841-member climate ensemble, so its projections carry climate uncertainty on the same footing as MAGICC's and FACTS's. It matches the historical record more closely than BRICK 2.0 on every ice component, with thermal expansion the one weakness, inherited from FaIR's ocean heat and absent when driven by observed ocean heat. It departs from the observational philosophy in two places that observations cannot reach — a Greenland commitment above a threshold, informed by SICOPOLIS, and local-to-global temperature amplification, informed by CMIP6 — and says so.</w:t>
-      </w:r>
-    </w:p>
-    <w:p>
-      <w:pPr>
-        <w:pStyle w:val="BlockText"/>
+        <w:t xml:space="preserve">Ladrillo occupies a distinct niche among current sea level emulators. Of the seven emulators in the SLEIP intercomparison, only three carry a hindcast of every component from 1900 or earlier: BRICK 2.0, SURFER, MP25. Of these three, SURFER's historical total runs outside the observational range in SLEIP's own assessment, and MP25 is a statistical fit to the Frederikse reconstruction that projects only to 2100. MAGICC-SLR and FRISIA start their ice sheets in 1990 and 2002 and ProFSea starts in 2007. Meanwhile, beyond 2100, FACTS's ice-sheet modules either extrapolate or sample from 21st-century projections, and MAGICC-SLR can only be run on MAGICC's own climate.</w:t>
+      </w:r>
+    </w:p>
+    <w:p>
+      <w:pPr>
+        <w:pStyle w:val="BodyText"/>
+      </w:pPr>
+      <w:r>
+        <w:t xml:space="preserve">As a derivative of BRICK, Ladrillo and BRICK do have a similar niche. However, while Ladrillo generally keeps to BRICK’s design philosophy of physically based components calibrated on the historical record, it does depart from that philosophy in two places that observations cannot reach, namely a Greenland commitment above a threshold, informed by SICOPOLIS, and local-to-global temperature amplification, informed by CMIP6. Ladrillo also extended some of BRICK’s observational constraints (an Antarctic likelihood from 1900 rather than IMBIE's 1992–2017; Dangendorf, GlaMBIE, GRACE and Mouginot added), and is calibrated to a current version of FaIR (2.2.4, calibration 1.6.0, 841-member climate ensemble) rather than being coupled to SNEASY.</w:t>
+      </w:r>
+    </w:p>
+    <w:p>
+      <w:pPr>
+        <w:pStyle w:val="BodyText"/>
       </w:pPr>
       <w:r>
         <w:rPr>
           <w:b/>
           <w:bCs/>
         </w:rPr>
+        <w:t xml:space="preserve">Table 1.</w:t>
+      </w:r>
+      <w:r>
+        <w:t xml:space="preserve"> </w:t>
+      </w:r>
+      <w:r>
+        <w:t xml:space="preserve">Attributes of the seven SLEIP emulators and Ladrillo. SLEIP entries are taken from the SLEIP preprint (Tables 2 and 6 and §3); FACTS's post-2100 behaviour, and the BRICK 2.0, MAGICC and FACTS glacier inventories, are read from the model code and drawnsets in this project. "—" means the emulator lacks the component; "n.s." means not stated in SLEIP.</w:t>
+      </w:r>
+    </w:p>
+    <w:tbl>
+      <w:tblPr>
+        <w:tblStyle w:val="Table"/>
+        <w:tblW w:type="pct" w:w="5000"/>
+        <w:tblLayout w:type="fixed"/>
+        <w:tblLook w:firstRow="1" w:lastRow="0" w:firstColumn="0" w:lastColumn="0" w:noHBand="0" w:noVBand="0" w:val="0020"/>
+      </w:tblPr>
+      <w:tblGrid>
+        <w:gridCol w:w="1788"/>
+        <w:gridCol w:w="510"/>
+        <w:gridCol w:w="1149"/>
+        <w:gridCol w:w="638"/>
+        <w:gridCol w:w="766"/>
+        <w:gridCol w:w="510"/>
+        <w:gridCol w:w="766"/>
+        <w:gridCol w:w="766"/>
+        <w:gridCol w:w="1021"/>
+      </w:tblGrid>
+      <w:tr>
+        <w:trPr>
+          <w:tblHeader w:val="on"/>
+        </w:trPr>
+        <w:tc>
+          <w:tcPr/>
+          <w:p>
+            <w:pPr>
+              <w:pStyle w:val="Compact"/>
+            </w:pPr>
+            <w:r>
+              <w:t xml:space="preserve">attribute</w:t>
+            </w:r>
+          </w:p>
+        </w:tc>
+        <w:tc>
+          <w:tcPr/>
+          <w:p>
+            <w:pPr>
+              <w:pStyle w:val="Compact"/>
+            </w:pPr>
+            <w:r>
+              <w:t xml:space="preserve">BRICK 2.0</w:t>
+            </w:r>
+          </w:p>
+        </w:tc>
+        <w:tc>
+          <w:tcPr/>
+          <w:p>
+            <w:pPr>
+              <w:pStyle w:val="Compact"/>
+            </w:pPr>
+            <w:r>
+              <w:t xml:space="preserve">FACTS</w:t>
+            </w:r>
+          </w:p>
+        </w:tc>
+        <w:tc>
+          <w:tcPr/>
+          <w:p>
+            <w:pPr>
+              <w:pStyle w:val="Compact"/>
+            </w:pPr>
+            <w:r>
+              <w:t xml:space="preserve">FRISIA</w:t>
+            </w:r>
+          </w:p>
+        </w:tc>
+        <w:tc>
+          <w:tcPr/>
+          <w:p>
+            <w:pPr>
+              <w:pStyle w:val="Compact"/>
+            </w:pPr>
+            <w:r>
+              <w:t xml:space="preserve">MAGICC-SLR</w:t>
+            </w:r>
+          </w:p>
+        </w:tc>
+        <w:tc>
+          <w:tcPr/>
+          <w:p>
+            <w:pPr>
+              <w:pStyle w:val="Compact"/>
+            </w:pPr>
+            <w:r>
+              <w:t xml:space="preserve">MP25</w:t>
+            </w:r>
+          </w:p>
+        </w:tc>
+        <w:tc>
+          <w:tcPr/>
+          <w:p>
+            <w:pPr>
+              <w:pStyle w:val="Compact"/>
+            </w:pPr>
+            <w:r>
+              <w:t xml:space="preserve">ProFSea</w:t>
+            </w:r>
+          </w:p>
+        </w:tc>
+        <w:tc>
+          <w:tcPr/>
+          <w:p>
+            <w:pPr>
+              <w:pStyle w:val="Compact"/>
+            </w:pPr>
+            <w:r>
+              <w:t xml:space="preserve">SURFER</w:t>
+            </w:r>
+          </w:p>
+        </w:tc>
+        <w:tc>
+          <w:tcPr/>
+          <w:p>
+            <w:pPr>
+              <w:pStyle w:val="Compact"/>
+            </w:pPr>
+            <w:r>
+              <w:t xml:space="preserve">Ladrillo</w:t>
+            </w:r>
+          </w:p>
+        </w:tc>
+      </w:tr>
+      <w:tr>
+        <w:tc>
+          <w:tcPr/>
+          <w:p>
+            <w:pPr>
+              <w:pStyle w:val="Compact"/>
+            </w:pPr>
+            <w:r>
+              <w:t xml:space="preserve">Hindcast of every component (start year)</w:t>
+            </w:r>
+          </w:p>
+        </w:tc>
+        <w:tc>
+          <w:tcPr/>
+          <w:p>
+            <w:pPr>
+              <w:pStyle w:val="Compact"/>
+            </w:pPr>
+            <w:r>
+              <w:t xml:space="preserve">yes (1850)</w:t>
+            </w:r>
+          </w:p>
+        </w:tc>
+        <w:tc>
+          <w:tcPr/>
+          <w:p>
+            <w:pPr>
+              <w:pStyle w:val="Compact"/>
+            </w:pPr>
+            <w:r>
+              <w:t xml:space="preserve">no (2005)</w:t>
+            </w:r>
+          </w:p>
+        </w:tc>
+        <w:tc>
+          <w:tcPr/>
+          <w:p>
+            <w:pPr>
+              <w:pStyle w:val="Compact"/>
+            </w:pPr>
+            <w:r>
+              <w:t xml:space="preserve">partial (GIS 1990, AIS 2002)</w:t>
+            </w:r>
+          </w:p>
+        </w:tc>
+        <w:tc>
+          <w:tcPr/>
+          <w:p>
+            <w:pPr>
+              <w:pStyle w:val="Compact"/>
+            </w:pPr>
+            <w:r>
+              <w:t xml:space="preserve">partial (GIS 1990, AIS 2002)</w:t>
+            </w:r>
+          </w:p>
+        </w:tc>
+        <w:tc>
+          <w:tcPr/>
+          <w:p>
+            <w:pPr>
+              <w:pStyle w:val="Compact"/>
+            </w:pPr>
+            <w:r>
+              <w:t xml:space="preserve">yes (1900)</w:t>
+            </w:r>
+          </w:p>
+        </w:tc>
+        <w:tc>
+          <w:tcPr/>
+          <w:p>
+            <w:pPr>
+              <w:pStyle w:val="Compact"/>
+            </w:pPr>
+            <w:r>
+              <w:t xml:space="preserve">no (2007)</w:t>
+            </w:r>
+          </w:p>
+        </w:tc>
+        <w:tc>
+          <w:tcPr/>
+          <w:p>
+            <w:pPr>
+              <w:pStyle w:val="Compact"/>
+            </w:pPr>
+            <w:r>
+              <w:t xml:space="preserve">yes (1850)</w:t>
+            </w:r>
+          </w:p>
+        </w:tc>
+        <w:tc>
+          <w:tcPr/>
+          <w:p>
+            <w:pPr>
+              <w:pStyle w:val="Compact"/>
+            </w:pPr>
+            <w:r>
+              <w:t xml:space="preserve">yes (1850; scored from 1900)</w:t>
+            </w:r>
+          </w:p>
+        </w:tc>
+      </w:tr>
+      <w:tr>
+        <w:tc>
+          <w:tcPr/>
+          <w:p>
+            <w:pPr>
+              <w:pStyle w:val="Compact"/>
+            </w:pPr>
+            <w:r>
+              <w:t xml:space="preserve">Calibrated on observations rather than process-model projections</w:t>
+            </w:r>
+          </w:p>
+        </w:tc>
+        <w:tc>
+          <w:tcPr/>
+          <w:p>
+            <w:pPr>
+              <w:pStyle w:val="Compact"/>
+            </w:pPr>
+            <w:r>
+              <w:t xml:space="preserve">yes</w:t>
+            </w:r>
+          </w:p>
+        </w:tc>
+        <w:tc>
+          <w:tcPr/>
+          <w:p>
+            <w:pPr>
+              <w:pStyle w:val="Compact"/>
+            </w:pPr>
+            <w:r>
+              <w:t xml:space="preserve">no (emulates ISMIP6, LARMIP, DeConto; SEJ)</w:t>
+            </w:r>
+          </w:p>
+        </w:tc>
+        <w:tc>
+          <w:tcPr/>
+          <w:p>
+            <w:pPr>
+              <w:pStyle w:val="Compact"/>
+            </w:pPr>
+            <w:r>
+              <w:t xml:space="preserve">mixed (Horwath obs + AR6)</w:t>
+            </w:r>
+          </w:p>
+        </w:tc>
+        <w:tc>
+          <w:tcPr/>
+          <w:p>
+            <w:pPr>
+              <w:pStyle w:val="Compact"/>
+            </w:pPr>
+            <w:r>
+              <w:t xml:space="preserve">no (SICOPOLIS, PISM, Marzeion)</w:t>
+            </w:r>
+          </w:p>
+        </w:tc>
+        <w:tc>
+          <w:tcPr/>
+          <w:p>
+            <w:pPr>
+              <w:pStyle w:val="Compact"/>
+            </w:pPr>
+            <w:r>
+              <w:t xml:space="preserve">mixed (Frederikse + AR6 2100)</w:t>
+            </w:r>
+          </w:p>
+        </w:tc>
+        <w:tc>
+          <w:tcPr/>
+          <w:p>
+            <w:pPr>
+              <w:pStyle w:val="Compact"/>
+            </w:pPr>
+            <w:r>
+              <w:t xml:space="preserve">no (ISMIP6, GlacierMIP2)</w:t>
+            </w:r>
+          </w:p>
+        </w:tc>
+        <w:tc>
+          <w:tcPr/>
+          <w:p>
+            <w:pPr>
+              <w:pStyle w:val="Compact"/>
+            </w:pPr>
+            <w:r>
+              <w:t xml:space="preserve">no (tipping points from ice-sheet models)</w:t>
+            </w:r>
+          </w:p>
+        </w:tc>
+        <w:tc>
+          <w:tcPr/>
+          <w:p>
+            <w:pPr>
+              <w:pStyle w:val="Compact"/>
+            </w:pPr>
+            <w:r>
+              <w:t xml:space="preserve">yes, plus two priors (SICOPOLIS tap, CMIP6 amplification)</w:t>
+            </w:r>
+          </w:p>
+        </w:tc>
+      </w:tr>
+      <w:tr>
+        <w:tc>
+          <w:tcPr/>
+          <w:p>
+            <w:pPr>
+              <w:pStyle w:val="Compact"/>
+            </w:pPr>
+            <w:r>
+              <w:t xml:space="preserve">Accepts an external climate (can be run on FaIR)</w:t>
+            </w:r>
+          </w:p>
+        </w:tc>
+        <w:tc>
+          <w:tcPr/>
+          <w:p>
+            <w:pPr>
+              <w:pStyle w:val="Compact"/>
+            </w:pPr>
+            <w:r>
+              <w:t xml:space="preserve">yes</w:t>
+            </w:r>
+          </w:p>
+        </w:tc>
+        <w:tc>
+          <w:tcPr/>
+          <w:p>
+            <w:pPr>
+              <w:pStyle w:val="Compact"/>
+            </w:pPr>
+            <w:r>
+              <w:t xml:space="preserve">yes (FaIR 1.6.4 native)</w:t>
+            </w:r>
+          </w:p>
+        </w:tc>
+        <w:tc>
+          <w:tcPr/>
+          <w:p>
+            <w:pPr>
+              <w:pStyle w:val="Compact"/>
+            </w:pPr>
+            <w:r>
+              <w:t xml:space="preserve">yes (FaIR 2.1.1 native)</w:t>
+            </w:r>
+          </w:p>
+        </w:tc>
+        <w:tc>
+          <w:tcPr/>
+          <w:p>
+            <w:pPr>
+              <w:pStyle w:val="Compact"/>
+            </w:pPr>
+            <w:r>
+              <w:t xml:space="preserve">no (MAGICC only)</w:t>
+            </w:r>
+          </w:p>
+        </w:tc>
+        <w:tc>
+          <w:tcPr/>
+          <w:p>
+            <w:pPr>
+              <w:pStyle w:val="Compact"/>
+            </w:pPr>
+            <w:r>
+              <w:t xml:space="preserve">GMST only</w:t>
+            </w:r>
+          </w:p>
+        </w:tc>
+        <w:tc>
+          <w:tcPr/>
+          <w:p>
+            <w:pPr>
+              <w:pStyle w:val="Compact"/>
+            </w:pPr>
+            <w:r>
+              <w:t xml:space="preserve">yes (OHC from FaIR or MAGICC)</w:t>
+            </w:r>
+          </w:p>
+        </w:tc>
+        <w:tc>
+          <w:tcPr/>
+          <w:p>
+            <w:pPr>
+              <w:pStyle w:val="Compact"/>
+            </w:pPr>
+            <w:r>
+              <w:t xml:space="preserve">no (own climate from emissions)</w:t>
+            </w:r>
+          </w:p>
+        </w:tc>
+        <w:tc>
+          <w:tcPr/>
+          <w:p>
+            <w:pPr>
+              <w:pStyle w:val="Compact"/>
+            </w:pPr>
+            <w:r>
+              <w:t xml:space="preserve">yes (FaIR 2.2.4, calib 1.6.0)</w:t>
+            </w:r>
+          </w:p>
+        </w:tc>
+      </w:tr>
+      <w:tr>
+        <w:tc>
+          <w:tcPr/>
+          <w:p>
+            <w:pPr>
+              <w:pStyle w:val="Compact"/>
+            </w:pPr>
+            <w:r>
+              <w:t xml:space="preserve">Components climate-driven past 2100</w:t>
+            </w:r>
+          </w:p>
+        </w:tc>
+        <w:tc>
+          <w:tcPr/>
+          <w:p>
+            <w:pPr>
+              <w:pStyle w:val="Compact"/>
+            </w:pPr>
+            <w:r>
+              <w:t xml:space="preserve">yes</w:t>
+            </w:r>
+          </w:p>
+        </w:tc>
+        <w:tc>
+          <w:tcPr/>
+          <w:p>
+            <w:pPr>
+              <w:pStyle w:val="Compact"/>
+            </w:pPr>
+            <w:r>
+              <w:t xml:space="preserve">TE, glaciers only (ice sheets extrapolate or sample 21st-century projections)</w:t>
+            </w:r>
+          </w:p>
+        </w:tc>
+        <w:tc>
+          <w:tcPr/>
+          <w:p>
+            <w:pPr>
+              <w:pStyle w:val="Compact"/>
+            </w:pPr>
+            <w:r>
+              <w:t xml:space="preserve">yes</w:t>
+            </w:r>
+          </w:p>
+        </w:tc>
+        <w:tc>
+          <w:tcPr/>
+          <w:p>
+            <w:pPr>
+              <w:pStyle w:val="Compact"/>
+            </w:pPr>
+            <w:r>
+              <w:t xml:space="preserve">yes (calibrated to 2300–2500)</w:t>
+            </w:r>
+          </w:p>
+        </w:tc>
+        <w:tc>
+          <w:tcPr/>
+          <w:p>
+            <w:pPr>
+              <w:pStyle w:val="Compact"/>
+            </w:pPr>
+            <w:r>
+              <w:t xml:space="preserve">no (2100 model, extrapolated)</w:t>
+            </w:r>
+          </w:p>
+        </w:tc>
+        <w:tc>
+          <w:tcPr/>
+          <w:p>
+            <w:pPr>
+              <w:pStyle w:val="Compact"/>
+            </w:pPr>
+            <w:r>
+              <w:t xml:space="preserve">partial (GIS as FACTS; AIS to 2300)</w:t>
+            </w:r>
+          </w:p>
+        </w:tc>
+        <w:tc>
+          <w:tcPr/>
+          <w:p>
+            <w:pPr>
+              <w:pStyle w:val="Compact"/>
+            </w:pPr>
+            <w:r>
+              <w:t xml:space="preserve">yes</w:t>
+            </w:r>
+          </w:p>
+        </w:tc>
+        <w:tc>
+          <w:tcPr/>
+          <w:p>
+            <w:pPr>
+              <w:pStyle w:val="Compact"/>
+            </w:pPr>
+            <w:r>
+              <w:t xml:space="preserve">yes</w:t>
+            </w:r>
+          </w:p>
+        </w:tc>
+      </w:tr>
+      <w:tr>
+        <w:tc>
+          <w:tcPr/>
+          <w:p>
+            <w:pPr>
+              <w:pStyle w:val="Compact"/>
+            </w:pPr>
+            <w:r>
+              <w:t xml:space="preserve">Thermal expansion</w:t>
+            </w:r>
+          </w:p>
+        </w:tc>
+        <w:tc>
+          <w:tcPr/>
+          <w:p>
+            <w:pPr>
+              <w:pStyle w:val="Compact"/>
+            </w:pPr>
+            <w:r>
+              <w:t xml:space="preserve">∝ OHC</w:t>
+            </w:r>
+          </w:p>
+        </w:tc>
+        <w:tc>
+          <w:tcPr/>
+          <w:p>
+            <w:pPr>
+              <w:pStyle w:val="Compact"/>
+            </w:pPr>
+            <w:r>
+              <w:t xml:space="preserve">coefficient × OHC</w:t>
+            </w:r>
+          </w:p>
+        </w:tc>
+        <w:tc>
+          <w:tcPr/>
+          <w:p>
+            <w:pPr>
+              <w:pStyle w:val="Compact"/>
+            </w:pPr>
+            <w:r>
+              <w:t xml:space="preserve">coefficient × OHC</w:t>
+            </w:r>
+          </w:p>
+        </w:tc>
+        <w:tc>
+          <w:tcPr/>
+          <w:p>
+            <w:pPr>
+              <w:pStyle w:val="Compact"/>
+            </w:pPr>
+            <w:r>
+              <w:t xml:space="preserve">40-layer, layer-specific</w:t>
+            </w:r>
+          </w:p>
+        </w:tc>
+        <w:tc>
+          <w:tcPr/>
+          <w:p>
+            <w:pPr>
+              <w:pStyle w:val="Compact"/>
+            </w:pPr>
+            <w:r>
+              <w:t xml:space="preserve">linear in GSAT</w:t>
+            </w:r>
+          </w:p>
+        </w:tc>
+        <w:tc>
+          <w:tcPr/>
+          <w:p>
+            <w:pPr>
+              <w:pStyle w:val="Compact"/>
+            </w:pPr>
+            <w:r>
+              <w:t xml:space="preserve">coefficient × OHC</w:t>
+            </w:r>
+          </w:p>
+        </w:tc>
+        <w:tc>
+          <w:tcPr/>
+          <w:p>
+            <w:pPr>
+              <w:pStyle w:val="Compact"/>
+            </w:pPr>
+            <w:r>
+              <w:t xml:space="preserve">3-layer, layer-specific</w:t>
+            </w:r>
+          </w:p>
+        </w:tc>
+        <w:tc>
+          <w:tcPr/>
+          <w:p>
+            <w:pPr>
+              <w:pStyle w:val="Compact"/>
+            </w:pPr>
+            <w:r>
+              <w:t xml:space="preserve">∝ OHC</w:t>
+            </w:r>
+          </w:p>
+        </w:tc>
+      </w:tr>
+      <w:tr>
+        <w:tc>
+          <w:tcPr/>
+          <w:p>
+            <w:pPr>
+              <w:pStyle w:val="Compact"/>
+            </w:pPr>
+            <w:r>
+              <w:t xml:space="preserve">Glacier inventory vs Farinotti 2019 (32.4 ± 8.4 cm full RGI)</w:t>
+            </w:r>
+          </w:p>
+        </w:tc>
+        <w:tc>
+          <w:tcPr/>
+          <w:p>
+            <w:pPr>
+              <w:pStyle w:val="Compact"/>
+            </w:pPr>
+            <w:r>
+              <w:t xml:space="preserve">42 cm (Wigley–Raper 41)</w:t>
+            </w:r>
+          </w:p>
+        </w:tc>
+        <w:tc>
+          <w:tcPr/>
+          <w:p>
+            <w:pPr>
+              <w:pStyle w:val="Compact"/>
+            </w:pPr>
+            <w:r>
+              <w:t xml:space="preserve">31.6 cm cap (AR5 Table 4.2)</w:t>
+            </w:r>
+          </w:p>
+        </w:tc>
+        <w:tc>
+          <w:tcPr/>
+          <w:p>
+            <w:pPr>
+              <w:pStyle w:val="Compact"/>
+            </w:pPr>
+            <w:r>
+              <w:t xml:space="preserve">n.s.</w:t>
+            </w:r>
+          </w:p>
+        </w:tc>
+        <w:tc>
+          <w:tcPr/>
+          <w:p>
+            <w:pPr>
+              <w:pStyle w:val="Compact"/>
+            </w:pPr>
+            <w:r>
+              <w:t xml:space="preserve">35.6–45.1 cm across tunes</w:t>
+            </w:r>
+          </w:p>
+        </w:tc>
+        <w:tc>
+          <w:tcPr/>
+          <w:p>
+            <w:pPr>
+              <w:pStyle w:val="Compact"/>
+            </w:pPr>
+            <w:r>
+              <w:t xml:space="preserve">n.s.</w:t>
+            </w:r>
+          </w:p>
+        </w:tc>
+        <w:tc>
+          <w:tcPr/>
+          <w:p>
+            <w:pPr>
+              <w:pStyle w:val="Compact"/>
+            </w:pPr>
+            <w:r>
+              <w:t xml:space="preserve">n.s. (AR5 form)</w:t>
+            </w:r>
+          </w:p>
+        </w:tc>
+        <w:tc>
+          <w:tcPr/>
+          <w:p>
+            <w:pPr>
+              <w:pStyle w:val="Compact"/>
+            </w:pPr>
+            <w:r>
+              <w:t xml:space="preserve">50 cm</w:t>
+            </w:r>
+          </w:p>
+        </w:tc>
+        <w:tc>
+          <w:tcPr/>
+          <w:p>
+            <w:pPr>
+              <w:pStyle w:val="Compact"/>
+            </w:pPr>
+            <w:r>
+              <w:t xml:space="preserve">29.0 ± 6.0 cm on target scope</w:t>
+            </w:r>
+          </w:p>
+        </w:tc>
+      </w:tr>
+      <w:tr>
+        <w:tc>
+          <w:tcPr/>
+          <w:p>
+            <w:pPr>
+              <w:pStyle w:val="Compact"/>
+            </w:pPr>
+            <w:r>
+              <w:t xml:space="preserve">Glaciers can regrow under cooling</w:t>
+            </w:r>
+          </w:p>
+        </w:tc>
+        <w:tc>
+          <w:tcPr/>
+          <w:p>
+            <w:pPr>
+              <w:pStyle w:val="Compact"/>
+            </w:pPr>
+            <w:r>
+              <w:t xml:space="preserve">no</w:t>
+            </w:r>
+          </w:p>
+        </w:tc>
+        <w:tc>
+          <w:tcPr/>
+          <w:p>
+            <w:pPr>
+              <w:pStyle w:val="Compact"/>
+            </w:pPr>
+            <w:r>
+              <w:t xml:space="preserve">no</w:t>
+            </w:r>
+          </w:p>
+        </w:tc>
+        <w:tc>
+          <w:tcPr/>
+          <w:p>
+            <w:pPr>
+              <w:pStyle w:val="Compact"/>
+            </w:pPr>
+            <w:r>
+              <w:t xml:space="preserve">no</w:t>
+            </w:r>
+          </w:p>
+        </w:tc>
+        <w:tc>
+          <w:tcPr/>
+          <w:p>
+            <w:pPr>
+              <w:pStyle w:val="Compact"/>
+            </w:pPr>
+            <w:r>
+              <w:t xml:space="preserve">yes</w:t>
+            </w:r>
+          </w:p>
+        </w:tc>
+        <w:tc>
+          <w:tcPr/>
+          <w:p>
+            <w:pPr>
+              <w:pStyle w:val="Compact"/>
+            </w:pPr>
+            <w:r>
+              <w:t xml:space="preserve">n.s.</w:t>
+            </w:r>
+          </w:p>
+        </w:tc>
+        <w:tc>
+          <w:tcPr/>
+          <w:p>
+            <w:pPr>
+              <w:pStyle w:val="Compact"/>
+            </w:pPr>
+            <w:r>
+              <w:t xml:space="preserve">no</w:t>
+            </w:r>
+          </w:p>
+        </w:tc>
+        <w:tc>
+          <w:tcPr/>
+          <w:p>
+            <w:pPr>
+              <w:pStyle w:val="Compact"/>
+            </w:pPr>
+            <w:r>
+              <w:t xml:space="preserve">yes</w:t>
+            </w:r>
+          </w:p>
+        </w:tc>
+        <w:tc>
+          <w:tcPr/>
+          <w:p>
+            <w:pPr>
+              <w:pStyle w:val="Compact"/>
+            </w:pPr>
+            <w:r>
+              <w:t xml:space="preserve">yes</w:t>
+            </w:r>
+          </w:p>
+        </w:tc>
+      </w:tr>
+      <w:tr>
+        <w:tc>
+          <w:tcPr/>
+          <w:p>
+            <w:pPr>
+              <w:pStyle w:val="Compact"/>
+            </w:pPr>
+            <w:r>
+              <w:t xml:space="preserve">Greenland SMB / discharge split</w:t>
+            </w:r>
+          </w:p>
+        </w:tc>
+        <w:tc>
+          <w:tcPr/>
+          <w:p>
+            <w:pPr>
+              <w:pStyle w:val="Compact"/>
+            </w:pPr>
+            <w:r>
+              <w:t xml:space="preserve">no</w:t>
+            </w:r>
+          </w:p>
+        </w:tc>
+        <w:tc>
+          <w:tcPr/>
+          <w:p>
+            <w:pPr>
+              <w:pStyle w:val="Compact"/>
+            </w:pPr>
+            <w:r>
+              <w:t xml:space="preserve">no</w:t>
+            </w:r>
+          </w:p>
+        </w:tc>
+        <w:tc>
+          <w:tcPr/>
+          <w:p>
+            <w:pPr>
+              <w:pStyle w:val="Compact"/>
+            </w:pPr>
+            <w:r>
+              <w:t xml:space="preserve">yes</w:t>
+            </w:r>
+          </w:p>
+        </w:tc>
+        <w:tc>
+          <w:tcPr/>
+          <w:p>
+            <w:pPr>
+              <w:pStyle w:val="Compact"/>
+            </w:pPr>
+            <w:r>
+              <w:t xml:space="preserve">yes</w:t>
+            </w:r>
+          </w:p>
+        </w:tc>
+        <w:tc>
+          <w:tcPr/>
+          <w:p>
+            <w:pPr>
+              <w:pStyle w:val="Compact"/>
+            </w:pPr>
+            <w:r>
+              <w:t xml:space="preserve">no</w:t>
+            </w:r>
+          </w:p>
+        </w:tc>
+        <w:tc>
+          <w:tcPr/>
+          <w:p>
+            <w:pPr>
+              <w:pStyle w:val="Compact"/>
+            </w:pPr>
+            <w:r>
+              <w:t xml:space="preserve">no</w:t>
+            </w:r>
+          </w:p>
+        </w:tc>
+        <w:tc>
+          <w:tcPr/>
+          <w:p>
+            <w:pPr>
+              <w:pStyle w:val="Compact"/>
+            </w:pPr>
+            <w:r>
+              <w:t xml:space="preserve">no</w:t>
+            </w:r>
+          </w:p>
+        </w:tc>
+        <w:tc>
+          <w:tcPr/>
+          <w:p>
+            <w:pPr>
+              <w:pStyle w:val="Compact"/>
+            </w:pPr>
+            <w:r>
+              <w:t xml:space="preserve">yes (two channels, two basins)</w:t>
+            </w:r>
+          </w:p>
+        </w:tc>
+      </w:tr>
+      <w:tr>
+        <w:tc>
+          <w:tcPr/>
+          <w:p>
+            <w:pPr>
+              <w:pStyle w:val="Compact"/>
+            </w:pPr>
+            <w:r>
+              <w:t xml:space="preserve">Antarctic ice sheet (SLEIP type)</w:t>
+            </w:r>
+          </w:p>
+        </w:tc>
+        <w:tc>
+          <w:tcPr/>
+          <w:p>
+            <w:pPr>
+              <w:pStyle w:val="Compact"/>
+            </w:pPr>
+            <w:r>
+              <w:t xml:space="preserve">physical model (DAIS)</w:t>
+            </w:r>
+          </w:p>
+        </w:tc>
+        <w:tc>
+          <w:tcPr/>
+          <w:p>
+            <w:pPr>
+              <w:pStyle w:val="Compact"/>
+            </w:pPr>
+            <w:r>
+              <w:t xml:space="preserve">statistical / parametric / SEJ by workflow</w:t>
+            </w:r>
+          </w:p>
+        </w:tc>
+        <w:tc>
+          <w:tcPr/>
+          <w:p>
+            <w:pPr>
+              <w:pStyle w:val="Compact"/>
+            </w:pPr>
+            <w:r>
+              <w:t xml:space="preserve">physical model (DAIS)</w:t>
+            </w:r>
+          </w:p>
+        </w:tc>
+        <w:tc>
+          <w:tcPr/>
+          <w:p>
+            <w:pPr>
+              <w:pStyle w:val="Compact"/>
+            </w:pPr>
+            <w:r>
+              <w:t xml:space="preserve">parametric</w:t>
+            </w:r>
+          </w:p>
+        </w:tc>
+        <w:tc>
+          <w:tcPr/>
+          <w:p>
+            <w:pPr>
+              <w:pStyle w:val="Compact"/>
+            </w:pPr>
+            <w:r>
+              <w:t xml:space="preserve">parametric</w:t>
+            </w:r>
+          </w:p>
+        </w:tc>
+        <w:tc>
+          <w:tcPr/>
+          <w:p>
+            <w:pPr>
+              <w:pStyle w:val="Compact"/>
+            </w:pPr>
+            <w:r>
+              <w:t xml:space="preserve">statistical fit</w:t>
+            </w:r>
+          </w:p>
+        </w:tc>
+        <w:tc>
+          <w:tcPr/>
+          <w:p>
+            <w:pPr>
+              <w:pStyle w:val="Compact"/>
+            </w:pPr>
+            <w:r>
+              <w:t xml:space="preserve">physical model (ODE tipping element)</w:t>
+            </w:r>
+          </w:p>
+        </w:tc>
+        <w:tc>
+          <w:tcPr/>
+          <w:p>
+            <w:pPr>
+              <w:pStyle w:val="Compact"/>
+            </w:pPr>
+            <w:r>
+              <w:t xml:space="preserve">physical model (DAIS, recalibrated)</w:t>
+            </w:r>
+          </w:p>
+        </w:tc>
+      </w:tr>
+      <w:tr>
+        <w:tc>
+          <w:tcPr/>
+          <w:p>
+            <w:pPr>
+              <w:pStyle w:val="Compact"/>
+            </w:pPr>
+            <w:r>
+              <w:t xml:space="preserve">Regional output / relative sea level</w:t>
+            </w:r>
+          </w:p>
+        </w:tc>
+        <w:tc>
+          <w:tcPr/>
+          <w:p>
+            <w:pPr>
+              <w:pStyle w:val="Compact"/>
+            </w:pPr>
+            <w:r>
+              <w:t xml:space="preserve">yes / no</w:t>
+            </w:r>
+          </w:p>
+        </w:tc>
+        <w:tc>
+          <w:tcPr/>
+          <w:p>
+            <w:pPr>
+              <w:pStyle w:val="Compact"/>
+            </w:pPr>
+            <w:r>
+              <w:t xml:space="preserve">yes / yes</w:t>
+            </w:r>
+          </w:p>
+        </w:tc>
+        <w:tc>
+          <w:tcPr/>
+          <w:p>
+            <w:pPr>
+              <w:pStyle w:val="Compact"/>
+            </w:pPr>
+            <w:r>
+              <w:t xml:space="preserve">yes / no</w:t>
+            </w:r>
+          </w:p>
+        </w:tc>
+        <w:tc>
+          <w:tcPr/>
+          <w:p>
+            <w:pPr>
+              <w:pStyle w:val="Compact"/>
+            </w:pPr>
+            <w:r>
+              <w:t xml:space="preserve">no / no</w:t>
+            </w:r>
+          </w:p>
+        </w:tc>
+        <w:tc>
+          <w:tcPr/>
+          <w:p>
+            <w:pPr>
+              <w:pStyle w:val="Compact"/>
+            </w:pPr>
+            <w:r>
+              <w:t xml:space="preserve">yes / yes</w:t>
+            </w:r>
+          </w:p>
+        </w:tc>
+        <w:tc>
+          <w:tcPr/>
+          <w:p>
+            <w:pPr>
+              <w:pStyle w:val="Compact"/>
+            </w:pPr>
+            <w:r>
+              <w:t xml:space="preserve">yes / yes</w:t>
+            </w:r>
+          </w:p>
+        </w:tc>
+        <w:tc>
+          <w:tcPr/>
+          <w:p>
+            <w:pPr>
+              <w:pStyle w:val="Compact"/>
+            </w:pPr>
+            <w:r>
+              <w:t xml:space="preserve">no / no</w:t>
+            </w:r>
+          </w:p>
+        </w:tc>
+        <w:tc>
+          <w:tcPr/>
+          <w:p>
+            <w:pPr>
+              <w:pStyle w:val="Compact"/>
+            </w:pPr>
+            <w:r>
+              <w:t xml:space="preserve">no / no</w:t>
+            </w:r>
+          </w:p>
+        </w:tc>
+      </w:tr>
+    </w:tbl>
+    <w:p>
+      <w:pPr>
+        <w:pStyle w:val="BlockText"/>
+      </w:pPr>
+      <w:r>
+        <w:rPr>
+          <w:b/>
+          <w:bCs/>
+        </w:rPr>
         <w:t xml:space="preserve">Vintage.</w:t>
       </w:r>
       <w:r>
@@ -163,13 +1322,13 @@
           <w:b/>
           <w:bCs/>
         </w:rPr>
-        <w:t xml:space="preserve">R19 — Antarctic and Subantarctic periphery.</w:t>
-      </w:r>
-      <w:r>
-        <w:t xml:space="preserve"> </w:t>
-      </w:r>
-      <w:r>
-        <w:t xml:space="preserve">This block exists because the historical glacier target (Frederikse) assumes zero Antarctic-periphery melt, while the GlaMBIE series spliced in from 2019 onward includes it. Folding R19 into either SLOWP or FAST would leave the model's hindcast scope mismatched. Keeping it separate lets the hindcast be evaluated on SLOWP + FAST while R19 still contributes to projected totals. Its amplification prior (0.72) is also far below the other two, so it is not physically interchangeable with them either.</w:t>
+        <w:t xml:space="preserve">RGI region 19 — Antarctic and Subantarctic periphery.</w:t>
+      </w:r>
+      <w:r>
+        <w:t xml:space="preserve"> </w:t>
+      </w:r>
+      <w:r>
+        <w:t xml:space="preserve">This block exists because the historical glacier target (Frederikse) assumes zero Antarctic-periphery melt, while the GlaMBIE series spliced in from 2019 onward includes it. Folding RGI 19 into either SLOWP or FAST would leave the model's hindcast scope mismatched. Keeping it separate lets the hindcast be evaluated on SLOWP + FAST while RGI 19 still contributes to projected totals. Its amplification prior (0.72) is also far below the other two, so it is not physically interchangeable with them either.</w:t>
       </w:r>
     </w:p>
     <w:p>
@@ -382,7 +1541,7 @@
           <w:b/>
           <w:bCs/>
         </w:rPr>
-        <w:t xml:space="preserve">Table 1.</w:t>
+        <w:t xml:space="preserve">Table 2.</w:t>
       </w:r>
       <w:r>
         <w:t xml:space="preserve"> </w:t>
@@ -1363,7 +2522,7 @@
           <w:b/>
           <w:bCs/>
         </w:rPr>
-        <w:t xml:space="preserve">Table 2.</w:t>
+        <w:t xml:space="preserve">Table 3.</w:t>
       </w:r>
       <w:r>
         <w:t xml:space="preserve"> </w:t>

</xml_diff>

<commit_message>
Split the emulator attribute table into scope/calibration (Table 1) and component structure (Table 2); 'not documented'; Ladrillo's inventory shown as Farinotti on its scope
Co-Authored-By: Claude Opus 5 <noreply@anthropic.com>
</commit_message>
<xml_diff>
--- a/deliverables/LadrilloUpdateDescription_L24.docx
+++ b/deliverables/LadrilloUpdateDescription_L24.docx
@@ -50,7 +50,7 @@
         <w:t xml:space="preserve"> </w:t>
       </w:r>
       <w:r>
-        <w:t xml:space="preserve">Attributes of the seven SLEIP emulators and Ladrillo. SLEIP entries are taken from the SLEIP preprint (Tables 2 and 6 and §3); FACTS's post-2100 behaviour, and the BRICK 2.0, MAGICC and FACTS glacier inventories, are read from the model code and drawnsets in this project. "—" means the emulator lacks the component; "n.s." means not stated in SLEIP.</w:t>
+        <w:t xml:space="preserve">Scope and calibration of the seven SLEIP emulators and Ladrillo. SLEIP entries are taken from the SLEIP preprint (Tables 2 and 6 and §3); FACTS's post-2100 behaviour is read from the model code in this project.</w:t>
       </w:r>
     </w:p>
     <w:tbl>
@@ -61,15 +61,15 @@
         <w:tblLook w:firstRow="1" w:lastRow="0" w:firstColumn="0" w:lastColumn="0" w:noHBand="0" w:noVBand="0" w:val="0020"/>
       </w:tblPr>
       <w:tblGrid>
-        <w:gridCol w:w="1788"/>
-        <w:gridCol w:w="510"/>
-        <w:gridCol w:w="1149"/>
-        <w:gridCol w:w="638"/>
-        <w:gridCol w:w="766"/>
-        <w:gridCol w:w="510"/>
-        <w:gridCol w:w="766"/>
-        <w:gridCol w:w="766"/>
-        <w:gridCol w:w="1021"/>
+        <w:gridCol w:w="1687"/>
+        <w:gridCol w:w="519"/>
+        <w:gridCol w:w="1168"/>
+        <w:gridCol w:w="649"/>
+        <w:gridCol w:w="908"/>
+        <w:gridCol w:w="649"/>
+        <w:gridCol w:w="779"/>
+        <w:gridCol w:w="649"/>
+        <w:gridCol w:w="908"/>
       </w:tblGrid>
       <w:tr>
         <w:trPr>
@@ -587,95 +587,236 @@
               <w:pStyle w:val="Compact"/>
             </w:pPr>
             <w:r>
-              <w:t xml:space="preserve">Thermal expansion</w:t>
-            </w:r>
-          </w:p>
-        </w:tc>
-        <w:tc>
-          <w:tcPr/>
-          <w:p>
-            <w:pPr>
-              <w:pStyle w:val="Compact"/>
-            </w:pPr>
-            <w:r>
-              <w:t xml:space="preserve">∝ OHC</w:t>
-            </w:r>
-          </w:p>
-        </w:tc>
-        <w:tc>
-          <w:tcPr/>
-          <w:p>
-            <w:pPr>
-              <w:pStyle w:val="Compact"/>
-            </w:pPr>
-            <w:r>
-              <w:t xml:space="preserve">coefficient × OHC</w:t>
-            </w:r>
-          </w:p>
-        </w:tc>
-        <w:tc>
-          <w:tcPr/>
-          <w:p>
-            <w:pPr>
-              <w:pStyle w:val="Compact"/>
-            </w:pPr>
-            <w:r>
-              <w:t xml:space="preserve">coefficient × OHC</w:t>
-            </w:r>
-          </w:p>
-        </w:tc>
-        <w:tc>
-          <w:tcPr/>
-          <w:p>
-            <w:pPr>
-              <w:pStyle w:val="Compact"/>
-            </w:pPr>
-            <w:r>
-              <w:t xml:space="preserve">40-layer, layer-specific</w:t>
-            </w:r>
-          </w:p>
-        </w:tc>
-        <w:tc>
-          <w:tcPr/>
-          <w:p>
-            <w:pPr>
-              <w:pStyle w:val="Compact"/>
-            </w:pPr>
-            <w:r>
-              <w:t xml:space="preserve">linear in GSAT</w:t>
-            </w:r>
-          </w:p>
-        </w:tc>
-        <w:tc>
-          <w:tcPr/>
-          <w:p>
-            <w:pPr>
-              <w:pStyle w:val="Compact"/>
-            </w:pPr>
-            <w:r>
-              <w:t xml:space="preserve">coefficient × OHC</w:t>
-            </w:r>
-          </w:p>
-        </w:tc>
-        <w:tc>
-          <w:tcPr/>
-          <w:p>
-            <w:pPr>
-              <w:pStyle w:val="Compact"/>
-            </w:pPr>
-            <w:r>
-              <w:t xml:space="preserve">3-layer, layer-specific</w:t>
-            </w:r>
-          </w:p>
-        </w:tc>
-        <w:tc>
-          <w:tcPr/>
-          <w:p>
-            <w:pPr>
-              <w:pStyle w:val="Compact"/>
-            </w:pPr>
-            <w:r>
-              <w:t xml:space="preserve">∝ OHC</w:t>
+              <w:t xml:space="preserve">Regional output / relative sea level</w:t>
+            </w:r>
+          </w:p>
+        </w:tc>
+        <w:tc>
+          <w:tcPr/>
+          <w:p>
+            <w:pPr>
+              <w:pStyle w:val="Compact"/>
+            </w:pPr>
+            <w:r>
+              <w:t xml:space="preserve">yes / no</w:t>
+            </w:r>
+          </w:p>
+        </w:tc>
+        <w:tc>
+          <w:tcPr/>
+          <w:p>
+            <w:pPr>
+              <w:pStyle w:val="Compact"/>
+            </w:pPr>
+            <w:r>
+              <w:t xml:space="preserve">yes / yes</w:t>
+            </w:r>
+          </w:p>
+        </w:tc>
+        <w:tc>
+          <w:tcPr/>
+          <w:p>
+            <w:pPr>
+              <w:pStyle w:val="Compact"/>
+            </w:pPr>
+            <w:r>
+              <w:t xml:space="preserve">yes / no</w:t>
+            </w:r>
+          </w:p>
+        </w:tc>
+        <w:tc>
+          <w:tcPr/>
+          <w:p>
+            <w:pPr>
+              <w:pStyle w:val="Compact"/>
+            </w:pPr>
+            <w:r>
+              <w:t xml:space="preserve">no / no</w:t>
+            </w:r>
+          </w:p>
+        </w:tc>
+        <w:tc>
+          <w:tcPr/>
+          <w:p>
+            <w:pPr>
+              <w:pStyle w:val="Compact"/>
+            </w:pPr>
+            <w:r>
+              <w:t xml:space="preserve">yes / yes</w:t>
+            </w:r>
+          </w:p>
+        </w:tc>
+        <w:tc>
+          <w:tcPr/>
+          <w:p>
+            <w:pPr>
+              <w:pStyle w:val="Compact"/>
+            </w:pPr>
+            <w:r>
+              <w:t xml:space="preserve">yes / yes</w:t>
+            </w:r>
+          </w:p>
+        </w:tc>
+        <w:tc>
+          <w:tcPr/>
+          <w:p>
+            <w:pPr>
+              <w:pStyle w:val="Compact"/>
+            </w:pPr>
+            <w:r>
+              <w:t xml:space="preserve">no / no</w:t>
+            </w:r>
+          </w:p>
+        </w:tc>
+        <w:tc>
+          <w:tcPr/>
+          <w:p>
+            <w:pPr>
+              <w:pStyle w:val="Compact"/>
+            </w:pPr>
+            <w:r>
+              <w:t xml:space="preserve">no / no</w:t>
+            </w:r>
+          </w:p>
+        </w:tc>
+      </w:tr>
+    </w:tbl>
+    <w:p>
+      <w:pPr>
+        <w:pStyle w:val="BodyText"/>
+      </w:pPr>
+      <w:r>
+        <w:rPr>
+          <w:b/>
+          <w:bCs/>
+        </w:rPr>
+        <w:t xml:space="preserve">Table 2.</w:t>
+      </w:r>
+      <w:r>
+        <w:t xml:space="preserve"> </w:t>
+      </w:r>
+      <w:r>
+        <w:t xml:space="preserve">Component structure of the same eight emulators. Glacier inventories for BRICK 2.0, MAGICC and FACTS are read from their parameter files and code in this project; "not documented" means the SLEIP preprint does not state it. Farinotti 2019 gives 32.4 ± 8.4 cm SLE for all RGI regions.</w:t>
+      </w:r>
+    </w:p>
+    <w:tbl>
+      <w:tblPr>
+        <w:tblStyle w:val="Table"/>
+        <w:tblW w:type="pct" w:w="5000"/>
+        <w:tblLayout w:type="fixed"/>
+        <w:tblLook w:firstRow="1" w:lastRow="0" w:firstColumn="0" w:lastColumn="0" w:noHBand="0" w:noVBand="0" w:val="0020"/>
+      </w:tblPr>
+      <w:tblGrid>
+        <w:gridCol w:w="1428"/>
+        <w:gridCol w:w="649"/>
+        <w:gridCol w:w="908"/>
+        <w:gridCol w:w="649"/>
+        <w:gridCol w:w="779"/>
+        <w:gridCol w:w="519"/>
+        <w:gridCol w:w="649"/>
+        <w:gridCol w:w="779"/>
+        <w:gridCol w:w="1558"/>
+      </w:tblGrid>
+      <w:tr>
+        <w:trPr>
+          <w:tblHeader w:val="on"/>
+        </w:trPr>
+        <w:tc>
+          <w:tcPr/>
+          <w:p>
+            <w:pPr>
+              <w:pStyle w:val="Compact"/>
+            </w:pPr>
+            <w:r>
+              <w:t xml:space="preserve">attribute</w:t>
+            </w:r>
+          </w:p>
+        </w:tc>
+        <w:tc>
+          <w:tcPr/>
+          <w:p>
+            <w:pPr>
+              <w:pStyle w:val="Compact"/>
+            </w:pPr>
+            <w:r>
+              <w:t xml:space="preserve">BRICK 2.0</w:t>
+            </w:r>
+          </w:p>
+        </w:tc>
+        <w:tc>
+          <w:tcPr/>
+          <w:p>
+            <w:pPr>
+              <w:pStyle w:val="Compact"/>
+            </w:pPr>
+            <w:r>
+              <w:t xml:space="preserve">FACTS</w:t>
+            </w:r>
+          </w:p>
+        </w:tc>
+        <w:tc>
+          <w:tcPr/>
+          <w:p>
+            <w:pPr>
+              <w:pStyle w:val="Compact"/>
+            </w:pPr>
+            <w:r>
+              <w:t xml:space="preserve">FRISIA</w:t>
+            </w:r>
+          </w:p>
+        </w:tc>
+        <w:tc>
+          <w:tcPr/>
+          <w:p>
+            <w:pPr>
+              <w:pStyle w:val="Compact"/>
+            </w:pPr>
+            <w:r>
+              <w:t xml:space="preserve">MAGICC-SLR</w:t>
+            </w:r>
+          </w:p>
+        </w:tc>
+        <w:tc>
+          <w:tcPr/>
+          <w:p>
+            <w:pPr>
+              <w:pStyle w:val="Compact"/>
+            </w:pPr>
+            <w:r>
+              <w:t xml:space="preserve">MP25</w:t>
+            </w:r>
+          </w:p>
+        </w:tc>
+        <w:tc>
+          <w:tcPr/>
+          <w:p>
+            <w:pPr>
+              <w:pStyle w:val="Compact"/>
+            </w:pPr>
+            <w:r>
+              <w:t xml:space="preserve">ProFSea</w:t>
+            </w:r>
+          </w:p>
+        </w:tc>
+        <w:tc>
+          <w:tcPr/>
+          <w:p>
+            <w:pPr>
+              <w:pStyle w:val="Compact"/>
+            </w:pPr>
+            <w:r>
+              <w:t xml:space="preserve">SURFER</w:t>
+            </w:r>
+          </w:p>
+        </w:tc>
+        <w:tc>
+          <w:tcPr/>
+          <w:p>
+            <w:pPr>
+              <w:pStyle w:val="Compact"/>
+            </w:pPr>
+            <w:r>
+              <w:t xml:space="preserve">Ladrillo</w:t>
             </w:r>
           </w:p>
         </w:tc>
@@ -688,95 +829,95 @@
               <w:pStyle w:val="Compact"/>
             </w:pPr>
             <w:r>
-              <w:t xml:space="preserve">Glacier inventory vs Farinotti 2019 (32.4 ± 8.4 cm full RGI)</w:t>
-            </w:r>
-          </w:p>
-        </w:tc>
-        <w:tc>
-          <w:tcPr/>
-          <w:p>
-            <w:pPr>
-              <w:pStyle w:val="Compact"/>
-            </w:pPr>
-            <w:r>
-              <w:t xml:space="preserve">42 cm (Wigley–Raper 41)</w:t>
-            </w:r>
-          </w:p>
-        </w:tc>
-        <w:tc>
-          <w:tcPr/>
-          <w:p>
-            <w:pPr>
-              <w:pStyle w:val="Compact"/>
-            </w:pPr>
-            <w:r>
-              <w:t xml:space="preserve">31.6 cm cap (AR5 Table 4.2)</w:t>
-            </w:r>
-          </w:p>
-        </w:tc>
-        <w:tc>
-          <w:tcPr/>
-          <w:p>
-            <w:pPr>
-              <w:pStyle w:val="Compact"/>
-            </w:pPr>
-            <w:r>
-              <w:t xml:space="preserve">n.s.</w:t>
-            </w:r>
-          </w:p>
-        </w:tc>
-        <w:tc>
-          <w:tcPr/>
-          <w:p>
-            <w:pPr>
-              <w:pStyle w:val="Compact"/>
-            </w:pPr>
-            <w:r>
-              <w:t xml:space="preserve">35.6–45.1 cm across tunes</w:t>
-            </w:r>
-          </w:p>
-        </w:tc>
-        <w:tc>
-          <w:tcPr/>
-          <w:p>
-            <w:pPr>
-              <w:pStyle w:val="Compact"/>
-            </w:pPr>
-            <w:r>
-              <w:t xml:space="preserve">n.s.</w:t>
-            </w:r>
-          </w:p>
-        </w:tc>
-        <w:tc>
-          <w:tcPr/>
-          <w:p>
-            <w:pPr>
-              <w:pStyle w:val="Compact"/>
-            </w:pPr>
-            <w:r>
-              <w:t xml:space="preserve">n.s. (AR5 form)</w:t>
-            </w:r>
-          </w:p>
-        </w:tc>
-        <w:tc>
-          <w:tcPr/>
-          <w:p>
-            <w:pPr>
-              <w:pStyle w:val="Compact"/>
-            </w:pPr>
-            <w:r>
-              <w:t xml:space="preserve">50 cm</w:t>
-            </w:r>
-          </w:p>
-        </w:tc>
-        <w:tc>
-          <w:tcPr/>
-          <w:p>
-            <w:pPr>
-              <w:pStyle w:val="Compact"/>
-            </w:pPr>
-            <w:r>
-              <w:t xml:space="preserve">29.0 ± 6.0 cm on target scope</w:t>
+              <w:t xml:space="preserve">Thermal expansion</w:t>
+            </w:r>
+          </w:p>
+        </w:tc>
+        <w:tc>
+          <w:tcPr/>
+          <w:p>
+            <w:pPr>
+              <w:pStyle w:val="Compact"/>
+            </w:pPr>
+            <w:r>
+              <w:t xml:space="preserve">∝ OHC</w:t>
+            </w:r>
+          </w:p>
+        </w:tc>
+        <w:tc>
+          <w:tcPr/>
+          <w:p>
+            <w:pPr>
+              <w:pStyle w:val="Compact"/>
+            </w:pPr>
+            <w:r>
+              <w:t xml:space="preserve">coefficient × OHC</w:t>
+            </w:r>
+          </w:p>
+        </w:tc>
+        <w:tc>
+          <w:tcPr/>
+          <w:p>
+            <w:pPr>
+              <w:pStyle w:val="Compact"/>
+            </w:pPr>
+            <w:r>
+              <w:t xml:space="preserve">coefficient × OHC</w:t>
+            </w:r>
+          </w:p>
+        </w:tc>
+        <w:tc>
+          <w:tcPr/>
+          <w:p>
+            <w:pPr>
+              <w:pStyle w:val="Compact"/>
+            </w:pPr>
+            <w:r>
+              <w:t xml:space="preserve">40-layer, layer-specific</w:t>
+            </w:r>
+          </w:p>
+        </w:tc>
+        <w:tc>
+          <w:tcPr/>
+          <w:p>
+            <w:pPr>
+              <w:pStyle w:val="Compact"/>
+            </w:pPr>
+            <w:r>
+              <w:t xml:space="preserve">linear in GSAT</w:t>
+            </w:r>
+          </w:p>
+        </w:tc>
+        <w:tc>
+          <w:tcPr/>
+          <w:p>
+            <w:pPr>
+              <w:pStyle w:val="Compact"/>
+            </w:pPr>
+            <w:r>
+              <w:t xml:space="preserve">coefficient × OHC</w:t>
+            </w:r>
+          </w:p>
+        </w:tc>
+        <w:tc>
+          <w:tcPr/>
+          <w:p>
+            <w:pPr>
+              <w:pStyle w:val="Compact"/>
+            </w:pPr>
+            <w:r>
+              <w:t xml:space="preserve">3-layer, layer-specific</w:t>
+            </w:r>
+          </w:p>
+        </w:tc>
+        <w:tc>
+          <w:tcPr/>
+          <w:p>
+            <w:pPr>
+              <w:pStyle w:val="Compact"/>
+            </w:pPr>
+            <w:r>
+              <w:t xml:space="preserve">∝ OHC</w:t>
             </w:r>
           </w:p>
         </w:tc>
@@ -789,95 +930,95 @@
               <w:pStyle w:val="Compact"/>
             </w:pPr>
             <w:r>
-              <w:t xml:space="preserve">Glaciers can regrow under cooling</w:t>
-            </w:r>
-          </w:p>
-        </w:tc>
-        <w:tc>
-          <w:tcPr/>
-          <w:p>
-            <w:pPr>
-              <w:pStyle w:val="Compact"/>
-            </w:pPr>
-            <w:r>
-              <w:t xml:space="preserve">no</w:t>
-            </w:r>
-          </w:p>
-        </w:tc>
-        <w:tc>
-          <w:tcPr/>
-          <w:p>
-            <w:pPr>
-              <w:pStyle w:val="Compact"/>
-            </w:pPr>
-            <w:r>
-              <w:t xml:space="preserve">no</w:t>
-            </w:r>
-          </w:p>
-        </w:tc>
-        <w:tc>
-          <w:tcPr/>
-          <w:p>
-            <w:pPr>
-              <w:pStyle w:val="Compact"/>
-            </w:pPr>
-            <w:r>
-              <w:t xml:space="preserve">no</w:t>
-            </w:r>
-          </w:p>
-        </w:tc>
-        <w:tc>
-          <w:tcPr/>
-          <w:p>
-            <w:pPr>
-              <w:pStyle w:val="Compact"/>
-            </w:pPr>
-            <w:r>
-              <w:t xml:space="preserve">yes</w:t>
-            </w:r>
-          </w:p>
-        </w:tc>
-        <w:tc>
-          <w:tcPr/>
-          <w:p>
-            <w:pPr>
-              <w:pStyle w:val="Compact"/>
-            </w:pPr>
-            <w:r>
-              <w:t xml:space="preserve">n.s.</w:t>
-            </w:r>
-          </w:p>
-        </w:tc>
-        <w:tc>
-          <w:tcPr/>
-          <w:p>
-            <w:pPr>
-              <w:pStyle w:val="Compact"/>
-            </w:pPr>
-            <w:r>
-              <w:t xml:space="preserve">no</w:t>
-            </w:r>
-          </w:p>
-        </w:tc>
-        <w:tc>
-          <w:tcPr/>
-          <w:p>
-            <w:pPr>
-              <w:pStyle w:val="Compact"/>
-            </w:pPr>
-            <w:r>
-              <w:t xml:space="preserve">yes</w:t>
-            </w:r>
-          </w:p>
-        </w:tc>
-        <w:tc>
-          <w:tcPr/>
-          <w:p>
-            <w:pPr>
-              <w:pStyle w:val="Compact"/>
-            </w:pPr>
-            <w:r>
-              <w:t xml:space="preserve">yes</w:t>
+              <w:t xml:space="preserve">Glacier inventory (cm SLE)</w:t>
+            </w:r>
+          </w:p>
+        </w:tc>
+        <w:tc>
+          <w:tcPr/>
+          <w:p>
+            <w:pPr>
+              <w:pStyle w:val="Compact"/>
+            </w:pPr>
+            <w:r>
+              <w:t xml:space="preserve">42 (Wigley–Raper 41)</w:t>
+            </w:r>
+          </w:p>
+        </w:tc>
+        <w:tc>
+          <w:tcPr/>
+          <w:p>
+            <w:pPr>
+              <w:pStyle w:val="Compact"/>
+            </w:pPr>
+            <w:r>
+              <w:t xml:space="preserve">31.6 cap (AR5 Table 4.2)</w:t>
+            </w:r>
+          </w:p>
+        </w:tc>
+        <w:tc>
+          <w:tcPr/>
+          <w:p>
+            <w:pPr>
+              <w:pStyle w:val="Compact"/>
+            </w:pPr>
+            <w:r>
+              <w:t xml:space="preserve">not documented</w:t>
+            </w:r>
+          </w:p>
+        </w:tc>
+        <w:tc>
+          <w:tcPr/>
+          <w:p>
+            <w:pPr>
+              <w:pStyle w:val="Compact"/>
+            </w:pPr>
+            <w:r>
+              <w:t xml:space="preserve">35.6–45.1 across tunes</w:t>
+            </w:r>
+          </w:p>
+        </w:tc>
+        <w:tc>
+          <w:tcPr/>
+          <w:p>
+            <w:pPr>
+              <w:pStyle w:val="Compact"/>
+            </w:pPr>
+            <w:r>
+              <w:t xml:space="preserve">not documented</w:t>
+            </w:r>
+          </w:p>
+        </w:tc>
+        <w:tc>
+          <w:tcPr/>
+          <w:p>
+            <w:pPr>
+              <w:pStyle w:val="Compact"/>
+            </w:pPr>
+            <w:r>
+              <w:t xml:space="preserve">not documented (AR5 form)</w:t>
+            </w:r>
+          </w:p>
+        </w:tc>
+        <w:tc>
+          <w:tcPr/>
+          <w:p>
+            <w:pPr>
+              <w:pStyle w:val="Compact"/>
+            </w:pPr>
+            <w:r>
+              <w:t xml:space="preserve">50</w:t>
+            </w:r>
+          </w:p>
+        </w:tc>
+        <w:tc>
+          <w:tcPr/>
+          <w:p>
+            <w:pPr>
+              <w:pStyle w:val="Compact"/>
+            </w:pPr>
+            <w:r>
+              <w:t xml:space="preserve">29.0 ± 6.0 = Farinotti on Ladrillo's scope, which excludes RGI 05 (3.4)</w:t>
             </w:r>
           </w:p>
         </w:tc>
@@ -890,7 +1031,7 @@
               <w:pStyle w:val="Compact"/>
             </w:pPr>
             <w:r>
-              <w:t xml:space="preserve">Greenland SMB / discharge split</w:t>
+              <w:t xml:space="preserve">Glaciers can regrow under cooling</w:t>
             </w:r>
           </w:p>
         </w:tc>
@@ -923,6 +1064,17 @@
               <w:pStyle w:val="Compact"/>
             </w:pPr>
             <w:r>
+              <w:t xml:space="preserve">no</w:t>
+            </w:r>
+          </w:p>
+        </w:tc>
+        <w:tc>
+          <w:tcPr/>
+          <w:p>
+            <w:pPr>
+              <w:pStyle w:val="Compact"/>
+            </w:pPr>
+            <w:r>
               <w:t xml:space="preserve">yes</w:t>
             </w:r>
           </w:p>
@@ -934,6 +1086,28 @@
               <w:pStyle w:val="Compact"/>
             </w:pPr>
             <w:r>
+              <w:t xml:space="preserve">not documented</w:t>
+            </w:r>
+          </w:p>
+        </w:tc>
+        <w:tc>
+          <w:tcPr/>
+          <w:p>
+            <w:pPr>
+              <w:pStyle w:val="Compact"/>
+            </w:pPr>
+            <w:r>
+              <w:t xml:space="preserve">no</w:t>
+            </w:r>
+          </w:p>
+        </w:tc>
+        <w:tc>
+          <w:tcPr/>
+          <w:p>
+            <w:pPr>
+              <w:pStyle w:val="Compact"/>
+            </w:pPr>
+            <w:r>
               <w:t xml:space="preserve">yes</w:t>
             </w:r>
           </w:p>
@@ -945,40 +1119,7 @@
               <w:pStyle w:val="Compact"/>
             </w:pPr>
             <w:r>
-              <w:t xml:space="preserve">no</w:t>
-            </w:r>
-          </w:p>
-        </w:tc>
-        <w:tc>
-          <w:tcPr/>
-          <w:p>
-            <w:pPr>
-              <w:pStyle w:val="Compact"/>
-            </w:pPr>
-            <w:r>
-              <w:t xml:space="preserve">no</w:t>
-            </w:r>
-          </w:p>
-        </w:tc>
-        <w:tc>
-          <w:tcPr/>
-          <w:p>
-            <w:pPr>
-              <w:pStyle w:val="Compact"/>
-            </w:pPr>
-            <w:r>
-              <w:t xml:space="preserve">no</w:t>
-            </w:r>
-          </w:p>
-        </w:tc>
-        <w:tc>
-          <w:tcPr/>
-          <w:p>
-            <w:pPr>
-              <w:pStyle w:val="Compact"/>
-            </w:pPr>
-            <w:r>
-              <w:t xml:space="preserve">yes (two channels, two basins)</w:t>
+              <w:t xml:space="preserve">yes</w:t>
             </w:r>
           </w:p>
         </w:tc>
@@ -991,95 +1132,95 @@
               <w:pStyle w:val="Compact"/>
             </w:pPr>
             <w:r>
-              <w:t xml:space="preserve">Antarctic ice sheet (SLEIP type)</w:t>
-            </w:r>
-          </w:p>
-        </w:tc>
-        <w:tc>
-          <w:tcPr/>
-          <w:p>
-            <w:pPr>
-              <w:pStyle w:val="Compact"/>
-            </w:pPr>
-            <w:r>
-              <w:t xml:space="preserve">physical model (DAIS)</w:t>
-            </w:r>
-          </w:p>
-        </w:tc>
-        <w:tc>
-          <w:tcPr/>
-          <w:p>
-            <w:pPr>
-              <w:pStyle w:val="Compact"/>
-            </w:pPr>
-            <w:r>
-              <w:t xml:space="preserve">statistical / parametric / SEJ by workflow</w:t>
-            </w:r>
-          </w:p>
-        </w:tc>
-        <w:tc>
-          <w:tcPr/>
-          <w:p>
-            <w:pPr>
-              <w:pStyle w:val="Compact"/>
-            </w:pPr>
-            <w:r>
-              <w:t xml:space="preserve">physical model (DAIS)</w:t>
-            </w:r>
-          </w:p>
-        </w:tc>
-        <w:tc>
-          <w:tcPr/>
-          <w:p>
-            <w:pPr>
-              <w:pStyle w:val="Compact"/>
-            </w:pPr>
-            <w:r>
-              <w:t xml:space="preserve">parametric</w:t>
-            </w:r>
-          </w:p>
-        </w:tc>
-        <w:tc>
-          <w:tcPr/>
-          <w:p>
-            <w:pPr>
-              <w:pStyle w:val="Compact"/>
-            </w:pPr>
-            <w:r>
-              <w:t xml:space="preserve">parametric</w:t>
-            </w:r>
-          </w:p>
-        </w:tc>
-        <w:tc>
-          <w:tcPr/>
-          <w:p>
-            <w:pPr>
-              <w:pStyle w:val="Compact"/>
-            </w:pPr>
-            <w:r>
-              <w:t xml:space="preserve">statistical fit</w:t>
-            </w:r>
-          </w:p>
-        </w:tc>
-        <w:tc>
-          <w:tcPr/>
-          <w:p>
-            <w:pPr>
-              <w:pStyle w:val="Compact"/>
-            </w:pPr>
-            <w:r>
-              <w:t xml:space="preserve">physical model (ODE tipping element)</w:t>
-            </w:r>
-          </w:p>
-        </w:tc>
-        <w:tc>
-          <w:tcPr/>
-          <w:p>
-            <w:pPr>
-              <w:pStyle w:val="Compact"/>
-            </w:pPr>
-            <w:r>
-              <w:t xml:space="preserve">physical model (DAIS, recalibrated)</w:t>
+              <w:t xml:space="preserve">Greenland SMB / discharge split</w:t>
+            </w:r>
+          </w:p>
+        </w:tc>
+        <w:tc>
+          <w:tcPr/>
+          <w:p>
+            <w:pPr>
+              <w:pStyle w:val="Compact"/>
+            </w:pPr>
+            <w:r>
+              <w:t xml:space="preserve">no</w:t>
+            </w:r>
+          </w:p>
+        </w:tc>
+        <w:tc>
+          <w:tcPr/>
+          <w:p>
+            <w:pPr>
+              <w:pStyle w:val="Compact"/>
+            </w:pPr>
+            <w:r>
+              <w:t xml:space="preserve">no</w:t>
+            </w:r>
+          </w:p>
+        </w:tc>
+        <w:tc>
+          <w:tcPr/>
+          <w:p>
+            <w:pPr>
+              <w:pStyle w:val="Compact"/>
+            </w:pPr>
+            <w:r>
+              <w:t xml:space="preserve">yes</w:t>
+            </w:r>
+          </w:p>
+        </w:tc>
+        <w:tc>
+          <w:tcPr/>
+          <w:p>
+            <w:pPr>
+              <w:pStyle w:val="Compact"/>
+            </w:pPr>
+            <w:r>
+              <w:t xml:space="preserve">yes</w:t>
+            </w:r>
+          </w:p>
+        </w:tc>
+        <w:tc>
+          <w:tcPr/>
+          <w:p>
+            <w:pPr>
+              <w:pStyle w:val="Compact"/>
+            </w:pPr>
+            <w:r>
+              <w:t xml:space="preserve">no</w:t>
+            </w:r>
+          </w:p>
+        </w:tc>
+        <w:tc>
+          <w:tcPr/>
+          <w:p>
+            <w:pPr>
+              <w:pStyle w:val="Compact"/>
+            </w:pPr>
+            <w:r>
+              <w:t xml:space="preserve">no</w:t>
+            </w:r>
+          </w:p>
+        </w:tc>
+        <w:tc>
+          <w:tcPr/>
+          <w:p>
+            <w:pPr>
+              <w:pStyle w:val="Compact"/>
+            </w:pPr>
+            <w:r>
+              <w:t xml:space="preserve">no</w:t>
+            </w:r>
+          </w:p>
+        </w:tc>
+        <w:tc>
+          <w:tcPr/>
+          <w:p>
+            <w:pPr>
+              <w:pStyle w:val="Compact"/>
+            </w:pPr>
+            <w:r>
+              <w:t xml:space="preserve">yes (two channels, two basins)</w:t>
             </w:r>
           </w:p>
         </w:tc>
@@ -1092,95 +1233,95 @@
               <w:pStyle w:val="Compact"/>
             </w:pPr>
             <w:r>
-              <w:t xml:space="preserve">Regional output / relative sea level</w:t>
-            </w:r>
-          </w:p>
-        </w:tc>
-        <w:tc>
-          <w:tcPr/>
-          <w:p>
-            <w:pPr>
-              <w:pStyle w:val="Compact"/>
-            </w:pPr>
-            <w:r>
-              <w:t xml:space="preserve">yes / no</w:t>
-            </w:r>
-          </w:p>
-        </w:tc>
-        <w:tc>
-          <w:tcPr/>
-          <w:p>
-            <w:pPr>
-              <w:pStyle w:val="Compact"/>
-            </w:pPr>
-            <w:r>
-              <w:t xml:space="preserve">yes / yes</w:t>
-            </w:r>
-          </w:p>
-        </w:tc>
-        <w:tc>
-          <w:tcPr/>
-          <w:p>
-            <w:pPr>
-              <w:pStyle w:val="Compact"/>
-            </w:pPr>
-            <w:r>
-              <w:t xml:space="preserve">yes / no</w:t>
-            </w:r>
-          </w:p>
-        </w:tc>
-        <w:tc>
-          <w:tcPr/>
-          <w:p>
-            <w:pPr>
-              <w:pStyle w:val="Compact"/>
-            </w:pPr>
-            <w:r>
-              <w:t xml:space="preserve">no / no</w:t>
-            </w:r>
-          </w:p>
-        </w:tc>
-        <w:tc>
-          <w:tcPr/>
-          <w:p>
-            <w:pPr>
-              <w:pStyle w:val="Compact"/>
-            </w:pPr>
-            <w:r>
-              <w:t xml:space="preserve">yes / yes</w:t>
-            </w:r>
-          </w:p>
-        </w:tc>
-        <w:tc>
-          <w:tcPr/>
-          <w:p>
-            <w:pPr>
-              <w:pStyle w:val="Compact"/>
-            </w:pPr>
-            <w:r>
-              <w:t xml:space="preserve">yes / yes</w:t>
-            </w:r>
-          </w:p>
-        </w:tc>
-        <w:tc>
-          <w:tcPr/>
-          <w:p>
-            <w:pPr>
-              <w:pStyle w:val="Compact"/>
-            </w:pPr>
-            <w:r>
-              <w:t xml:space="preserve">no / no</w:t>
-            </w:r>
-          </w:p>
-        </w:tc>
-        <w:tc>
-          <w:tcPr/>
-          <w:p>
-            <w:pPr>
-              <w:pStyle w:val="Compact"/>
-            </w:pPr>
-            <w:r>
-              <w:t xml:space="preserve">no / no</w:t>
+              <w:t xml:space="preserve">Antarctic ice sheet (SLEIP type)</w:t>
+            </w:r>
+          </w:p>
+        </w:tc>
+        <w:tc>
+          <w:tcPr/>
+          <w:p>
+            <w:pPr>
+              <w:pStyle w:val="Compact"/>
+            </w:pPr>
+            <w:r>
+              <w:t xml:space="preserve">physical model (DAIS)</w:t>
+            </w:r>
+          </w:p>
+        </w:tc>
+        <w:tc>
+          <w:tcPr/>
+          <w:p>
+            <w:pPr>
+              <w:pStyle w:val="Compact"/>
+            </w:pPr>
+            <w:r>
+              <w:t xml:space="preserve">statistical / parametric / SEJ by workflow</w:t>
+            </w:r>
+          </w:p>
+        </w:tc>
+        <w:tc>
+          <w:tcPr/>
+          <w:p>
+            <w:pPr>
+              <w:pStyle w:val="Compact"/>
+            </w:pPr>
+            <w:r>
+              <w:t xml:space="preserve">physical model (DAIS)</w:t>
+            </w:r>
+          </w:p>
+        </w:tc>
+        <w:tc>
+          <w:tcPr/>
+          <w:p>
+            <w:pPr>
+              <w:pStyle w:val="Compact"/>
+            </w:pPr>
+            <w:r>
+              <w:t xml:space="preserve">parametric</w:t>
+            </w:r>
+          </w:p>
+        </w:tc>
+        <w:tc>
+          <w:tcPr/>
+          <w:p>
+            <w:pPr>
+              <w:pStyle w:val="Compact"/>
+            </w:pPr>
+            <w:r>
+              <w:t xml:space="preserve">parametric</w:t>
+            </w:r>
+          </w:p>
+        </w:tc>
+        <w:tc>
+          <w:tcPr/>
+          <w:p>
+            <w:pPr>
+              <w:pStyle w:val="Compact"/>
+            </w:pPr>
+            <w:r>
+              <w:t xml:space="preserve">statistical fit</w:t>
+            </w:r>
+          </w:p>
+        </w:tc>
+        <w:tc>
+          <w:tcPr/>
+          <w:p>
+            <w:pPr>
+              <w:pStyle w:val="Compact"/>
+            </w:pPr>
+            <w:r>
+              <w:t xml:space="preserve">physical model (ODE tipping element)</w:t>
+            </w:r>
+          </w:p>
+        </w:tc>
+        <w:tc>
+          <w:tcPr/>
+          <w:p>
+            <w:pPr>
+              <w:pStyle w:val="Compact"/>
+            </w:pPr>
+            <w:r>
+              <w:t xml:space="preserve">physical model (DAIS, recalibrated)</w:t>
             </w:r>
           </w:p>
         </w:tc>
@@ -1541,7 +1682,7 @@
           <w:b/>
           <w:bCs/>
         </w:rPr>
-        <w:t xml:space="preserve">Table 2.</w:t>
+        <w:t xml:space="preserve">Table 3.</w:t>
       </w:r>
       <w:r>
         <w:t xml:space="preserve"> </w:t>
@@ -2522,7 +2663,7 @@
           <w:b/>
           <w:bCs/>
         </w:rPr>
-        <w:t xml:space="preserve">Table 3.</w:t>
+        <w:t xml:space="preserve">Table 4.</w:t>
       </w:r>
       <w:r>
         <w:t xml:space="preserve"> </w:t>

</xml_diff>

<commit_message>
Tables 1-2: terse cells with numbered footnotes, n.d., 8 pt via a python-docx post-pass in the build
Co-Authored-By: Claude Opus 5 <noreply@anthropic.com>
</commit_message>
<xml_diff>
--- a/deliverables/LadrilloUpdateDescription_L24.docx
+++ b/deliverables/LadrilloUpdateDescription_L24.docx
@@ -50,7 +50,7 @@
         <w:t xml:space="preserve"> </w:t>
       </w:r>
       <w:r>
-        <w:t xml:space="preserve">Scope and calibration of the seven SLEIP emulators and Ladrillo. SLEIP entries are taken from the SLEIP preprint (Tables 2 and 6 and §3); FACTS's post-2100 behaviour is read from the model code in this project.</w:t>
+        <w:t xml:space="preserve">Scope and calibration of the seven SLEIP emulators and Ladrillo. SLEIP entries from the SLEIP preprint (Tables 2 and 6, §3); FACTS's post-2100 behaviour read from its code. n.d. = not documented in SLEIP.</w:t>
       </w:r>
     </w:p>
     <w:tbl>
@@ -61,15 +61,15 @@
         <w:tblLook w:firstRow="1" w:lastRow="0" w:firstColumn="0" w:lastColumn="0" w:noHBand="0" w:noVBand="0" w:val="0020"/>
       </w:tblPr>
       <w:tblGrid>
-        <w:gridCol w:w="1687"/>
-        <w:gridCol w:w="519"/>
-        <w:gridCol w:w="1168"/>
-        <w:gridCol w:w="649"/>
-        <w:gridCol w:w="908"/>
-        <w:gridCol w:w="649"/>
-        <w:gridCol w:w="779"/>
-        <w:gridCol w:w="649"/>
-        <w:gridCol w:w="908"/>
+        <w:gridCol w:w="2640"/>
+        <w:gridCol w:w="660"/>
+        <w:gridCol w:w="792"/>
+        <w:gridCol w:w="660"/>
+        <w:gridCol w:w="528"/>
+        <w:gridCol w:w="792"/>
+        <w:gridCol w:w="660"/>
+        <w:gridCol w:w="528"/>
+        <w:gridCol w:w="660"/>
       </w:tblGrid>
       <w:tr>
         <w:trPr>
@@ -82,6 +82,9 @@
               <w:pStyle w:val="Compact"/>
             </w:pPr>
             <w:r>
+              <w:rPr>
+                <w:sz w:val="16"/>
+              </w:rPr>
               <w:t xml:space="preserve">attribute</w:t>
             </w:r>
           </w:p>
@@ -93,6 +96,9 @@
               <w:pStyle w:val="Compact"/>
             </w:pPr>
             <w:r>
+              <w:rPr>
+                <w:sz w:val="16"/>
+              </w:rPr>
               <w:t xml:space="preserve">BRICK 2.0</w:t>
             </w:r>
           </w:p>
@@ -104,6 +110,9 @@
               <w:pStyle w:val="Compact"/>
             </w:pPr>
             <w:r>
+              <w:rPr>
+                <w:sz w:val="16"/>
+              </w:rPr>
               <w:t xml:space="preserve">FACTS</w:t>
             </w:r>
           </w:p>
@@ -115,6 +124,9 @@
               <w:pStyle w:val="Compact"/>
             </w:pPr>
             <w:r>
+              <w:rPr>
+                <w:sz w:val="16"/>
+              </w:rPr>
               <w:t xml:space="preserve">FRISIA</w:t>
             </w:r>
           </w:p>
@@ -126,6 +138,9 @@
               <w:pStyle w:val="Compact"/>
             </w:pPr>
             <w:r>
+              <w:rPr>
+                <w:sz w:val="16"/>
+              </w:rPr>
               <w:t xml:space="preserve">MAGICC-SLR</w:t>
             </w:r>
           </w:p>
@@ -137,6 +152,9 @@
               <w:pStyle w:val="Compact"/>
             </w:pPr>
             <w:r>
+              <w:rPr>
+                <w:sz w:val="16"/>
+              </w:rPr>
               <w:t xml:space="preserve">MP25</w:t>
             </w:r>
           </w:p>
@@ -148,6 +166,9 @@
               <w:pStyle w:val="Compact"/>
             </w:pPr>
             <w:r>
+              <w:rPr>
+                <w:sz w:val="16"/>
+              </w:rPr>
               <w:t xml:space="preserve">ProFSea</w:t>
             </w:r>
           </w:p>
@@ -159,6 +180,9 @@
               <w:pStyle w:val="Compact"/>
             </w:pPr>
             <w:r>
+              <w:rPr>
+                <w:sz w:val="16"/>
+              </w:rPr>
               <w:t xml:space="preserve">SURFER</w:t>
             </w:r>
           </w:p>
@@ -170,6 +194,9 @@
               <w:pStyle w:val="Compact"/>
             </w:pPr>
             <w:r>
+              <w:rPr>
+                <w:sz w:val="16"/>
+              </w:rPr>
               <w:t xml:space="preserve">Ladrillo</w:t>
             </w:r>
           </w:p>
@@ -183,17 +210,23 @@
               <w:pStyle w:val="Compact"/>
             </w:pPr>
             <w:r>
-              <w:t xml:space="preserve">Hindcast of every component (start year)</w:t>
-            </w:r>
-          </w:p>
-        </w:tc>
-        <w:tc>
-          <w:tcPr/>
-          <w:p>
-            <w:pPr>
-              <w:pStyle w:val="Compact"/>
-            </w:pPr>
-            <w:r>
+              <w:rPr>
+                <w:sz w:val="16"/>
+              </w:rPr>
+              <w:t xml:space="preserve">Hindcast, all components</w:t>
+            </w:r>
+          </w:p>
+        </w:tc>
+        <w:tc>
+          <w:tcPr/>
+          <w:p>
+            <w:pPr>
+              <w:pStyle w:val="Compact"/>
+            </w:pPr>
+            <w:r>
+              <w:rPr>
+                <w:sz w:val="16"/>
+              </w:rPr>
               <w:t xml:space="preserve">yes (1850)</w:t>
             </w:r>
           </w:p>
@@ -205,6 +238,9 @@
               <w:pStyle w:val="Compact"/>
             </w:pPr>
             <w:r>
+              <w:rPr>
+                <w:sz w:val="16"/>
+              </w:rPr>
               <w:t xml:space="preserve">no (2005)</w:t>
             </w:r>
           </w:p>
@@ -216,28 +252,37 @@
               <w:pStyle w:val="Compact"/>
             </w:pPr>
             <w:r>
-              <w:t xml:space="preserve">partial (GIS 1990, AIS 2002)</w:t>
-            </w:r>
-          </w:p>
-        </w:tc>
-        <w:tc>
-          <w:tcPr/>
-          <w:p>
-            <w:pPr>
-              <w:pStyle w:val="Compact"/>
-            </w:pPr>
-            <w:r>
-              <w:t xml:space="preserve">partial (GIS 1990, AIS 2002)</w:t>
-            </w:r>
-          </w:p>
-        </w:tc>
-        <w:tc>
-          <w:tcPr/>
-          <w:p>
-            <w:pPr>
-              <w:pStyle w:val="Compact"/>
-            </w:pPr>
-            <w:r>
+              <w:rPr>
+                <w:sz w:val="16"/>
+              </w:rPr>
+              <w:t xml:space="preserve">partial¹</w:t>
+            </w:r>
+          </w:p>
+        </w:tc>
+        <w:tc>
+          <w:tcPr/>
+          <w:p>
+            <w:pPr>
+              <w:pStyle w:val="Compact"/>
+            </w:pPr>
+            <w:r>
+              <w:rPr>
+                <w:sz w:val="16"/>
+              </w:rPr>
+              <w:t xml:space="preserve">partial¹</w:t>
+            </w:r>
+          </w:p>
+        </w:tc>
+        <w:tc>
+          <w:tcPr/>
+          <w:p>
+            <w:pPr>
+              <w:pStyle w:val="Compact"/>
+            </w:pPr>
+            <w:r>
+              <w:rPr>
+                <w:sz w:val="16"/>
+              </w:rPr>
               <w:t xml:space="preserve">yes (1900)</w:t>
             </w:r>
           </w:p>
@@ -249,6 +294,9 @@
               <w:pStyle w:val="Compact"/>
             </w:pPr>
             <w:r>
+              <w:rPr>
+                <w:sz w:val="16"/>
+              </w:rPr>
               <w:t xml:space="preserve">no (2007)</w:t>
             </w:r>
           </w:p>
@@ -260,6 +308,9 @@
               <w:pStyle w:val="Compact"/>
             </w:pPr>
             <w:r>
+              <w:rPr>
+                <w:sz w:val="16"/>
+              </w:rPr>
               <w:t xml:space="preserve">yes (1850)</w:t>
             </w:r>
           </w:p>
@@ -271,7 +322,10 @@
               <w:pStyle w:val="Compact"/>
             </w:pPr>
             <w:r>
-              <w:t xml:space="preserve">yes (1850; scored from 1900)</w:t>
+              <w:rPr>
+                <w:sz w:val="16"/>
+              </w:rPr>
+              <w:t xml:space="preserve">yes (1850)</w:t>
             </w:r>
           </w:p>
         </w:tc>
@@ -284,17 +338,23 @@
               <w:pStyle w:val="Compact"/>
             </w:pPr>
             <w:r>
-              <w:t xml:space="preserve">Calibrated on observations rather than process-model projections</w:t>
-            </w:r>
-          </w:p>
-        </w:tc>
-        <w:tc>
-          <w:tcPr/>
-          <w:p>
-            <w:pPr>
-              <w:pStyle w:val="Compact"/>
-            </w:pPr>
-            <w:r>
+              <w:rPr>
+                <w:sz w:val="16"/>
+              </w:rPr>
+              <w:t xml:space="preserve">Calibrated on observations</w:t>
+            </w:r>
+          </w:p>
+        </w:tc>
+        <w:tc>
+          <w:tcPr/>
+          <w:p>
+            <w:pPr>
+              <w:pStyle w:val="Compact"/>
+            </w:pPr>
+            <w:r>
+              <w:rPr>
+                <w:sz w:val="16"/>
+              </w:rPr>
               <w:t xml:space="preserve">yes</w:t>
             </w:r>
           </w:p>
@@ -306,73 +366,94 @@
               <w:pStyle w:val="Compact"/>
             </w:pPr>
             <w:r>
-              <w:t xml:space="preserve">no (emulates ISMIP6, LARMIP, DeConto; SEJ)</w:t>
-            </w:r>
-          </w:p>
-        </w:tc>
-        <w:tc>
-          <w:tcPr/>
-          <w:p>
-            <w:pPr>
-              <w:pStyle w:val="Compact"/>
-            </w:pPr>
-            <w:r>
-              <w:t xml:space="preserve">mixed (Horwath obs + AR6)</w:t>
-            </w:r>
-          </w:p>
-        </w:tc>
-        <w:tc>
-          <w:tcPr/>
-          <w:p>
-            <w:pPr>
-              <w:pStyle w:val="Compact"/>
-            </w:pPr>
-            <w:r>
-              <w:t xml:space="preserve">no (SICOPOLIS, PISM, Marzeion)</w:t>
-            </w:r>
-          </w:p>
-        </w:tc>
-        <w:tc>
-          <w:tcPr/>
-          <w:p>
-            <w:pPr>
-              <w:pStyle w:val="Compact"/>
-            </w:pPr>
-            <w:r>
-              <w:t xml:space="preserve">mixed (Frederikse + AR6 2100)</w:t>
-            </w:r>
-          </w:p>
-        </w:tc>
-        <w:tc>
-          <w:tcPr/>
-          <w:p>
-            <w:pPr>
-              <w:pStyle w:val="Compact"/>
-            </w:pPr>
-            <w:r>
-              <w:t xml:space="preserve">no (ISMIP6, GlacierMIP2)</w:t>
-            </w:r>
-          </w:p>
-        </w:tc>
-        <w:tc>
-          <w:tcPr/>
-          <w:p>
-            <w:pPr>
-              <w:pStyle w:val="Compact"/>
-            </w:pPr>
-            <w:r>
-              <w:t xml:space="preserve">no (tipping points from ice-sheet models)</w:t>
-            </w:r>
-          </w:p>
-        </w:tc>
-        <w:tc>
-          <w:tcPr/>
-          <w:p>
-            <w:pPr>
-              <w:pStyle w:val="Compact"/>
-            </w:pPr>
-            <w:r>
-              <w:t xml:space="preserve">yes, plus two priors (SICOPOLIS tap, CMIP6 amplification)</w:t>
+              <w:rPr>
+                <w:sz w:val="16"/>
+              </w:rPr>
+              <w:t xml:space="preserve">no²</w:t>
+            </w:r>
+          </w:p>
+        </w:tc>
+        <w:tc>
+          <w:tcPr/>
+          <w:p>
+            <w:pPr>
+              <w:pStyle w:val="Compact"/>
+            </w:pPr>
+            <w:r>
+              <w:rPr>
+                <w:sz w:val="16"/>
+              </w:rPr>
+              <w:t xml:space="preserve">mixed³</w:t>
+            </w:r>
+          </w:p>
+        </w:tc>
+        <w:tc>
+          <w:tcPr/>
+          <w:p>
+            <w:pPr>
+              <w:pStyle w:val="Compact"/>
+            </w:pPr>
+            <w:r>
+              <w:rPr>
+                <w:sz w:val="16"/>
+              </w:rPr>
+              <w:t xml:space="preserve">no²</w:t>
+            </w:r>
+          </w:p>
+        </w:tc>
+        <w:tc>
+          <w:tcPr/>
+          <w:p>
+            <w:pPr>
+              <w:pStyle w:val="Compact"/>
+            </w:pPr>
+            <w:r>
+              <w:rPr>
+                <w:sz w:val="16"/>
+              </w:rPr>
+              <w:t xml:space="preserve">mixed³</w:t>
+            </w:r>
+          </w:p>
+        </w:tc>
+        <w:tc>
+          <w:tcPr/>
+          <w:p>
+            <w:pPr>
+              <w:pStyle w:val="Compact"/>
+            </w:pPr>
+            <w:r>
+              <w:rPr>
+                <w:sz w:val="16"/>
+              </w:rPr>
+              <w:t xml:space="preserve">no²</w:t>
+            </w:r>
+          </w:p>
+        </w:tc>
+        <w:tc>
+          <w:tcPr/>
+          <w:p>
+            <w:pPr>
+              <w:pStyle w:val="Compact"/>
+            </w:pPr>
+            <w:r>
+              <w:rPr>
+                <w:sz w:val="16"/>
+              </w:rPr>
+              <w:t xml:space="preserve">no²</w:t>
+            </w:r>
+          </w:p>
+        </w:tc>
+        <w:tc>
+          <w:tcPr/>
+          <w:p>
+            <w:pPr>
+              <w:pStyle w:val="Compact"/>
+            </w:pPr>
+            <w:r>
+              <w:rPr>
+                <w:sz w:val="16"/>
+              </w:rPr>
+              <w:t xml:space="preserve">yes⁴</w:t>
             </w:r>
           </w:p>
         </w:tc>
@@ -385,17 +466,23 @@
               <w:pStyle w:val="Compact"/>
             </w:pPr>
             <w:r>
-              <w:t xml:space="preserve">Accepts an external climate (can be run on FaIR)</w:t>
-            </w:r>
-          </w:p>
-        </w:tc>
-        <w:tc>
-          <w:tcPr/>
-          <w:p>
-            <w:pPr>
-              <w:pStyle w:val="Compact"/>
-            </w:pPr>
-            <w:r>
+              <w:rPr>
+                <w:sz w:val="16"/>
+              </w:rPr>
+              <w:t xml:space="preserve">Runs on an external climate (FaIR)</w:t>
+            </w:r>
+          </w:p>
+        </w:tc>
+        <w:tc>
+          <w:tcPr/>
+          <w:p>
+            <w:pPr>
+              <w:pStyle w:val="Compact"/>
+            </w:pPr>
+            <w:r>
+              <w:rPr>
+                <w:sz w:val="16"/>
+              </w:rPr>
               <w:t xml:space="preserve">yes</w:t>
             </w:r>
           </w:p>
@@ -407,39 +494,51 @@
               <w:pStyle w:val="Compact"/>
             </w:pPr>
             <w:r>
-              <w:t xml:space="preserve">yes (FaIR 1.6.4 native)</w:t>
-            </w:r>
-          </w:p>
-        </w:tc>
-        <w:tc>
-          <w:tcPr/>
-          <w:p>
-            <w:pPr>
-              <w:pStyle w:val="Compact"/>
-            </w:pPr>
-            <w:r>
-              <w:t xml:space="preserve">yes (FaIR 2.1.1 native)</w:t>
-            </w:r>
-          </w:p>
-        </w:tc>
-        <w:tc>
-          <w:tcPr/>
-          <w:p>
-            <w:pPr>
-              <w:pStyle w:val="Compact"/>
-            </w:pPr>
-            <w:r>
-              <w:t xml:space="preserve">no (MAGICC only)</w:t>
-            </w:r>
-          </w:p>
-        </w:tc>
-        <w:tc>
-          <w:tcPr/>
-          <w:p>
-            <w:pPr>
-              <w:pStyle w:val="Compact"/>
-            </w:pPr>
-            <w:r>
+              <w:rPr>
+                <w:sz w:val="16"/>
+              </w:rPr>
+              <w:t xml:space="preserve">yes</w:t>
+            </w:r>
+          </w:p>
+        </w:tc>
+        <w:tc>
+          <w:tcPr/>
+          <w:p>
+            <w:pPr>
+              <w:pStyle w:val="Compact"/>
+            </w:pPr>
+            <w:r>
+              <w:rPr>
+                <w:sz w:val="16"/>
+              </w:rPr>
+              <w:t xml:space="preserve">yes</w:t>
+            </w:r>
+          </w:p>
+        </w:tc>
+        <w:tc>
+          <w:tcPr/>
+          <w:p>
+            <w:pPr>
+              <w:pStyle w:val="Compact"/>
+            </w:pPr>
+            <w:r>
+              <w:rPr>
+                <w:sz w:val="16"/>
+              </w:rPr>
+              <w:t xml:space="preserve">no</w:t>
+            </w:r>
+          </w:p>
+        </w:tc>
+        <w:tc>
+          <w:tcPr/>
+          <w:p>
+            <w:pPr>
+              <w:pStyle w:val="Compact"/>
+            </w:pPr>
+            <w:r>
+              <w:rPr>
+                <w:sz w:val="16"/>
+              </w:rPr>
               <w:t xml:space="preserve">GMST only</w:t>
             </w:r>
           </w:p>
@@ -451,29 +550,38 @@
               <w:pStyle w:val="Compact"/>
             </w:pPr>
             <w:r>
-              <w:t xml:space="preserve">yes (OHC from FaIR or MAGICC)</w:t>
-            </w:r>
-          </w:p>
-        </w:tc>
-        <w:tc>
-          <w:tcPr/>
-          <w:p>
-            <w:pPr>
-              <w:pStyle w:val="Compact"/>
-            </w:pPr>
-            <w:r>
-              <w:t xml:space="preserve">no (own climate from emissions)</w:t>
-            </w:r>
-          </w:p>
-        </w:tc>
-        <w:tc>
-          <w:tcPr/>
-          <w:p>
-            <w:pPr>
-              <w:pStyle w:val="Compact"/>
-            </w:pPr>
-            <w:r>
-              <w:t xml:space="preserve">yes (FaIR 2.2.4, calib 1.6.0)</w:t>
+              <w:rPr>
+                <w:sz w:val="16"/>
+              </w:rPr>
+              <w:t xml:space="preserve">yes</w:t>
+            </w:r>
+          </w:p>
+        </w:tc>
+        <w:tc>
+          <w:tcPr/>
+          <w:p>
+            <w:pPr>
+              <w:pStyle w:val="Compact"/>
+            </w:pPr>
+            <w:r>
+              <w:rPr>
+                <w:sz w:val="16"/>
+              </w:rPr>
+              <w:t xml:space="preserve">no</w:t>
+            </w:r>
+          </w:p>
+        </w:tc>
+        <w:tc>
+          <w:tcPr/>
+          <w:p>
+            <w:pPr>
+              <w:pStyle w:val="Compact"/>
+            </w:pPr>
+            <w:r>
+              <w:rPr>
+                <w:sz w:val="16"/>
+              </w:rPr>
+              <w:t xml:space="preserve">yes</w:t>
             </w:r>
           </w:p>
         </w:tc>
@@ -486,17 +594,23 @@
               <w:pStyle w:val="Compact"/>
             </w:pPr>
             <w:r>
-              <w:t xml:space="preserve">Components climate-driven past 2100</w:t>
-            </w:r>
-          </w:p>
-        </w:tc>
-        <w:tc>
-          <w:tcPr/>
-          <w:p>
-            <w:pPr>
-              <w:pStyle w:val="Compact"/>
-            </w:pPr>
-            <w:r>
+              <w:rPr>
+                <w:sz w:val="16"/>
+              </w:rPr>
+              <w:t xml:space="preserve">Climate-driven past 2100</w:t>
+            </w:r>
+          </w:p>
+        </w:tc>
+        <w:tc>
+          <w:tcPr/>
+          <w:p>
+            <w:pPr>
+              <w:pStyle w:val="Compact"/>
+            </w:pPr>
+            <w:r>
+              <w:rPr>
+                <w:sz w:val="16"/>
+              </w:rPr>
               <w:t xml:space="preserve">yes</w:t>
             </w:r>
           </w:p>
@@ -508,17 +622,23 @@
               <w:pStyle w:val="Compact"/>
             </w:pPr>
             <w:r>
-              <w:t xml:space="preserve">TE, glaciers only (ice sheets extrapolate or sample 21st-century projections)</w:t>
-            </w:r>
-          </w:p>
-        </w:tc>
-        <w:tc>
-          <w:tcPr/>
-          <w:p>
-            <w:pPr>
-              <w:pStyle w:val="Compact"/>
-            </w:pPr>
-            <w:r>
+              <w:rPr>
+                <w:sz w:val="16"/>
+              </w:rPr>
+              <w:t xml:space="preserve">TE, glaciers only⁵</w:t>
+            </w:r>
+          </w:p>
+        </w:tc>
+        <w:tc>
+          <w:tcPr/>
+          <w:p>
+            <w:pPr>
+              <w:pStyle w:val="Compact"/>
+            </w:pPr>
+            <w:r>
+              <w:rPr>
+                <w:sz w:val="16"/>
+              </w:rPr>
               <w:t xml:space="preserve">yes</w:t>
             </w:r>
           </w:p>
@@ -530,39 +650,9 @@
               <w:pStyle w:val="Compact"/>
             </w:pPr>
             <w:r>
-              <w:t xml:space="preserve">yes (calibrated to 2300–2500)</w:t>
-            </w:r>
-          </w:p>
-        </w:tc>
-        <w:tc>
-          <w:tcPr/>
-          <w:p>
-            <w:pPr>
-              <w:pStyle w:val="Compact"/>
-            </w:pPr>
-            <w:r>
-              <w:t xml:space="preserve">no (2100 model, extrapolated)</w:t>
-            </w:r>
-          </w:p>
-        </w:tc>
-        <w:tc>
-          <w:tcPr/>
-          <w:p>
-            <w:pPr>
-              <w:pStyle w:val="Compact"/>
-            </w:pPr>
-            <w:r>
-              <w:t xml:space="preserve">partial (GIS as FACTS; AIS to 2300)</w:t>
-            </w:r>
-          </w:p>
-        </w:tc>
-        <w:tc>
-          <w:tcPr/>
-          <w:p>
-            <w:pPr>
-              <w:pStyle w:val="Compact"/>
-            </w:pPr>
-            <w:r>
+              <w:rPr>
+                <w:sz w:val="16"/>
+              </w:rPr>
               <w:t xml:space="preserve">yes</w:t>
             </w:r>
           </w:p>
@@ -574,6 +664,51 @@
               <w:pStyle w:val="Compact"/>
             </w:pPr>
             <w:r>
+              <w:rPr>
+                <w:sz w:val="16"/>
+              </w:rPr>
+              <w:t xml:space="preserve">no⁶</w:t>
+            </w:r>
+          </w:p>
+        </w:tc>
+        <w:tc>
+          <w:tcPr/>
+          <w:p>
+            <w:pPr>
+              <w:pStyle w:val="Compact"/>
+            </w:pPr>
+            <w:r>
+              <w:rPr>
+                <w:sz w:val="16"/>
+              </w:rPr>
+              <w:t xml:space="preserve">partial⁵</w:t>
+            </w:r>
+          </w:p>
+        </w:tc>
+        <w:tc>
+          <w:tcPr/>
+          <w:p>
+            <w:pPr>
+              <w:pStyle w:val="Compact"/>
+            </w:pPr>
+            <w:r>
+              <w:rPr>
+                <w:sz w:val="16"/>
+              </w:rPr>
+              <w:t xml:space="preserve">yes</w:t>
+            </w:r>
+          </w:p>
+        </w:tc>
+        <w:tc>
+          <w:tcPr/>
+          <w:p>
+            <w:pPr>
+              <w:pStyle w:val="Compact"/>
+            </w:pPr>
+            <w:r>
+              <w:rPr>
+                <w:sz w:val="16"/>
+              </w:rPr>
               <w:t xml:space="preserve">yes</w:t>
             </w:r>
           </w:p>
@@ -587,17 +722,23 @@
               <w:pStyle w:val="Compact"/>
             </w:pPr>
             <w:r>
-              <w:t xml:space="preserve">Regional output / relative sea level</w:t>
-            </w:r>
-          </w:p>
-        </w:tc>
-        <w:tc>
-          <w:tcPr/>
-          <w:p>
-            <w:pPr>
-              <w:pStyle w:val="Compact"/>
-            </w:pPr>
-            <w:r>
+              <w:rPr>
+                <w:sz w:val="16"/>
+              </w:rPr>
+              <w:t xml:space="preserve">Regional / relative sea level</w:t>
+            </w:r>
+          </w:p>
+        </w:tc>
+        <w:tc>
+          <w:tcPr/>
+          <w:p>
+            <w:pPr>
+              <w:pStyle w:val="Compact"/>
+            </w:pPr>
+            <w:r>
+              <w:rPr>
+                <w:sz w:val="16"/>
+              </w:rPr>
               <w:t xml:space="preserve">yes / no</w:t>
             </w:r>
           </w:p>
@@ -609,6 +750,9 @@
               <w:pStyle w:val="Compact"/>
             </w:pPr>
             <w:r>
+              <w:rPr>
+                <w:sz w:val="16"/>
+              </w:rPr>
               <w:t xml:space="preserve">yes / yes</w:t>
             </w:r>
           </w:p>
@@ -620,6 +764,9 @@
               <w:pStyle w:val="Compact"/>
             </w:pPr>
             <w:r>
+              <w:rPr>
+                <w:sz w:val="16"/>
+              </w:rPr>
               <w:t xml:space="preserve">yes / no</w:t>
             </w:r>
           </w:p>
@@ -631,6 +778,9 @@
               <w:pStyle w:val="Compact"/>
             </w:pPr>
             <w:r>
+              <w:rPr>
+                <w:sz w:val="16"/>
+              </w:rPr>
               <w:t xml:space="preserve">no / no</w:t>
             </w:r>
           </w:p>
@@ -642,6 +792,9 @@
               <w:pStyle w:val="Compact"/>
             </w:pPr>
             <w:r>
+              <w:rPr>
+                <w:sz w:val="16"/>
+              </w:rPr>
               <w:t xml:space="preserve">yes / yes</w:t>
             </w:r>
           </w:p>
@@ -653,6 +806,9 @@
               <w:pStyle w:val="Compact"/>
             </w:pPr>
             <w:r>
+              <w:rPr>
+                <w:sz w:val="16"/>
+              </w:rPr>
               <w:t xml:space="preserve">yes / yes</w:t>
             </w:r>
           </w:p>
@@ -664,6 +820,9 @@
               <w:pStyle w:val="Compact"/>
             </w:pPr>
             <w:r>
+              <w:rPr>
+                <w:sz w:val="16"/>
+              </w:rPr>
               <w:t xml:space="preserve">no / no</w:t>
             </w:r>
           </w:p>
@@ -675,12 +834,23 @@
               <w:pStyle w:val="Compact"/>
             </w:pPr>
             <w:r>
+              <w:rPr>
+                <w:sz w:val="16"/>
+              </w:rPr>
               <w:t xml:space="preserve">no / no</w:t>
             </w:r>
           </w:p>
         </w:tc>
       </w:tr>
     </w:tbl>
+    <w:p>
+      <w:pPr>
+        <w:pStyle w:val="BodyText"/>
+      </w:pPr>
+      <w:r>
+        <w:t xml:space="preserve">¹ Ice sheets start in 1990 (Greenland) and 2002 (Antarctica). ² Calibrated to process-model projections (ISMIP6, LARMIP, DeConto, SICOPOLIS, PISM, GlacierMIP2) or structured expert judgement. ³ Observations plus AR6 projections. ⁴ Except two priors: the Greenland tap (SICOPOLIS) and temperature amplification (CMIP6). ⁵ Ice-sheet modules extrapolate the 2080–2100 rate or sample 21st-century projections; ProFSea's Greenland uses the FACTS implementation. ⁶ A 2100 model, extended to 2300 by extrapolation.</w:t>
+      </w:r>
+    </w:p>
     <w:p>
       <w:pPr>
         <w:pStyle w:val="BodyText"/>
@@ -696,7 +866,7 @@
         <w:t xml:space="preserve"> </w:t>
       </w:r>
       <w:r>
-        <w:t xml:space="preserve">Component structure of the same eight emulators. Glacier inventories for BRICK 2.0, MAGICC and FACTS are read from their parameter files and code in this project; "not documented" means the SLEIP preprint does not state it. Farinotti 2019 gives 32.4 ± 8.4 cm SLE for all RGI regions.</w:t>
+        <w:t xml:space="preserve">Component structure of the same eight emulators. Glacier inventories for BRICK 2.0, MAGICC and FACTS read from their parameter files and code; Farinotti 2019 gives 32.4 ± 8.4 cm SLE for all RGI regions. n.d. = not documented in SLEIP.</w:t>
       </w:r>
     </w:p>
     <w:tbl>
@@ -707,15 +877,15 @@
         <w:tblLook w:firstRow="1" w:lastRow="0" w:firstColumn="0" w:lastColumn="0" w:noHBand="0" w:noVBand="0" w:val="0020"/>
       </w:tblPr>
       <w:tblGrid>
-        <w:gridCol w:w="1428"/>
-        <w:gridCol w:w="649"/>
-        <w:gridCol w:w="908"/>
-        <w:gridCol w:w="649"/>
-        <w:gridCol w:w="779"/>
-        <w:gridCol w:w="519"/>
-        <w:gridCol w:w="649"/>
-        <w:gridCol w:w="779"/>
-        <w:gridCol w:w="1558"/>
+        <w:gridCol w:w="2508"/>
+        <w:gridCol w:w="528"/>
+        <w:gridCol w:w="660"/>
+        <w:gridCol w:w="528"/>
+        <w:gridCol w:w="792"/>
+        <w:gridCol w:w="528"/>
+        <w:gridCol w:w="660"/>
+        <w:gridCol w:w="792"/>
+        <w:gridCol w:w="924"/>
       </w:tblGrid>
       <w:tr>
         <w:trPr>
@@ -728,6 +898,9 @@
               <w:pStyle w:val="Compact"/>
             </w:pPr>
             <w:r>
+              <w:rPr>
+                <w:sz w:val="16"/>
+              </w:rPr>
               <w:t xml:space="preserve">attribute</w:t>
             </w:r>
           </w:p>
@@ -739,6 +912,9 @@
               <w:pStyle w:val="Compact"/>
             </w:pPr>
             <w:r>
+              <w:rPr>
+                <w:sz w:val="16"/>
+              </w:rPr>
               <w:t xml:space="preserve">BRICK 2.0</w:t>
             </w:r>
           </w:p>
@@ -750,6 +926,9 @@
               <w:pStyle w:val="Compact"/>
             </w:pPr>
             <w:r>
+              <w:rPr>
+                <w:sz w:val="16"/>
+              </w:rPr>
               <w:t xml:space="preserve">FACTS</w:t>
             </w:r>
           </w:p>
@@ -761,6 +940,9 @@
               <w:pStyle w:val="Compact"/>
             </w:pPr>
             <w:r>
+              <w:rPr>
+                <w:sz w:val="16"/>
+              </w:rPr>
               <w:t xml:space="preserve">FRISIA</w:t>
             </w:r>
           </w:p>
@@ -772,6 +954,9 @@
               <w:pStyle w:val="Compact"/>
             </w:pPr>
             <w:r>
+              <w:rPr>
+                <w:sz w:val="16"/>
+              </w:rPr>
               <w:t xml:space="preserve">MAGICC-SLR</w:t>
             </w:r>
           </w:p>
@@ -783,6 +968,9 @@
               <w:pStyle w:val="Compact"/>
             </w:pPr>
             <w:r>
+              <w:rPr>
+                <w:sz w:val="16"/>
+              </w:rPr>
               <w:t xml:space="preserve">MP25</w:t>
             </w:r>
           </w:p>
@@ -794,6 +982,9 @@
               <w:pStyle w:val="Compact"/>
             </w:pPr>
             <w:r>
+              <w:rPr>
+                <w:sz w:val="16"/>
+              </w:rPr>
               <w:t xml:space="preserve">ProFSea</w:t>
             </w:r>
           </w:p>
@@ -805,6 +996,9 @@
               <w:pStyle w:val="Compact"/>
             </w:pPr>
             <w:r>
+              <w:rPr>
+                <w:sz w:val="16"/>
+              </w:rPr>
               <w:t xml:space="preserve">SURFER</w:t>
             </w:r>
           </w:p>
@@ -816,6 +1010,9 @@
               <w:pStyle w:val="Compact"/>
             </w:pPr>
             <w:r>
+              <w:rPr>
+                <w:sz w:val="16"/>
+              </w:rPr>
               <w:t xml:space="preserve">Ladrillo</w:t>
             </w:r>
           </w:p>
@@ -829,6 +1026,9 @@
               <w:pStyle w:val="Compact"/>
             </w:pPr>
             <w:r>
+              <w:rPr>
+                <w:sz w:val="16"/>
+              </w:rPr>
               <w:t xml:space="preserve">Thermal expansion</w:t>
             </w:r>
           </w:p>
@@ -840,6 +1040,9 @@
               <w:pStyle w:val="Compact"/>
             </w:pPr>
             <w:r>
+              <w:rPr>
+                <w:sz w:val="16"/>
+              </w:rPr>
               <w:t xml:space="preserve">∝ OHC</w:t>
             </w:r>
           </w:p>
@@ -851,72 +1054,93 @@
               <w:pStyle w:val="Compact"/>
             </w:pPr>
             <w:r>
-              <w:t xml:space="preserve">coefficient × OHC</w:t>
-            </w:r>
-          </w:p>
-        </w:tc>
-        <w:tc>
-          <w:tcPr/>
-          <w:p>
-            <w:pPr>
-              <w:pStyle w:val="Compact"/>
-            </w:pPr>
-            <w:r>
-              <w:t xml:space="preserve">coefficient × OHC</w:t>
-            </w:r>
-          </w:p>
-        </w:tc>
-        <w:tc>
-          <w:tcPr/>
-          <w:p>
-            <w:pPr>
-              <w:pStyle w:val="Compact"/>
-            </w:pPr>
-            <w:r>
-              <w:t xml:space="preserve">40-layer, layer-specific</w:t>
-            </w:r>
-          </w:p>
-        </w:tc>
-        <w:tc>
-          <w:tcPr/>
-          <w:p>
-            <w:pPr>
-              <w:pStyle w:val="Compact"/>
-            </w:pPr>
-            <w:r>
-              <w:t xml:space="preserve">linear in GSAT</w:t>
-            </w:r>
-          </w:p>
-        </w:tc>
-        <w:tc>
-          <w:tcPr/>
-          <w:p>
-            <w:pPr>
-              <w:pStyle w:val="Compact"/>
-            </w:pPr>
-            <w:r>
-              <w:t xml:space="preserve">coefficient × OHC</w:t>
-            </w:r>
-          </w:p>
-        </w:tc>
-        <w:tc>
-          <w:tcPr/>
-          <w:p>
-            <w:pPr>
-              <w:pStyle w:val="Compact"/>
-            </w:pPr>
-            <w:r>
-              <w:t xml:space="preserve">3-layer, layer-specific</w:t>
-            </w:r>
-          </w:p>
-        </w:tc>
-        <w:tc>
-          <w:tcPr/>
-          <w:p>
-            <w:pPr>
-              <w:pStyle w:val="Compact"/>
-            </w:pPr>
-            <w:r>
+              <w:rPr>
+                <w:sz w:val="16"/>
+              </w:rPr>
+              <w:t xml:space="preserve">∝ OHC</w:t>
+            </w:r>
+          </w:p>
+        </w:tc>
+        <w:tc>
+          <w:tcPr/>
+          <w:p>
+            <w:pPr>
+              <w:pStyle w:val="Compact"/>
+            </w:pPr>
+            <w:r>
+              <w:rPr>
+                <w:sz w:val="16"/>
+              </w:rPr>
+              <w:t xml:space="preserve">∝ OHC</w:t>
+            </w:r>
+          </w:p>
+        </w:tc>
+        <w:tc>
+          <w:tcPr/>
+          <w:p>
+            <w:pPr>
+              <w:pStyle w:val="Compact"/>
+            </w:pPr>
+            <w:r>
+              <w:rPr>
+                <w:sz w:val="16"/>
+              </w:rPr>
+              <w:t xml:space="preserve">40 layers</w:t>
+            </w:r>
+          </w:p>
+        </w:tc>
+        <w:tc>
+          <w:tcPr/>
+          <w:p>
+            <w:pPr>
+              <w:pStyle w:val="Compact"/>
+            </w:pPr>
+            <w:r>
+              <w:rPr>
+                <w:sz w:val="16"/>
+              </w:rPr>
+              <w:t xml:space="preserve">∝ GSAT</w:t>
+            </w:r>
+          </w:p>
+        </w:tc>
+        <w:tc>
+          <w:tcPr/>
+          <w:p>
+            <w:pPr>
+              <w:pStyle w:val="Compact"/>
+            </w:pPr>
+            <w:r>
+              <w:rPr>
+                <w:sz w:val="16"/>
+              </w:rPr>
+              <w:t xml:space="preserve">∝ OHC</w:t>
+            </w:r>
+          </w:p>
+        </w:tc>
+        <w:tc>
+          <w:tcPr/>
+          <w:p>
+            <w:pPr>
+              <w:pStyle w:val="Compact"/>
+            </w:pPr>
+            <w:r>
+              <w:rPr>
+                <w:sz w:val="16"/>
+              </w:rPr>
+              <w:t xml:space="preserve">3 layers</w:t>
+            </w:r>
+          </w:p>
+        </w:tc>
+        <w:tc>
+          <w:tcPr/>
+          <w:p>
+            <w:pPr>
+              <w:pStyle w:val="Compact"/>
+            </w:pPr>
+            <w:r>
+              <w:rPr>
+                <w:sz w:val="16"/>
+              </w:rPr>
               <w:t xml:space="preserve">∝ OHC</w:t>
             </w:r>
           </w:p>
@@ -930,6 +1154,9 @@
               <w:pStyle w:val="Compact"/>
             </w:pPr>
             <w:r>
+              <w:rPr>
+                <w:sz w:val="16"/>
+              </w:rPr>
               <w:t xml:space="preserve">Glacier inventory (cm SLE)</w:t>
             </w:r>
           </w:p>
@@ -941,72 +1168,93 @@
               <w:pStyle w:val="Compact"/>
             </w:pPr>
             <w:r>
-              <w:t xml:space="preserve">42 (Wigley–Raper 41)</w:t>
-            </w:r>
-          </w:p>
-        </w:tc>
-        <w:tc>
-          <w:tcPr/>
-          <w:p>
-            <w:pPr>
-              <w:pStyle w:val="Compact"/>
-            </w:pPr>
-            <w:r>
-              <w:t xml:space="preserve">31.6 cap (AR5 Table 4.2)</w:t>
-            </w:r>
-          </w:p>
-        </w:tc>
-        <w:tc>
-          <w:tcPr/>
-          <w:p>
-            <w:pPr>
-              <w:pStyle w:val="Compact"/>
-            </w:pPr>
-            <w:r>
-              <w:t xml:space="preserve">not documented</w:t>
-            </w:r>
-          </w:p>
-        </w:tc>
-        <w:tc>
-          <w:tcPr/>
-          <w:p>
-            <w:pPr>
-              <w:pStyle w:val="Compact"/>
-            </w:pPr>
-            <w:r>
-              <w:t xml:space="preserve">35.6–45.1 across tunes</w:t>
-            </w:r>
-          </w:p>
-        </w:tc>
-        <w:tc>
-          <w:tcPr/>
-          <w:p>
-            <w:pPr>
-              <w:pStyle w:val="Compact"/>
-            </w:pPr>
-            <w:r>
-              <w:t xml:space="preserve">not documented</w:t>
-            </w:r>
-          </w:p>
-        </w:tc>
-        <w:tc>
-          <w:tcPr/>
-          <w:p>
-            <w:pPr>
-              <w:pStyle w:val="Compact"/>
-            </w:pPr>
-            <w:r>
-              <w:t xml:space="preserve">not documented (AR5 form)</w:t>
-            </w:r>
-          </w:p>
-        </w:tc>
-        <w:tc>
-          <w:tcPr/>
-          <w:p>
-            <w:pPr>
-              <w:pStyle w:val="Compact"/>
-            </w:pPr>
-            <w:r>
+              <w:rPr>
+                <w:sz w:val="16"/>
+              </w:rPr>
+              <w:t xml:space="preserve">42⁷</w:t>
+            </w:r>
+          </w:p>
+        </w:tc>
+        <w:tc>
+          <w:tcPr/>
+          <w:p>
+            <w:pPr>
+              <w:pStyle w:val="Compact"/>
+            </w:pPr>
+            <w:r>
+              <w:rPr>
+                <w:sz w:val="16"/>
+              </w:rPr>
+              <w:t xml:space="preserve">31.6 cap⁸</w:t>
+            </w:r>
+          </w:p>
+        </w:tc>
+        <w:tc>
+          <w:tcPr/>
+          <w:p>
+            <w:pPr>
+              <w:pStyle w:val="Compact"/>
+            </w:pPr>
+            <w:r>
+              <w:rPr>
+                <w:sz w:val="16"/>
+              </w:rPr>
+              <w:t xml:space="preserve">n.d.</w:t>
+            </w:r>
+          </w:p>
+        </w:tc>
+        <w:tc>
+          <w:tcPr/>
+          <w:p>
+            <w:pPr>
+              <w:pStyle w:val="Compact"/>
+            </w:pPr>
+            <w:r>
+              <w:rPr>
+                <w:sz w:val="16"/>
+              </w:rPr>
+              <w:t xml:space="preserve">35.6–45.1⁹</w:t>
+            </w:r>
+          </w:p>
+        </w:tc>
+        <w:tc>
+          <w:tcPr/>
+          <w:p>
+            <w:pPr>
+              <w:pStyle w:val="Compact"/>
+            </w:pPr>
+            <w:r>
+              <w:rPr>
+                <w:sz w:val="16"/>
+              </w:rPr>
+              <w:t xml:space="preserve">n.d.</w:t>
+            </w:r>
+          </w:p>
+        </w:tc>
+        <w:tc>
+          <w:tcPr/>
+          <w:p>
+            <w:pPr>
+              <w:pStyle w:val="Compact"/>
+            </w:pPr>
+            <w:r>
+              <w:rPr>
+                <w:sz w:val="16"/>
+              </w:rPr>
+              <w:t xml:space="preserve">n.d.</w:t>
+            </w:r>
+          </w:p>
+        </w:tc>
+        <w:tc>
+          <w:tcPr/>
+          <w:p>
+            <w:pPr>
+              <w:pStyle w:val="Compact"/>
+            </w:pPr>
+            <w:r>
+              <w:rPr>
+                <w:sz w:val="16"/>
+              </w:rPr>
               <w:t xml:space="preserve">50</w:t>
             </w:r>
           </w:p>
@@ -1018,7 +1266,10 @@
               <w:pStyle w:val="Compact"/>
             </w:pPr>
             <w:r>
-              <w:t xml:space="preserve">29.0 ± 6.0 = Farinotti on Ladrillo's scope, which excludes RGI 05 (3.4)</w:t>
+              <w:rPr>
+                <w:sz w:val="16"/>
+              </w:rPr>
+              <w:t xml:space="preserve">29.0 ± 6.0¹⁰</w:t>
             </w:r>
           </w:p>
         </w:tc>
@@ -1031,17 +1282,23 @@
               <w:pStyle w:val="Compact"/>
             </w:pPr>
             <w:r>
-              <w:t xml:space="preserve">Glaciers can regrow under cooling</w:t>
-            </w:r>
-          </w:p>
-        </w:tc>
-        <w:tc>
-          <w:tcPr/>
-          <w:p>
-            <w:pPr>
-              <w:pStyle w:val="Compact"/>
-            </w:pPr>
-            <w:r>
+              <w:rPr>
+                <w:sz w:val="16"/>
+              </w:rPr>
+              <w:t xml:space="preserve">Glacier regrowth under cooling</w:t>
+            </w:r>
+          </w:p>
+        </w:tc>
+        <w:tc>
+          <w:tcPr/>
+          <w:p>
+            <w:pPr>
+              <w:pStyle w:val="Compact"/>
+            </w:pPr>
+            <w:r>
+              <w:rPr>
+                <w:sz w:val="16"/>
+              </w:rPr>
               <w:t xml:space="preserve">no</w:t>
             </w:r>
           </w:p>
@@ -1053,6 +1310,9 @@
               <w:pStyle w:val="Compact"/>
             </w:pPr>
             <w:r>
+              <w:rPr>
+                <w:sz w:val="16"/>
+              </w:rPr>
               <w:t xml:space="preserve">no</w:t>
             </w:r>
           </w:p>
@@ -1064,6 +1324,9 @@
               <w:pStyle w:val="Compact"/>
             </w:pPr>
             <w:r>
+              <w:rPr>
+                <w:sz w:val="16"/>
+              </w:rPr>
               <w:t xml:space="preserve">no</w:t>
             </w:r>
           </w:p>
@@ -1075,6 +1338,9 @@
               <w:pStyle w:val="Compact"/>
             </w:pPr>
             <w:r>
+              <w:rPr>
+                <w:sz w:val="16"/>
+              </w:rPr>
               <w:t xml:space="preserve">yes</w:t>
             </w:r>
           </w:p>
@@ -1086,17 +1352,23 @@
               <w:pStyle w:val="Compact"/>
             </w:pPr>
             <w:r>
-              <w:t xml:space="preserve">not documented</w:t>
-            </w:r>
-          </w:p>
-        </w:tc>
-        <w:tc>
-          <w:tcPr/>
-          <w:p>
-            <w:pPr>
-              <w:pStyle w:val="Compact"/>
-            </w:pPr>
-            <w:r>
+              <w:rPr>
+                <w:sz w:val="16"/>
+              </w:rPr>
+              <w:t xml:space="preserve">n.d.</w:t>
+            </w:r>
+          </w:p>
+        </w:tc>
+        <w:tc>
+          <w:tcPr/>
+          <w:p>
+            <w:pPr>
+              <w:pStyle w:val="Compact"/>
+            </w:pPr>
+            <w:r>
+              <w:rPr>
+                <w:sz w:val="16"/>
+              </w:rPr>
               <w:t xml:space="preserve">no</w:t>
             </w:r>
           </w:p>
@@ -1108,6 +1380,9 @@
               <w:pStyle w:val="Compact"/>
             </w:pPr>
             <w:r>
+              <w:rPr>
+                <w:sz w:val="16"/>
+              </w:rPr>
               <w:t xml:space="preserve">yes</w:t>
             </w:r>
           </w:p>
@@ -1119,6 +1394,9 @@
               <w:pStyle w:val="Compact"/>
             </w:pPr>
             <w:r>
+              <w:rPr>
+                <w:sz w:val="16"/>
+              </w:rPr>
               <w:t xml:space="preserve">yes</w:t>
             </w:r>
           </w:p>
@@ -1132,6 +1410,9 @@
               <w:pStyle w:val="Compact"/>
             </w:pPr>
             <w:r>
+              <w:rPr>
+                <w:sz w:val="16"/>
+              </w:rPr>
               <w:t xml:space="preserve">Greenland SMB / discharge split</w:t>
             </w:r>
           </w:p>
@@ -1143,6 +1424,9 @@
               <w:pStyle w:val="Compact"/>
             </w:pPr>
             <w:r>
+              <w:rPr>
+                <w:sz w:val="16"/>
+              </w:rPr>
               <w:t xml:space="preserve">no</w:t>
             </w:r>
           </w:p>
@@ -1154,6 +1438,9 @@
               <w:pStyle w:val="Compact"/>
             </w:pPr>
             <w:r>
+              <w:rPr>
+                <w:sz w:val="16"/>
+              </w:rPr>
               <w:t xml:space="preserve">no</w:t>
             </w:r>
           </w:p>
@@ -1165,6 +1452,9 @@
               <w:pStyle w:val="Compact"/>
             </w:pPr>
             <w:r>
+              <w:rPr>
+                <w:sz w:val="16"/>
+              </w:rPr>
               <w:t xml:space="preserve">yes</w:t>
             </w:r>
           </w:p>
@@ -1176,6 +1466,9 @@
               <w:pStyle w:val="Compact"/>
             </w:pPr>
             <w:r>
+              <w:rPr>
+                <w:sz w:val="16"/>
+              </w:rPr>
               <w:t xml:space="preserve">yes</w:t>
             </w:r>
           </w:p>
@@ -1187,6 +1480,9 @@
               <w:pStyle w:val="Compact"/>
             </w:pPr>
             <w:r>
+              <w:rPr>
+                <w:sz w:val="16"/>
+              </w:rPr>
               <w:t xml:space="preserve">no</w:t>
             </w:r>
           </w:p>
@@ -1198,6 +1494,9 @@
               <w:pStyle w:val="Compact"/>
             </w:pPr>
             <w:r>
+              <w:rPr>
+                <w:sz w:val="16"/>
+              </w:rPr>
               <w:t xml:space="preserve">no</w:t>
             </w:r>
           </w:p>
@@ -1209,6 +1508,9 @@
               <w:pStyle w:val="Compact"/>
             </w:pPr>
             <w:r>
+              <w:rPr>
+                <w:sz w:val="16"/>
+              </w:rPr>
               <w:t xml:space="preserve">no</w:t>
             </w:r>
           </w:p>
@@ -1220,7 +1522,10 @@
               <w:pStyle w:val="Compact"/>
             </w:pPr>
             <w:r>
-              <w:t xml:space="preserve">yes (two channels, two basins)</w:t>
+              <w:rPr>
+                <w:sz w:val="16"/>
+              </w:rPr>
+              <w:t xml:space="preserve">yes¹¹</w:t>
             </w:r>
           </w:p>
         </w:tc>
@@ -1233,50 +1538,65 @@
               <w:pStyle w:val="Compact"/>
             </w:pPr>
             <w:r>
-              <w:t xml:space="preserve">Antarctic ice sheet (SLEIP type)</w:t>
-            </w:r>
-          </w:p>
-        </w:tc>
-        <w:tc>
-          <w:tcPr/>
-          <w:p>
-            <w:pPr>
-              <w:pStyle w:val="Compact"/>
-            </w:pPr>
-            <w:r>
-              <w:t xml:space="preserve">physical model (DAIS)</w:t>
-            </w:r>
-          </w:p>
-        </w:tc>
-        <w:tc>
-          <w:tcPr/>
-          <w:p>
-            <w:pPr>
-              <w:pStyle w:val="Compact"/>
-            </w:pPr>
-            <w:r>
-              <w:t xml:space="preserve">statistical / parametric / SEJ by workflow</w:t>
-            </w:r>
-          </w:p>
-        </w:tc>
-        <w:tc>
-          <w:tcPr/>
-          <w:p>
-            <w:pPr>
-              <w:pStyle w:val="Compact"/>
-            </w:pPr>
-            <w:r>
-              <w:t xml:space="preserve">physical model (DAIS)</w:t>
-            </w:r>
-          </w:p>
-        </w:tc>
-        <w:tc>
-          <w:tcPr/>
-          <w:p>
-            <w:pPr>
-              <w:pStyle w:val="Compact"/>
-            </w:pPr>
-            <w:r>
+              <w:rPr>
+                <w:sz w:val="16"/>
+              </w:rPr>
+              <w:t xml:space="preserve">Antarctic ice sheet</w:t>
+            </w:r>
+          </w:p>
+        </w:tc>
+        <w:tc>
+          <w:tcPr/>
+          <w:p>
+            <w:pPr>
+              <w:pStyle w:val="Compact"/>
+            </w:pPr>
+            <w:r>
+              <w:rPr>
+                <w:sz w:val="16"/>
+              </w:rPr>
+              <w:t xml:space="preserve">DAIS</w:t>
+            </w:r>
+          </w:p>
+        </w:tc>
+        <w:tc>
+          <w:tcPr/>
+          <w:p>
+            <w:pPr>
+              <w:pStyle w:val="Compact"/>
+            </w:pPr>
+            <w:r>
+              <w:rPr>
+                <w:sz w:val="16"/>
+              </w:rPr>
+              <w:t xml:space="preserve">by workflow¹²</w:t>
+            </w:r>
+          </w:p>
+        </w:tc>
+        <w:tc>
+          <w:tcPr/>
+          <w:p>
+            <w:pPr>
+              <w:pStyle w:val="Compact"/>
+            </w:pPr>
+            <w:r>
+              <w:rPr>
+                <w:sz w:val="16"/>
+              </w:rPr>
+              <w:t xml:space="preserve">DAIS</w:t>
+            </w:r>
+          </w:p>
+        </w:tc>
+        <w:tc>
+          <w:tcPr/>
+          <w:p>
+            <w:pPr>
+              <w:pStyle w:val="Compact"/>
+            </w:pPr>
+            <w:r>
+              <w:rPr>
+                <w:sz w:val="16"/>
+              </w:rPr>
               <w:t xml:space="preserve">parametric</w:t>
             </w:r>
           </w:p>
@@ -1288,6 +1608,9 @@
               <w:pStyle w:val="Compact"/>
             </w:pPr>
             <w:r>
+              <w:rPr>
+                <w:sz w:val="16"/>
+              </w:rPr>
               <w:t xml:space="preserve">parametric</w:t>
             </w:r>
           </w:p>
@@ -1299,6 +1622,9 @@
               <w:pStyle w:val="Compact"/>
             </w:pPr>
             <w:r>
+              <w:rPr>
+                <w:sz w:val="16"/>
+              </w:rPr>
               <w:t xml:space="preserve">statistical fit</w:t>
             </w:r>
           </w:p>
@@ -1310,23 +1636,37 @@
               <w:pStyle w:val="Compact"/>
             </w:pPr>
             <w:r>
-              <w:t xml:space="preserve">physical model (ODE tipping element)</w:t>
-            </w:r>
-          </w:p>
-        </w:tc>
-        <w:tc>
-          <w:tcPr/>
-          <w:p>
-            <w:pPr>
-              <w:pStyle w:val="Compact"/>
-            </w:pPr>
-            <w:r>
-              <w:t xml:space="preserve">physical model (DAIS, recalibrated)</w:t>
+              <w:rPr>
+                <w:sz w:val="16"/>
+              </w:rPr>
+              <w:t xml:space="preserve">ODE tipping element</w:t>
+            </w:r>
+          </w:p>
+        </w:tc>
+        <w:tc>
+          <w:tcPr/>
+          <w:p>
+            <w:pPr>
+              <w:pStyle w:val="Compact"/>
+            </w:pPr>
+            <w:r>
+              <w:rPr>
+                <w:sz w:val="16"/>
+              </w:rPr>
+              <w:t xml:space="preserve">DAIS, recalibrated</w:t>
             </w:r>
           </w:p>
         </w:tc>
       </w:tr>
     </w:tbl>
+    <w:p>
+      <w:pPr>
+        <w:pStyle w:val="BodyText"/>
+      </w:pPr>
+      <w:r>
+        <w:t xml:space="preserve">⁷ Wigley–Raper assumed maximum 41. ⁸ AR5 Table 4.2, less the Antarctic periphery. ⁹ Across the 15 glacier tunes. ¹⁰ Farinotti 2019 on Ladrillo's scope, which excludes RGI 05 (3.4 cm, carried in the Greenland mask). ¹¹ Two channels (SMB, discharge) in each of two basins. ¹² AR5 (parametric), LARMIP (response functions), DeConto (sampled), Bamber (expert judgement).</w:t>
+      </w:r>
+    </w:p>
     <w:p>
       <w:pPr>
         <w:pStyle w:val="BlockText"/>

</xml_diff>

<commit_message>
Glacier inventories carry their epoch: MAGICC's 35.6-45.1 is at 1850 (~26-36 at 2000 after its own 9.4 cm of melt), BRICK's 42 at its 1850 start
Co-Authored-By: Claude Opus 5 <noreply@anthropic.com>
</commit_message>
<xml_diff>
--- a/deliverables/LadrilloUpdateDescription_L24.docx
+++ b/deliverables/LadrilloUpdateDescription_L24.docx
@@ -877,15 +877,15 @@
         <w:tblLook w:firstRow="1" w:lastRow="0" w:firstColumn="0" w:lastColumn="0" w:noHBand="0" w:noVBand="0" w:val="0020"/>
       </w:tblPr>
       <w:tblGrid>
-        <w:gridCol w:w="2508"/>
-        <w:gridCol w:w="528"/>
-        <w:gridCol w:w="660"/>
-        <w:gridCol w:w="528"/>
-        <w:gridCol w:w="792"/>
-        <w:gridCol w:w="528"/>
-        <w:gridCol w:w="660"/>
-        <w:gridCol w:w="792"/>
-        <w:gridCol w:w="924"/>
+        <w:gridCol w:w="2299"/>
+        <w:gridCol w:w="510"/>
+        <w:gridCol w:w="638"/>
+        <w:gridCol w:w="510"/>
+        <w:gridCol w:w="1149"/>
+        <w:gridCol w:w="510"/>
+        <w:gridCol w:w="510"/>
+        <w:gridCol w:w="894"/>
+        <w:gridCol w:w="894"/>
       </w:tblGrid>
       <w:tr>
         <w:trPr>
@@ -1157,35 +1157,35 @@
               <w:rPr>
                 <w:sz w:val="16"/>
               </w:rPr>
-              <w:t xml:space="preserve">Glacier inventory (cm SLE)</w:t>
-            </w:r>
-          </w:p>
-        </w:tc>
-        <w:tc>
-          <w:tcPr/>
-          <w:p>
-            <w:pPr>
-              <w:pStyle w:val="Compact"/>
-            </w:pPr>
-            <w:r>
-              <w:rPr>
-                <w:sz w:val="16"/>
-              </w:rPr>
-              <w:t xml:space="preserve">42⁷</w:t>
-            </w:r>
-          </w:p>
-        </w:tc>
-        <w:tc>
-          <w:tcPr/>
-          <w:p>
-            <w:pPr>
-              <w:pStyle w:val="Compact"/>
-            </w:pPr>
-            <w:r>
-              <w:rPr>
-                <w:sz w:val="16"/>
-              </w:rPr>
-              <w:t xml:space="preserve">31.6 cap⁸</w:t>
+              <w:t xml:space="preserve">Glacier inventory (cm SLE) and its epoch</w:t>
+            </w:r>
+          </w:p>
+        </w:tc>
+        <w:tc>
+          <w:tcPr/>
+          <w:p>
+            <w:pPr>
+              <w:pStyle w:val="Compact"/>
+            </w:pPr>
+            <w:r>
+              <w:rPr>
+                <w:sz w:val="16"/>
+              </w:rPr>
+              <w:t xml:space="preserve">42 at 1850⁷</w:t>
+            </w:r>
+          </w:p>
+        </w:tc>
+        <w:tc>
+          <w:tcPr/>
+          <w:p>
+            <w:pPr>
+              <w:pStyle w:val="Compact"/>
+            </w:pPr>
+            <w:r>
+              <w:rPr>
+                <w:sz w:val="16"/>
+              </w:rPr>
+              <w:t xml:space="preserve">31.6 at ~2000⁸</w:t>
             </w:r>
           </w:p>
         </w:tc>
@@ -1213,7 +1213,7 @@
               <w:rPr>
                 <w:sz w:val="16"/>
               </w:rPr>
-              <w:t xml:space="preserve">35.6–45.1⁹</w:t>
+              <w:t xml:space="preserve">35.6–45.1 at 1850 (≈26–36 at 2000)⁹</w:t>
             </w:r>
           </w:p>
         </w:tc>
@@ -1255,21 +1255,21 @@
               <w:rPr>
                 <w:sz w:val="16"/>
               </w:rPr>
-              <w:t xml:space="preserve">50</w:t>
-            </w:r>
-          </w:p>
-        </w:tc>
-        <w:tc>
-          <w:tcPr/>
-          <w:p>
-            <w:pPr>
-              <w:pStyle w:val="Compact"/>
-            </w:pPr>
-            <w:r>
-              <w:rPr>
-                <w:sz w:val="16"/>
-              </w:rPr>
-              <w:t xml:space="preserve">29.0 ± 6.0¹⁰</w:t>
+              <w:t xml:space="preserve">50, preindustrial</w:t>
+            </w:r>
+          </w:p>
+        </w:tc>
+        <w:tc>
+          <w:tcPr/>
+          <w:p>
+            <w:pPr>
+              <w:pStyle w:val="Compact"/>
+            </w:pPr>
+            <w:r>
+              <w:rPr>
+                <w:sz w:val="16"/>
+              </w:rPr>
+              <w:t xml:space="preserve">29.0 ± 6.0 at 2000¹⁰</w:t>
             </w:r>
           </w:p>
         </w:tc>
@@ -1664,7 +1664,7 @@
         <w:pStyle w:val="BodyText"/>
       </w:pPr>
       <w:r>
-        <w:t xml:space="preserve">⁷ Wigley–Raper assumed maximum 41. ⁸ AR5 Table 4.2, less the Antarctic periphery. ⁹ Across the 15 glacier tunes. ¹⁰ Farinotti 2019 on Ladrillo's scope, which excludes RGI 05 (3.4 cm, carried in the Greenland mask). ¹¹ Two channels (SMB, discharge) in each of two basins. ¹² AR5 (parametric), LARMIP (response functions), DeConto (sampled), Bamber (expert judgement).</w:t>
+        <w:t xml:space="preserve">⁷ Initial volume at the model start; Wigley–Raper assumed maximum 41. ⁸ Cumulative-melt cap from AR5 Table 4.2, less the Antarctic periphery. ⁹ Across the 15 glacier tunes; MAGICC's own 1850–2000 melt is 9.4 cm (5–95% 4.7–13.2), so the 2000-basis range is approximate. ¹⁰ Farinotti 2019 on Ladrillo's scope, which excludes RGI 05 (3.4 cm, carried in the Greenland mask). ¹¹ Two channels (SMB, discharge) in each of two basins. ¹² AR5 (parametric), LARMIP (response functions), DeConto (sampled), Bamber (expert judgement).</w:t>
       </w:r>
     </w:p>
     <w:p>
@@ -1835,7 +1835,7 @@
         <w:t xml:space="preserve"> </w:t>
       </w:r>
       <w:r>
-        <w:t xml:space="preserve">BRICK 2.0 and Ladrillo now have completely different glacier modules. MAGICC and Ladrillo both use the formulation from Nauels 2017 Eq. 3; where they differ is the three regions used in Ladrillo. MAGICC's committed 1850 melt is 2.8–13.6 cm, Ladrillo's 6.3–14.6 cm. The two models also start from different total glacier inventories. BRICK 2.0's calibrated initial volume centres on 42 cm SLE (5–95% 32–52), inherited from the Wigley and Raper (2005) assumed maximum of 41 cm; Ladrillo constrains the remaining stock at 2000 to 29.0 ± 6.0 cm SLE on its target scope (Farinotti 2019 excluding RGI regions 5 and 19, plus 6.9 cm for region 19), with Millan 2022 agreeing to 1% on the matched scope. The full-RGI Farinotti value is 32.4 ± 8.4 cm. The comparators' inventories are larger and differ in scope: FACTS's AR5 glacier module caps cumulative melt at 31.6 cm SLE (AR5 Table 4.2's 41.2 cm less 9.63 cm; its regional fingerprints include the Greenland periphery and no Antarctic periphery), which every SSP5-8.5 sample reaches by 2300; MAGICC's tabulated equilibrium curves reach 35.6–45.1 cm SLE across their 15 tunes. Ladrillo's glaciers exclude RGI 05 (about 3.4 cm SLE, carried inside its Greenland ice-sheet mask), so its glacier contribution is structurally smaller than the comparators' by that region's melt.</w:t>
+        <w:t xml:space="preserve">BRICK 2.0 and Ladrillo now have completely different glacier modules. MAGICC and Ladrillo both use the formulation from Nauels 2017 Eq. 3; where they differ is the three regions used in Ladrillo. MAGICC's committed 1850 melt is 2.8–13.6 cm, Ladrillo's 6.3–14.6 cm. The two models also start from different total glacier inventories. BRICK 2.0's calibrated initial volume, at its 1850 start, centres on 42 cm SLE (5–95% 32–52), inherited from the Wigley and Raper (2005) assumed maximum of 41 cm; Ladrillo constrains the remaining stock at 2000 to 29.0 ± 6.0 cm SLE on its target scope (Farinotti 2019 excluding RGI regions 5 and 19, plus 6.9 cm for region 19), with Millan 2022 agreeing to 1% on the matched scope. The full-RGI Farinotti value is 32.4 ± 8.4 cm. The comparators' inventories are larger and differ in scope: FACTS's AR5 glacier module caps cumulative melt at 31.6 cm SLE (AR5 Table 4.2's 41.2 cm less 9.63 cm; its regional fingerprints include the Greenland periphery and no Antarctic periphery), which every SSP5-8.5 sample reaches by 2300; MAGICC's tabulated equilibrium curves reach 35.6–45.1 cm SLE across their 15 tunes, measured from 1850; net of MAGICC's own 9.4 cm of melt over 1850–2000 that is roughly 26–36 cm at 2000, bracketing Farinotti. Ladrillo's glaciers exclude RGI 05 (about 3.4 cm SLE, carried inside its Greenland ice-sheet mask), so its glacier contribution is structurally smaller than the comparators' by that region's melt.</w:t>
       </w:r>
     </w:p>
     <w:p>

</xml_diff>

<commit_message>
Glacier inventories on the 2000 basis: BRICK 37.7 (own 1850-2000 melt 4.0 cm, measured), MAGICC ~26-36 (own 9.4 cm); table row and GSIC text updated
Co-Authored-By: Claude Opus 5 <noreply@anthropic.com>
</commit_message>
<xml_diff>
--- a/deliverables/LadrilloUpdateDescription_L24.docx
+++ b/deliverables/LadrilloUpdateDescription_L24.docx
@@ -877,14 +877,14 @@
         <w:tblLook w:firstRow="1" w:lastRow="0" w:firstColumn="0" w:lastColumn="0" w:noHBand="0" w:noVBand="0" w:val="0020"/>
       </w:tblPr>
       <w:tblGrid>
-        <w:gridCol w:w="2299"/>
+        <w:gridCol w:w="2427"/>
+        <w:gridCol w:w="638"/>
+        <w:gridCol w:w="510"/>
+        <w:gridCol w:w="510"/>
+        <w:gridCol w:w="766"/>
         <w:gridCol w:w="510"/>
         <w:gridCol w:w="638"/>
-        <w:gridCol w:w="510"/>
-        <w:gridCol w:w="1149"/>
-        <w:gridCol w:w="510"/>
-        <w:gridCol w:w="510"/>
-        <w:gridCol w:w="894"/>
+        <w:gridCol w:w="1021"/>
         <w:gridCol w:w="894"/>
       </w:tblGrid>
       <w:tr>
@@ -1157,35 +1157,35 @@
               <w:rPr>
                 <w:sz w:val="16"/>
               </w:rPr>
-              <w:t xml:space="preserve">Glacier inventory (cm SLE) and its epoch</w:t>
-            </w:r>
-          </w:p>
-        </w:tc>
-        <w:tc>
-          <w:tcPr/>
-          <w:p>
-            <w:pPr>
-              <w:pStyle w:val="Compact"/>
-            </w:pPr>
-            <w:r>
-              <w:rPr>
-                <w:sz w:val="16"/>
-              </w:rPr>
-              <w:t xml:space="preserve">42 at 1850⁷</w:t>
-            </w:r>
-          </w:p>
-        </w:tc>
-        <w:tc>
-          <w:tcPr/>
-          <w:p>
-            <w:pPr>
-              <w:pStyle w:val="Compact"/>
-            </w:pPr>
-            <w:r>
-              <w:rPr>
-                <w:sz w:val="16"/>
-              </w:rPr>
-              <w:t xml:space="preserve">31.6 at ~2000⁸</w:t>
+              <w:t xml:space="preserve">Glacier inventory at 2000 (cm SLE)</w:t>
+            </w:r>
+          </w:p>
+        </w:tc>
+        <w:tc>
+          <w:tcPr/>
+          <w:p>
+            <w:pPr>
+              <w:pStyle w:val="Compact"/>
+            </w:pPr>
+            <w:r>
+              <w:rPr>
+                <w:sz w:val="16"/>
+              </w:rPr>
+              <w:t xml:space="preserve">37.7 (28–48)⁷</w:t>
+            </w:r>
+          </w:p>
+        </w:tc>
+        <w:tc>
+          <w:tcPr/>
+          <w:p>
+            <w:pPr>
+              <w:pStyle w:val="Compact"/>
+            </w:pPr>
+            <w:r>
+              <w:rPr>
+                <w:sz w:val="16"/>
+              </w:rPr>
+              <w:t xml:space="preserve">31.6⁸</w:t>
             </w:r>
           </w:p>
         </w:tc>
@@ -1213,7 +1213,7 @@
               <w:rPr>
                 <w:sz w:val="16"/>
               </w:rPr>
-              <w:t xml:space="preserve">35.6–45.1 at 1850 (≈26–36 at 2000)⁹</w:t>
+              <w:t xml:space="preserve">≈26–36⁹</w:t>
             </w:r>
           </w:p>
         </w:tc>
@@ -1255,21 +1255,21 @@
               <w:rPr>
                 <w:sz w:val="16"/>
               </w:rPr>
-              <w:t xml:space="preserve">50, preindustrial</w:t>
-            </w:r>
-          </w:p>
-        </w:tc>
-        <w:tc>
-          <w:tcPr/>
-          <w:p>
-            <w:pPr>
-              <w:pStyle w:val="Compact"/>
-            </w:pPr>
-            <w:r>
-              <w:rPr>
-                <w:sz w:val="16"/>
-              </w:rPr>
-              <w:t xml:space="preserve">29.0 ± 6.0 at 2000¹⁰</w:t>
+              <w:t xml:space="preserve">n.d. (50 preindustrial)</w:t>
+            </w:r>
+          </w:p>
+        </w:tc>
+        <w:tc>
+          <w:tcPr/>
+          <w:p>
+            <w:pPr>
+              <w:pStyle w:val="Compact"/>
+            </w:pPr>
+            <w:r>
+              <w:rPr>
+                <w:sz w:val="16"/>
+              </w:rPr>
+              <w:t xml:space="preserve">29.0 ± 6.0¹⁰</w:t>
             </w:r>
           </w:p>
         </w:tc>
@@ -1664,7 +1664,7 @@
         <w:pStyle w:val="BodyText"/>
       </w:pPr>
       <w:r>
-        <w:t xml:space="preserve">⁷ Initial volume at the model start; Wigley–Raper assumed maximum 41. ⁸ Cumulative-melt cap from AR5 Table 4.2, less the Antarctic periphery. ⁹ Across the 15 glacier tunes; MAGICC's own 1850–2000 melt is 9.4 cm (5–95% 4.7–13.2), so the 2000-basis range is approximate. ¹⁰ Farinotti 2019 on Ladrillo's scope, which excludes RGI 05 (3.4 cm, carried in the Greenland mask). ¹¹ Two channels (SMB, discharge) in each of two basins. ¹² AR5 (parametric), LARMIP (response functions), DeConto (sampled), Bamber (expert judgement).</w:t>
+        <w:t xml:space="preserve">⁷ Calibrated initial volume 42 cm (5–95% 32–52) at the 1850 start, less BRICK's own 4.0 cm of melt to 2000 (0.7 cm of it before 1900). ⁸ Cumulative-melt cap from AR5 Table 4.2, less the Antarctic periphery. ⁹ Equilibrium curves reach 35.6–45.1 cm at 1850 across the 15 tunes, less MAGICC's own 9.4 cm (5–95% 4.7–13.2) of melt to 2000. ¹⁰ Farinotti 2019 on Ladrillo's scope, which excludes RGI 05 (3.4 cm, carried in the Greenland mask). ¹¹ Two channels (SMB, discharge) in each of two basins. ¹² AR5 (parametric), LARMIP (response functions), DeConto (sampled), Bamber (expert judgement).</w:t>
       </w:r>
     </w:p>
     <w:p>
@@ -1835,7 +1835,7 @@
         <w:t xml:space="preserve"> </w:t>
       </w:r>
       <w:r>
-        <w:t xml:space="preserve">BRICK 2.0 and Ladrillo now have completely different glacier modules. MAGICC and Ladrillo both use the formulation from Nauels 2017 Eq. 3; where they differ is the three regions used in Ladrillo. MAGICC's committed 1850 melt is 2.8–13.6 cm, Ladrillo's 6.3–14.6 cm. The two models also start from different total glacier inventories. BRICK 2.0's calibrated initial volume, at its 1850 start, centres on 42 cm SLE (5–95% 32–52), inherited from the Wigley and Raper (2005) assumed maximum of 41 cm; Ladrillo constrains the remaining stock at 2000 to 29.0 ± 6.0 cm SLE on its target scope (Farinotti 2019 excluding RGI regions 5 and 19, plus 6.9 cm for region 19), with Millan 2022 agreeing to 1% on the matched scope. The full-RGI Farinotti value is 32.4 ± 8.4 cm. The comparators' inventories are larger and differ in scope: FACTS's AR5 glacier module caps cumulative melt at 31.6 cm SLE (AR5 Table 4.2's 41.2 cm less 9.63 cm; its regional fingerprints include the Greenland periphery and no Antarctic periphery), which every SSP5-8.5 sample reaches by 2300; MAGICC's tabulated equilibrium curves reach 35.6–45.1 cm SLE across their 15 tunes, measured from 1850; net of MAGICC's own 9.4 cm of melt over 1850–2000 that is roughly 26–36 cm at 2000, bracketing Farinotti. Ladrillo's glaciers exclude RGI 05 (about 3.4 cm SLE, carried inside its Greenland ice-sheet mask), so its glacier contribution is structurally smaller than the comparators' by that region's melt.</w:t>
+        <w:t xml:space="preserve">BRICK 2.0 and Ladrillo now have completely different glacier modules. MAGICC and Ladrillo both use the formulation from Nauels 2017 Eq. 3; where they differ is the three regions used in Ladrillo. MAGICC's committed 1850 melt is 2.8–13.6 cm, Ladrillo's 6.3–14.6 cm. The two models also start from different total glacier inventories. BRICK 2.0's calibrated initial volume, at its 1850 start, centres on 42 cm SLE (5–95% 32–52), inherited from the Wigley and Raper (2005) assumed maximum of 41 cm — 37.7 cm remaining at 2000 after its own 4.0 cm of melt, of which only 0.7 cm falls before 1900; Ladrillo constrains the remaining stock at 2000 to 29.0 ± 6.0 cm SLE on its target scope (Farinotti 2019 excluding RGI regions 5 and 19, plus 6.9 cm for region 19), with Millan 2022 agreeing to 1% on the matched scope. The full-RGI Farinotti value is 32.4 ± 8.4 cm. The comparators' inventories are larger and differ in scope: FACTS's AR5 glacier module caps cumulative melt at 31.6 cm SLE (AR5 Table 4.2's 41.2 cm less 9.63 cm; its regional fingerprints include the Greenland periphery and no Antarctic periphery), which every SSP5-8.5 sample reaches by 2300; MAGICC's tabulated equilibrium curves reach 35.6–45.1 cm SLE across their 15 tunes, measured from 1850; net of MAGICC's own 9.4 cm of melt over 1850–2000 that is roughly 26–36 cm at 2000, bracketing Farinotti. Ladrillo's glaciers exclude RGI 05 (about 3.4 cm SLE, carried inside its Greenland ice-sheet mask), so its glacier contribution is structurally smaller than the comparators' by that region's melt.</w:t>
       </w:r>
     </w:p>
     <w:p>

</xml_diff>

<commit_message>
GSIC: Wigley & Raper's initial volume is 40 cm (2-sigma 30-50), not an 'assumed maximum of 41' (per the SLEIP-session reading of W&R 2005)
Co-Authored-By: Claude Opus 5 <noreply@anthropic.com>
</commit_message>
<xml_diff>
--- a/deliverables/LadrilloUpdateDescription_L24.docx
+++ b/deliverables/LadrilloUpdateDescription_L24.docx
@@ -1664,7 +1664,7 @@
         <w:pStyle w:val="BodyText"/>
       </w:pPr>
       <w:r>
-        <w:t xml:space="preserve">⁷ Calibrated initial volume 42 cm (5–95% 32–52) at the 1850 start, less BRICK's own 4.0 cm of melt to 2000 (0.7 cm of it before 1900). ⁸ Cumulative-melt cap from AR5 Table 4.2, less the Antarctic periphery. ⁹ Equilibrium curves reach 35.6–45.1 cm at 1850 across the 15 tunes, less MAGICC's own 9.4 cm (5–95% 4.7–13.2) of melt to 2000. ¹⁰ Farinotti 2019 on Ladrillo's scope, which excludes RGI 05 (3.4 cm, carried in the Greenland mask). ¹¹ Two channels (SMB, discharge) in each of two basins. ¹² AR5 (parametric), LARMIP (response functions), DeConto (sampled), Bamber (expert judgement).</w:t>
+        <w:t xml:space="preserve">⁷ Calibrated initial volume 42 cm (5–95% 32–52) at the 1850 start (Wigley and Raper's assumed 40 ± 10), less BRICK's own 4.0 cm of melt to 2000 (0.7 cm of it before 1900). ⁸ Cumulative-melt cap from AR5 Table 4.2, less the Antarctic periphery. ⁹ Equilibrium curves reach 35.6–45.1 cm at 1850 across the 15 tunes, less MAGICC's own 9.4 cm (5–95% 4.7–13.2) of melt to 2000. ¹⁰ Farinotti 2019 on Ladrillo's scope, which excludes RGI 05 (3.4 cm, carried in the Greenland mask). ¹¹ Two channels (SMB, discharge) in each of two basins. ¹² AR5 (parametric), LARMIP (response functions), DeConto (sampled), Bamber (expert judgement).</w:t>
       </w:r>
     </w:p>
     <w:p>
@@ -1835,7 +1835,7 @@
         <w:t xml:space="preserve"> </w:t>
       </w:r>
       <w:r>
-        <w:t xml:space="preserve">BRICK 2.0 and Ladrillo now have completely different glacier modules. MAGICC and Ladrillo both use the formulation from Nauels 2017 Eq. 3; where they differ is the three regions used in Ladrillo. MAGICC's committed 1850 melt is 2.8–13.6 cm, Ladrillo's 6.3–14.6 cm. The two models also start from different total glacier inventories. BRICK 2.0's calibrated initial volume, at its 1850 start, centres on 42 cm SLE (5–95% 32–52), inherited from the Wigley and Raper (2005) assumed maximum of 41 cm — 37.7 cm remaining at 2000 after its own 4.0 cm of melt, of which only 0.7 cm falls before 1900; Ladrillo constrains the remaining stock at 2000 to 29.0 ± 6.0 cm SLE on its target scope (Farinotti 2019 excluding RGI regions 5 and 19, plus 6.9 cm for region 19), with Millan 2022 agreeing to 1% on the matched scope. The full-RGI Farinotti value is 32.4 ± 8.4 cm. The comparators' inventories are larger and differ in scope: FACTS's AR5 glacier module caps cumulative melt at 31.6 cm SLE (AR5 Table 4.2's 41.2 cm less 9.63 cm; its regional fingerprints include the Greenland periphery and no Antarctic periphery), which every SSP5-8.5 sample reaches by 2300; MAGICC's tabulated equilibrium curves reach 35.6–45.1 cm SLE across their 15 tunes, measured from 1850; net of MAGICC's own 9.4 cm of melt over 1850–2000 that is roughly 26–36 cm at 2000, bracketing Farinotti. Ladrillo's glaciers exclude RGI 05 (about 3.4 cm SLE, carried inside its Greenland ice-sheet mask), so its glacier contribution is structurally smaller than the comparators' by that region's melt.</w:t>
+        <w:t xml:space="preserve">BRICK 2.0 and Ladrillo now have completely different glacier modules. MAGICC and Ladrillo both use the formulation from Nauels 2017 Eq. 3; where they differ is the three regions used in Ladrillo. MAGICC's committed 1850 melt is 2.8–13.6 cm, Ladrillo's 6.3–14.6 cm. The two models also start from different total glacier inventories. BRICK 2.0's calibrated initial volume, at its 1850 start, centres on 42 cm SLE (5–95% 32–52), inherited from Wigley and Raper (2005), whose assumed initial volume is 40 cm (2σ 30–50) — 37.7 cm remaining at 2000 after its own 4.0 cm of melt, of which only 0.7 cm falls before 1900; Ladrillo constrains the remaining stock at 2000 to 29.0 ± 6.0 cm SLE on its target scope (Farinotti 2019 excluding RGI regions 5 and 19, plus 6.9 cm for region 19), with Millan 2022 agreeing to 1% on the matched scope. The full-RGI Farinotti value is 32.4 ± 8.4 cm. The comparators' inventories are larger and differ in scope: FACTS's AR5 glacier module caps cumulative melt at 31.6 cm SLE (AR5 Table 4.2's 41.2 cm less 9.63 cm; its regional fingerprints include the Greenland periphery and no Antarctic periphery), which every SSP5-8.5 sample reaches by 2300; MAGICC's tabulated equilibrium curves reach 35.6–45.1 cm SLE across their 15 tunes, measured from 1850; net of MAGICC's own 9.4 cm of melt over 1850–2000 that is roughly 26–36 cm at 2000, bracketing Farinotti. Ladrillo's glaciers exclude RGI 05 (about 3.4 cm SLE, carried inside its Greenland ice-sheet mask), so its glacier contribution is structurally smaller than the comparators' by that region's melt.</w:t>
       </w:r>
     </w:p>
     <w:p>

</xml_diff>

<commit_message>
Re-apply the W&R 40 cm (2-sigma 30-50) correction after a stale Word save reverted it; keep Marcus's intro edits; commit the 14:48 rebuild's stamped figures/outputs
Co-Authored-By: Claude Opus 5 <noreply@anthropic.com>
</commit_message>
<xml_diff>
--- a/deliverables/LadrilloUpdateDescription_L24.docx
+++ b/deliverables/LadrilloUpdateDescription_L24.docx
@@ -24,7 +24,7 @@
         <w:pStyle w:val="BodyText"/>
       </w:pPr>
       <w:r>
-        <w:t xml:space="preserve">Ladrillo occupies a distinct niche among current sea level emulators. Of the seven emulators in the SLEIP intercomparison, only three carry a hindcast of every component from 1900 or earlier: BRICK 2.0, SURFER, MP25. Of these three, SURFER's historical total runs outside the observational range in SLEIP's own assessment, and MP25 is a statistical fit to the Frederikse reconstruction that projects only to 2100. MAGICC-SLR and FRISIA start their ice sheets in 1990 and 2002 and ProFSea starts in 2007. Meanwhile, beyond 2100, FACTS's ice-sheet modules either extrapolate or sample from 21st-century projections, and MAGICC-SLR can only be run on MAGICC's own climate.</w:t>
+        <w:t xml:space="preserve">Ladrillo occupies a distinct niche among current sea level emulators. Of the seven emulators in the SLEIP intercomparison, only three carry a hindcast of every component starting in 1900 or earlier: BRICK 2.0, SURFER, and MP25. Of these three, SURFER's historical total runs outside the observational range in SLEIP's own assessment, and MP25 is a statistical fit to the Frederikse reconstruction that projects only to 2100, leaving BRICK and Ladrillo as the two models which run 1900-2300 and match observations. MAGICC-SLR and FRISIA start their ice sheets in 1990 and 2002 and ProFSea starts in 2007, and the FACTS workflow starts in 2005. Some other limitations of other emulators are that FACTS's ice-sheet modules either extrapolate or sample from 21st-century projections and that MAGICC-SLR can only be run on MAGICC's own climate.</w:t>
       </w:r>
     </w:p>
     <w:p>
@@ -32,7 +32,7 @@
         <w:pStyle w:val="BodyText"/>
       </w:pPr>
       <w:r>
-        <w:t xml:space="preserve">As a derivative of BRICK, Ladrillo and BRICK do have a similar niche. However, while Ladrillo generally keeps to BRICK’s design philosophy of physically based components calibrated on the historical record, it does depart from that philosophy in two places that observations cannot reach, namely a Greenland commitment above a threshold, informed by SICOPOLIS, and local-to-global temperature amplification, informed by CMIP6. Ladrillo also extended some of BRICK’s observational constraints (an Antarctic likelihood from 1900 rather than IMBIE's 1992–2017; Dangendorf, GlaMBIE, GRACE and Mouginot added), and is calibrated to a current version of FaIR (2.2.4, calibration 1.6.0, 841-member climate ensemble) rather than being coupled to SNEASY.</w:t>
+        <w:t xml:space="preserve">As a derivative of BRICK, Ladrillo and BRICK do share a similar niche. However, while Ladrillo generally keeps to BRICK’s design philosophy of physically based components calibrated on the historical record, it does depart from that philosophy in two places that observations cannot inform, namely a Greenland commitment above a threshold, informed by SICOPOLIS, and local-to-global temperature amplification, informed by CMIP6. Ladrillo also extended some of BRICK’s observational constraints (an Antarctic likelihood from 1900 rather than IMBIE's 1992–2017; Dangendorf, GlaMBIE, GRACE and Mouginot added), and is calibrated to a current version of FaIR (2.2.4, calibration 1.6.0, 841-member climate ensemble) rather than being coupled to SNEASY.</w:t>
       </w:r>
     </w:p>
     <w:p>

</xml_diff>

<commit_message>
Drop the SLEIP-type row (Marcus); Tables 1-2: measured word floors, attribute column narrowed
Co-Authored-By: Claude Opus 5 <noreply@anthropic.com>
</commit_message>
<xml_diff>
--- a/deliverables/LadrilloUpdateDescription_L24.docx
+++ b/deliverables/LadrilloUpdateDescription_L24.docx
@@ -61,15 +61,15 @@
         <w:tblLook w:firstRow="1" w:lastRow="0" w:firstColumn="0" w:lastColumn="0" w:noHBand="0" w:noVBand="0" w:val="0020"/>
       </w:tblPr>
       <w:tblGrid>
-        <w:gridCol w:w="2640"/>
-        <w:gridCol w:w="660"/>
+        <w:gridCol w:w="1267"/>
+        <w:gridCol w:w="712"/>
+        <w:gridCol w:w="871"/>
         <w:gridCol w:w="792"/>
-        <w:gridCol w:w="660"/>
-        <w:gridCol w:w="528"/>
+        <w:gridCol w:w="950"/>
         <w:gridCol w:w="792"/>
-        <w:gridCol w:w="660"/>
-        <w:gridCol w:w="528"/>
-        <w:gridCol w:w="660"/>
+        <w:gridCol w:w="871"/>
+        <w:gridCol w:w="871"/>
+        <w:gridCol w:w="792"/>
       </w:tblGrid>
       <w:tr>
         <w:trPr>
@@ -877,15 +877,15 @@
         <w:tblLook w:firstRow="1" w:lastRow="0" w:firstColumn="0" w:lastColumn="0" w:noHBand="0" w:noVBand="0" w:val="0020"/>
       </w:tblPr>
       <w:tblGrid>
-        <w:gridCol w:w="2376"/>
-        <w:gridCol w:w="660"/>
-        <w:gridCol w:w="792"/>
-        <w:gridCol w:w="528"/>
-        <w:gridCol w:w="660"/>
-        <w:gridCol w:w="528"/>
-        <w:gridCol w:w="660"/>
-        <w:gridCol w:w="924"/>
-        <w:gridCol w:w="792"/>
+        <w:gridCol w:w="950"/>
+        <w:gridCol w:w="633"/>
+        <w:gridCol w:w="871"/>
+        <w:gridCol w:w="633"/>
+        <w:gridCol w:w="950"/>
+        <w:gridCol w:w="871"/>
+        <w:gridCol w:w="871"/>
+        <w:gridCol w:w="1108"/>
+        <w:gridCol w:w="1029"/>
       </w:tblGrid>
       <w:tr>
         <w:trPr>
@@ -1658,141 +1658,13 @@
           </w:p>
         </w:tc>
       </w:tr>
-      <w:tr>
-        <w:tc>
-          <w:tcPr/>
-          <w:p>
-            <w:pPr>
-              <w:pStyle w:val="Compact"/>
-            </w:pPr>
-            <w:r>
-              <w:rPr>
-                <w:sz w:val="16"/>
-              </w:rPr>
-              <w:t xml:space="preserve">SLEIP parametrisation type (TE / glaciers / GIS / AIS / LWS)¹³</w:t>
-            </w:r>
-          </w:p>
-        </w:tc>
-        <w:tc>
-          <w:tcPr/>
-          <w:p>
-            <w:pPr>
-              <w:pStyle w:val="Compact"/>
-            </w:pPr>
-            <w:r>
-              <w:rPr>
-                <w:sz w:val="16"/>
-              </w:rPr>
-              <w:t xml:space="preserve">2 / 2 / 2 / 3 / —¹⁴</w:t>
-            </w:r>
-          </w:p>
-        </w:tc>
-        <w:tc>
-          <w:tcPr/>
-          <w:p>
-            <w:pPr>
-              <w:pStyle w:val="Compact"/>
-            </w:pPr>
-            <w:r>
-              <w:rPr>
-                <w:sz w:val="16"/>
-              </w:rPr>
-              <w:t xml:space="preserve">2 / 1 / 1, SEJ / 1, 2, SEJ / 1</w:t>
-            </w:r>
-          </w:p>
-        </w:tc>
-        <w:tc>
-          <w:tcPr/>
-          <w:p>
-            <w:pPr>
-              <w:pStyle w:val="Compact"/>
-            </w:pPr>
-            <w:r>
-              <w:rPr>
-                <w:sz w:val="16"/>
-              </w:rPr>
-              <w:t xml:space="preserve">2 / 2 / 2 / 3 / 1</w:t>
-            </w:r>
-          </w:p>
-        </w:tc>
-        <w:tc>
-          <w:tcPr/>
-          <w:p>
-            <w:pPr>
-              <w:pStyle w:val="Compact"/>
-            </w:pPr>
-            <w:r>
-              <w:rPr>
-                <w:sz w:val="16"/>
-              </w:rPr>
-              <w:t xml:space="preserve">3 / 2 / 2 / 2 / 1</w:t>
-            </w:r>
-          </w:p>
-        </w:tc>
-        <w:tc>
-          <w:tcPr/>
-          <w:p>
-            <w:pPr>
-              <w:pStyle w:val="Compact"/>
-            </w:pPr>
-            <w:r>
-              <w:rPr>
-                <w:sz w:val="16"/>
-              </w:rPr>
-              <w:t xml:space="preserve">2 / 2 / 2 / 2 / 1</w:t>
-            </w:r>
-          </w:p>
-        </w:tc>
-        <w:tc>
-          <w:tcPr/>
-          <w:p>
-            <w:pPr>
-              <w:pStyle w:val="Compact"/>
-            </w:pPr>
-            <w:r>
-              <w:rPr>
-                <w:sz w:val="16"/>
-              </w:rPr>
-              <w:t xml:space="preserve">2 / 1 / 1 / 1 / 1</w:t>
-            </w:r>
-          </w:p>
-        </w:tc>
-        <w:tc>
-          <w:tcPr/>
-          <w:p>
-            <w:pPr>
-              <w:pStyle w:val="Compact"/>
-            </w:pPr>
-            <w:r>
-              <w:rPr>
-                <w:sz w:val="16"/>
-              </w:rPr>
-              <w:t xml:space="preserve">3 / 2 / 3 / 3 / —</w:t>
-            </w:r>
-          </w:p>
-        </w:tc>
-        <w:tc>
-          <w:tcPr/>
-          <w:p>
-            <w:pPr>
-              <w:pStyle w:val="Compact"/>
-            </w:pPr>
-            <w:r>
-              <w:rPr>
-                <w:sz w:val="16"/>
-              </w:rPr>
-              <w:t xml:space="preserve">2 / 2 / 2 / 3 / 1¹⁵</w:t>
-            </w:r>
-          </w:p>
-        </w:tc>
-      </w:tr>
     </w:tbl>
     <w:p>
       <w:pPr>
         <w:pStyle w:val="BodyText"/>
       </w:pPr>
       <w:r>
-        <w:t xml:space="preserve">⁷ Calibrated initial volume 42 cm (5–95% 32–52) at the 1850 start (Wigley and Raper's assumed 40 ± 10), less BRICK's own 4.0 cm of melt to 2000 (0.7 cm of it before 1900). ⁸ Cumulative-melt cap from AR5 Table 4.2, less the Antarctic periphery. ⁹ Equilibrium curves reach 35.6–45.1 cm at 1850 across the 15 tunes, less MAGICC's own 9.4 cm (5–95% 4.7–13.2) of melt to 2000. ¹⁰ Farinotti 2019 on Ladrillo's scope, which excludes RGI 05 (3.4 cm, carried in the Greenland mask). ¹¹ Two channels (SMB, discharge) in each of two basins. ¹² AR5 (parametric), LARMIP (response functions), DeConto (sampled), Bamber (expert judgement). ¹³ SLEIP Table 2's classification of each component's functional form: 1 empirical (a statistical fit to, or direct sampling of, observations or model output), 2 physical parametrisation, 3 physical model (coupled ODEs implementing physical laws), SEJ structured expert judgement. The seven SLEIP entries are SLEIP's; Ladrillo's are ours under the same definitions. ¹⁴ SLEIP's Table 2 and results give BRICK no land-water component, although its §3.1 describes one (Dieng 2015 trends); the BRICK 2.0 arm here runs that module, which is zero before 2019 by BRICK's calibration convention. ¹⁵ Thermal expansion (∝ OHC, one coefficient) and the DAIS Antarctic model keep BRICK's form. The glacier law (Mengel 2016 equilibrium, Nauels 2017 Eq. 3 transient — the law SLEIP classes as type 2 for MAGICC) on three regional reservoirs, and the two-channel, two-basin Greenland relaxation with its threshold tap, are physical parametrisations; the type classifies the form, not the calibration source, so the SICOPOLIS-informed tap and CMIP6 amplification priors (note 4) do not make Greenland empirical. Land water storage is the observed series in the hindcast and BRICK's stochastic module in projections, both type 1 by SLEIP's definition.</w:t>
+        <w:t xml:space="preserve">⁷ Calibrated initial volume 42 cm (5–95% 32–52) at the 1850 start (Wigley and Raper's assumed 40 ± 10), less BRICK's own 4.0 cm of melt to 2000 (0.7 cm of it before 1900). ⁸ Cumulative-melt cap from AR5 Table 4.2, less the Antarctic periphery. ⁹ Equilibrium curves reach 35.6–45.1 cm at 1850 across the 15 tunes, less MAGICC's own 9.4 cm (5–95% 4.7–13.2) of melt to 2000. ¹⁰ Farinotti 2019 on Ladrillo's scope, which excludes RGI 05 (3.4 cm, carried in the Greenland mask). ¹¹ Two channels (SMB, discharge) in each of two basins. ¹² AR5 (parametric), LARMIP (response functions), DeConto (sampled), Bamber (expert judgement).</w:t>
       </w:r>
     </w:p>
     <w:p>
@@ -2136,8 +2008,8 @@
       </w:tblPr>
       <w:tblGrid>
         <w:gridCol w:w="1188"/>
-        <w:gridCol w:w="4224"/>
-        <w:gridCol w:w="2508"/>
+        <w:gridCol w:w="4276"/>
+        <w:gridCol w:w="2455"/>
       </w:tblGrid>
       <w:tr>
         <w:trPr>
@@ -3117,11 +2989,11 @@
       </w:tblPr>
       <w:tblGrid>
         <w:gridCol w:w="1584"/>
-        <w:gridCol w:w="1320"/>
-        <w:gridCol w:w="1320"/>
+        <w:gridCol w:w="1346"/>
+        <w:gridCol w:w="1346"/>
         <w:gridCol w:w="1188"/>
-        <w:gridCol w:w="1320"/>
-        <w:gridCol w:w="1188"/>
+        <w:gridCol w:w="1346"/>
+        <w:gridCol w:w="1108"/>
       </w:tblGrid>
       <w:tr>
         <w:trPr>

</xml_diff>

<commit_message>
GSIC: per-block Farinotti ice volumes at 2000 (SLOWP 12.7, FAST 9.4, RGI 19 6.9 cm SLE); Marcus's 17:33 edits synced
Co-Authored-By: Claude Opus 5 <noreply@anthropic.com>
</commit_message>
<xml_diff>
--- a/deliverables/LadrilloUpdateDescription_L24.docx
+++ b/deliverables/LadrilloUpdateDescription_L24.docx
@@ -1741,7 +1741,7 @@
         <w:t xml:space="preserve"> </w:t>
       </w:r>
       <w:r>
-        <w:t xml:space="preserve">(Arctic Canada North, Russian Arctic, Svalbard, Iceland). Large, high-latitude, long relaxation time, and strongly amplified relative to global mean temperature (prior 2.50). This block dominates the glacier contribution in both the hindcast and the projections.</w:t>
+        <w:t xml:space="preserve">(Arctic Canada North, Russian Arctic, Svalbard, Iceland). Ice volume at 2000: 12.7 ± 3.3 cm SLE (Farinotti 2019). Large, high-latitude, long relaxation time, and strongly amplified relative to global mean temperature (prior 2.50). This block dominates the glacier contribution in both the hindcast and the projections.</w:t>
       </w:r>
     </w:p>
     <w:p>
@@ -1759,7 +1759,7 @@
         <w:t xml:space="preserve"> </w:t>
       </w:r>
       <w:r>
-        <w:t xml:space="preserve">Smaller, faster-responding bodies with weak amplification (prior 1.45). It equilibrates quickly enough that its committed volume is close to its realised volume through most of the record.</w:t>
+        <w:t xml:space="preserve">Ice volume at 2000: 9.4 ± 2.4 cm SLE. Smaller, faster-responding bodies with weak amplification (prior 1.45). It equilibrates quickly enough that its committed volume is close to its realised volume through most of the record.</w:t>
       </w:r>
     </w:p>
     <w:p>
@@ -1777,7 +1777,7 @@
         <w:t xml:space="preserve"> </w:t>
       </w:r>
       <w:r>
-        <w:t xml:space="preserve">This block exists because the historical glacier target (Frederikse) assumes zero Antarctic-periphery melt, while the GlaMBIE series spliced in from 2019 onward includes it. Folding RGI 19 into either SLOWP or FAST would leave the model's hindcast scope mismatched. Keeping it separate lets the hindcast be evaluated on SLOWP + FAST while RGI 19 still contributes to projected totals. Its amplification prior (0.72) is also far below the other two, so it is not physically interchangeable with them either.</w:t>
+        <w:t xml:space="preserve">Ice volume at 2000: 6.9 ± 1.8 cm SLE. This block exists because the historical glacier target (Frederikse) assumes zero Antarctic-periphery melt, while the GlaMBIE series spliced in from 2019 onward includes it. Folding RGI 19 into either SLOWP or FAST would leave the model's hindcast scope mismatched. Keeping it separate lets the hindcast be evaluated on SLOWP + FAST while RGI 19 still contributes to projected totals. Its amplification prior (0.72) is also far below the other two, which is another reason to separate this region.</w:t>
       </w:r>
     </w:p>
     <w:p>
@@ -1785,7 +1785,7 @@
         <w:pStyle w:val="BodyText"/>
       </w:pPr>
       <w:r>
-        <w:t xml:space="preserve">These three blocks cover 18 of the 19 RGI regions; RGI 05, Greenland Periphery, is excluded — Frederikse's glacier target excludes it and it falls inside the Greenland ice-sheet mask.</w:t>
+        <w:t xml:space="preserve">These three blocks cover 18 of the 19 RGI regions; RGI 05, the Greenland Periphery, is excluded, as it is not included in Frederikse's glacier estimate and RGI 05 also falls inside the Greenland ice-sheet mask.</w:t>
       </w:r>
     </w:p>
     <w:p>
@@ -1803,7 +1803,7 @@
         <w:t xml:space="preserve"> </w:t>
       </w:r>
       <w:r>
-        <w:t xml:space="preserve">BRICK 2.0 and Ladrillo now have completely different glacier modules. MAGICC and Ladrillo both use the formulation from Nauels 2017 Eq. 3; where they differ is the three regions used in Ladrillo. MAGICC's committed 1850 melt is 2.8–13.6 cm, Ladrillo's 6.3–14.6 cm. The two models also start from different total glacier inventories. BRICK 2.0's calibrated initial volume, at its 1850 start, centres on 42 cm SLE (5–95% 32–52), inherited from Wigley and Raper (2005), whose assumed initial volume is 40 cm (2σ 30–50) — 37.7 cm remaining at 2000 after its own 4.0 cm of melt, of which only 0.7 cm falls before 1900; Ladrillo constrains the remaining stock at 2000 to 29.0 ± 6.0 cm SLE on its target scope (Farinotti 2019 excluding RGI regions 5 and 19, plus 6.9 cm for region 19), with Millan 2022 agreeing to 1% on the matched scope. The full-RGI Farinotti value is 32.4 ± 8.4 cm. The comparators' inventories are larger and differ in scope: FACTS's AR5 glacier module caps cumulative melt at 31.6 cm SLE (AR5 Table 4.2's 41.2 cm less 9.63 cm; its regional fingerprints include the Greenland periphery and no Antarctic periphery), which every SSP5-8.5 sample reaches by 2300; MAGICC's tabulated equilibrium curves reach 35.6–45.1 cm SLE across their 15 tunes, measured from 1850; net of MAGICC's own 9.4 cm of melt over 1850–2000 that is roughly 26–36 cm at 2000, bracketing Farinotti. Ladrillo's glaciers exclude RGI 05 (about 3.4 cm SLE, carried inside its Greenland ice-sheet mask), so its glacier contribution is structurally smaller than the comparators' by that region's melt.</w:t>
+        <w:t xml:space="preserve">BRICK 2.0 and Ladrillo now have completely different glacier modules. MAGICC and Ladrillo both use the formulation from Nauels 2017 Eq. 3; where they differ is the three regions used in Ladrillo. MAGICC's committed 1850 melt is 2.8–13.6 cm, Ladrillo's 6.3–14.6 cm. The two models also start from different total glacier inventories. BRICK 2.0's calibrated initial volume, at its 1850 start, centres on 42 cm SLE (5–95% 32–52), inherited from Wigley and Raper (2005), whose assumed initial volume is 40 cm (2σ 30–50). 38 cm remain in 2000 after 4 cm of melt; Ladrillo constrains the remaining glacier ice at 2000 to 29.0 ± 6.0 cm SLE on its target scope (Farinotti 2019 excluding RGI region 5, with Millan 2022 agreeing). The full-RGI Farinotti value is 32.4 ± 8.4 cm. The comparators' inventories are larger and differ in scope: FACTS's AR5 glacier module caps cumulative melt at 31.6 cm SLE (AR5 Table 4.2's 41.2 cm less 9.63 cm; its regional fingerprints include the Greenland periphery and no Antarctic periphery), which every SSP5-8.5 sample reaches by 2300; MAGICC's tabulated equilibrium curves reach 35.6–45.1 cm SLE across their 15 tunes, measured from 1850; net of MAGICC's own 9.4 cm of melt over 1850–2000 that is roughly 26–36 cm at 2000, bracketing Farinotti. Ladrillo's glaciers exclude RGI 05 (about 3.4 cm SLE, carried inside its Greenland ice-sheet mask), so its glacier contribution is structurally smaller than the comparators' by that region's melt.</w:t>
       </w:r>
     </w:p>
     <w:p>

</xml_diff>

<commit_message>
Deliverable: 'tap' renamed 'above-threshold discharge channel' (3 sites); Marcus's Word edits synced
Co-Authored-By: Claude Opus 5 <noreply@anthropic.com>
</commit_message>
<xml_diff>
--- a/deliverables/LadrilloUpdateDescription_L24.docx
+++ b/deliverables/LadrilloUpdateDescription_L24.docx
@@ -32,7 +32,7 @@
         <w:pStyle w:val="BodyText"/>
       </w:pPr>
       <w:r>
-        <w:t xml:space="preserve">As a derivative of BRICK, Ladrillo and BRICK do share a similar niche. However, while Ladrillo generally keeps to BRICK’s design philosophy of physically based components calibrated on the historical record, it does depart from that philosophy in two places that observations cannot inform, namely a Greenland commitment above a threshold, informed by SICOPOLIS, and local-to-global temperature amplification, informed by CMIP6. Ladrillo also extended some of BRICK’s observational constraints (an Antarctic likelihood from 1900 rather than IMBIE's 1992–2017; Dangendorf, GlaMBIE, GRACE and Mouginot added), and is calibrated to a current version of FaIR (2.2.4, calibration 1.6.0, 841-member climate ensemble) rather than being coupled to SNEASY.</w:t>
+        <w:t xml:space="preserve">As a derivative of BRICK, Ladrillo and BRICK do share a similar niche. However, while Ladrillo generally keeps to BRICK’s design philosophy of physically based components calibrated on the historical record, it does depart from that philosophy in two places that observations cannot inform, namely a Greenland commitment above a threshold, informed by SICOPOLIS, and global-to-local temperature amplification, informed by CMIP6. Ladrillo also extended some of BRICK’s observational constraints (an Antarctic likelihood from 1900 rather than IMBIE's 1992–2017; Dangendorf, GlaMBIE, GRACE and Mouginot added), and is calibrated to a current version of FaIR (2.2.4, calibration 1.6.0, 841-member climate ensemble) rather than being coupled to SNEASY.</w:t>
       </w:r>
     </w:p>
     <w:p>
@@ -848,7 +848,7 @@
         <w:pStyle w:val="BodyText"/>
       </w:pPr>
       <w:r>
-        <w:t xml:space="preserve">¹ Ice sheets start in 1990 (Greenland) and 2002 (Antarctica). ² Calibrated to process-model projections (ISMIP6, LARMIP, DeConto, SICOPOLIS, PISM, GlacierMIP2) or structured expert judgement. ³ Observations plus AR6 projections. ⁴ Except two priors: the Greenland tap (SICOPOLIS) and temperature amplification (CMIP6). ⁵ Ice-sheet modules extrapolate the 2080–2100 rate or sample 21st-century projections; ProFSea's Greenland uses the FACTS implementation. ⁶ A 2100 model, extended to 2300 by extrapolation.</w:t>
+        <w:t xml:space="preserve">¹ Ice sheets start in 1990 (Greenland) and 2002 (Antarctica). ² Calibrated to process-model projections (ISMIP6, LARMIP, DeConto, SICOPOLIS, PISM, GlacierMIP2) or structured expert judgement. ³ Observations plus AR6 projections. ⁴ Except two priors: Greenland's above-threshold discharge channel (SICOPOLIS) and temperature amplification (CMIP6). ⁵ Ice-sheet modules extrapolate the 2080–2100 rate or sample 21st-century projections; ProFSea's Greenland uses the FACTS implementation. ⁶ A 2100 model, extended to 2300 by extrapolation.</w:t>
       </w:r>
     </w:p>
     <w:p>
@@ -1708,7 +1708,7 @@
         <w:pStyle w:val="FirstParagraph"/>
       </w:pPr>
       <w:r>
-        <w:t xml:space="preserve">BRICK 2.0's glacier model uses a Wigley-Raper equation that is always melting when above its equilibrium temperature. Ladrillo replaces it with a Mengel-style equilibrium volume</w:t>
+        <w:t xml:space="preserve">BRICK 2.0's glacier model uses a Wigley-Raper equation that is always melting when warmer than its preindustrial equilibrium. Ladrillo replaces it with a Mengel-style equilibrium volume</w:t>
       </w:r>
       <w:r>
         <w:t xml:space="preserve"> </w:t>
@@ -1759,7 +1759,7 @@
         <w:t xml:space="preserve"> </w:t>
       </w:r>
       <w:r>
-        <w:t xml:space="preserve">Ice volume at 2000: 9.4 ± 2.4 cm SLE. Smaller, faster-responding bodies with weak amplification (prior 1.45). It equilibrates quickly enough that its committed volume is close to its realised volume through most of the record.</w:t>
+        <w:t xml:space="preserve">Ice volume at 2000: 9.4 ± 2.4 cm SLE. Smaller, faster-responding bodies with a smaller amplification (prior 1.45). It equilibrates quickly enough that its committed volume is close to its realised volume through most of the record.</w:t>
       </w:r>
     </w:p>
     <w:p>
@@ -1797,13 +1797,13 @@
           <w:b/>
           <w:bCs/>
         </w:rPr>
-        <w:t xml:space="preserve">Compared with BRICK 2.0 and MAGICC.</w:t>
+        <w:t xml:space="preserve">Compared with other emulators.</w:t>
       </w:r>
       <w:r>
         <w:t xml:space="preserve"> </w:t>
       </w:r>
       <w:r>
-        <w:t xml:space="preserve">BRICK 2.0 and Ladrillo now have completely different glacier modules. MAGICC and Ladrillo both use the formulation from Nauels 2017 Eq. 3; where they differ is the three regions used in Ladrillo. MAGICC's committed 1850 melt is 2.8–13.6 cm, Ladrillo's 6.3–14.6 cm. The two models also start from different total glacier inventories. BRICK 2.0's calibrated initial volume, at its 1850 start, centres on 42 cm SLE (5–95% 32–52), inherited from Wigley and Raper (2005), whose assumed initial volume is 40 cm (2σ 30–50). 38 cm remain in 2000 after 4 cm of melt; Ladrillo constrains the remaining glacier ice at 2000 to 29.0 ± 6.0 cm SLE on its target scope (Farinotti 2019 excluding RGI region 5, with Millan 2022 agreeing). The full-RGI Farinotti value is 32.4 ± 8.4 cm. Other emulators' inventories at 2000: FACTS's AR5 glacier module caps cumulative melt at 31.6 cm SLE, which every SSP5-8.5 sample reaches by 2300; MAGICC's equilibrium curves imply roughly 26–36 cm across their 15 tunes, net of its own 9.4 cm of melt over 1850–2000. These figures are not on a single scope, since not every model covers all 19 RGI regions — MAGICC's Marzeion 2012 basis omits the Antarctic periphery (RGI 19) and Ladrillo the Greenland periphery (RGI 05) — so small differences between them should not be over-read.</w:t>
+        <w:t xml:space="preserve">BRICK 2.0 and Ladrillo now have completely different glacier modules. MAGICC and Ladrillo both use the formulation from Nauels 2017 Eq. 3; where they differ is the three regions used in Ladrillo. MAGICC's committed 1850 melt is 2.8–13.6 cm, Ladrillo's 6.3–14.6 cm. Ladrillo constrains the remaining glacier ice at 2000 to 29.0 ± 6.0 cm SLE based on Farinotti 2019 excluding RGI region 5 (Millan 2022 has similar glacier ice numbers). The full-RGI Farinotti value is 32.4 ± 8.4 cm. Other emulators' inventories at 2000: BRICK 2.0 has about 38 cm of ice remaining. FACTS's AR5 glacier module caps cumulative melt at 31.6 cm SLE, which every SSP5-8.5 sample reaches by 2300; MAGICC's equilibrium curves imply roughly 26–36 cm across their 15 tunes, after about 9 cm of melt over 1850–2000. These figures may not be fully comparable, since not every model covers all 19 RGI regions (e.g., MAGICC's Marzeion 2012 basis omits the Antarctic periphery (RGI 19) and Ladrillo the Greenland periphery (RGI 05)).</w:t>
       </w:r>
     </w:p>
     <w:p>
@@ -1821,7 +1821,7 @@
         <w:t xml:space="preserve"> </w:t>
       </w:r>
       <w:r>
-        <w:t xml:space="preserve">Neither BRICK nor FACTS can regrow glacial ice, but MAGICC and Ladrillo can. The equations governing melt are:</w:t>
+        <w:t xml:space="preserve">Ladrillo does have the potential to regrow glacier ice after cooling: MAGICC and SURFER are the only two sea level emulators from SLEIP that can do the same. The equations governing melt are:</w:t>
       </w:r>
     </w:p>
     <w:p>
@@ -1943,13 +1943,13 @@
           <w:b/>
           <w:bCs/>
         </w:rPr>
-        <w:t xml:space="preserve">High-basin volume tap.</w:t>
+        <w:t xml:space="preserve">Above-threshold discharge channel.</w:t>
       </w:r>
       <w:r>
         <w:t xml:space="preserve"> </w:t>
       </w:r>
       <w:r>
-        <w:t xml:space="preserve">A post-2100 commitment above a threshold: V = 564 cm, τ = 800 yr, onset 4.69 K, two stages, whole-sheet. The tap does not fire until temperatures exceed the onset. It cannot be calibrated on observations, so the parameters were informed by ISMIP6 at 2100 and SICOPOLIS at 2300 and 3001. It is included in every projection here, contributing 35.1 cm to the SSP5-8.5 total at 2300 on the joint arm this document reports throughout, and nothing at SSP1-2.6 (exactly zero) or SSP2-4.5 (+0.04 cm).</w:t>
+        <w:t xml:space="preserve">A third discharge channel on the high basin, distinct from the slow channel above, carrying a post-2100 commitment above a threshold: V = 564 cm, τ = 800 yr, onset 4.69 K, two stages, whole-sheet. It does not open until temperatures exceed the onset. It cannot be calibrated on observations, so the parameters were informed by ISMIP6 at 2100 and SICOPOLIS at 2300 and 3001. It is included in every projection here, contributing 35.1 cm to the SSP5-8.5 total at 2300 on the joint arm this document reports throughout, and nothing at SSP1-2.6 (exactly zero) or SSP2-4.5 (+0.04 cm).</w:t>
       </w:r>
     </w:p>
     <w:p>
@@ -4229,7 +4229,7 @@
         <w:t xml:space="preserve"> </w:t>
       </w:r>
       <w:r>
-        <w:t xml:space="preserve">Ladrillo L24 and BRICK 2.0 at 2300 on the seven van Vuuren markers, each drawn twice — on the shared FaIR driver (filled) and on MAGICC's own 600-member climate (open), with the connector showing the swap — against MAGICC-SLR. Same posterior, tap and draws on both climates; FACTS has no MAGICC-climate arm and is not drawn.</w:t>
+        <w:t xml:space="preserve">Ladrillo L24 and BRICK 2.0 at 2300 on the seven van Vuuren markers, each drawn twice — on the shared FaIR driver (filled) and on MAGICC's own 600-member climate (open), with the connector showing the swap — against MAGICC-SLR. Same posterior, above-threshold channel and draws on both climates; FACTS has no MAGICC-climate arm and is not drawn.</w:t>
       </w:r>
     </w:p>
     <w:bookmarkEnd w:id="49"/>

</xml_diff>

<commit_message>
Propagate the one-departure framing: Table 1 note 4, Greenland amp line, channel ratio, Table 3 CMIP6 role (glacier-amp attribution corrected), Antarctic-amp paragraph
Co-Authored-By: Claude Opus 5 <noreply@anthropic.com>
</commit_message>
<xml_diff>
--- a/deliverables/LadrilloUpdateDescription_L24.docx
+++ b/deliverables/LadrilloUpdateDescription_L24.docx
@@ -32,7 +32,7 @@
         <w:pStyle w:val="BodyText"/>
       </w:pPr>
       <w:r>
-        <w:t xml:space="preserve">As a derivative of BRICK, Ladrillo and BRICK do share a similar niche. However, while Ladrillo generally keeps to BRICK’s design philosophy of physically based components calibrated on the historical record, it does depart from that philosophy in two places that observations cannot inform, namely a Greenland commitment above a threshold, informed by SICOPOLIS, and global-to-local temperature amplification, informed by CMIP6. Ladrillo also extended some of BRICK’s observational constraints (an Antarctic likelihood from 1900 rather than IMBIE's 1992–2017; Dangendorf, GlaMBIE, GRACE and Mouginot added), and is calibrated to a current version of FaIR (2.2.4, calibration 1.6.0, 841-member climate ensemble) rather than being coupled to SNEASY.</w:t>
+        <w:t xml:space="preserve">As a derivative of BRICK, Ladrillo and BRICK do share a similar niche. However, while Ladrillo generally keeps to BRICK’s design philosophy of physically based components calibrated on the historical record, it does depart from that philosophy in one place that observations cannot inform, namely a Greenland commitment above a threshold, informed by SICOPOLIS. Ladrillo also extended some of BRICK’s observational constraints (an Antarctic likelihood from 1900 rather than IMBIE's 1992–2017; Dangendorf, GlaMBIE, GRACE and Mouginot added), updated the Antarctic global-to-local amplification from the paleo-equilibrium ratio to a CMIP6 based one, added global-to-local amplification for Greenland and the glacier regions, and is calibrated to a current version of FaIR (2.2.4, calibration 1.6.0, 841-member climate ensemble) rather than being coupled to SNEASY.</w:t>
       </w:r>
     </w:p>
     <w:p>
@@ -848,7 +848,7 @@
         <w:pStyle w:val="BodyText"/>
       </w:pPr>
       <w:r>
-        <w:t xml:space="preserve">¹ Ice sheets start in 1990 (Greenland) and 2002 (Antarctica). ² Calibrated to process-model projections (ISMIP6, LARMIP, DeConto, SICOPOLIS, PISM, GlacierMIP2) or structured expert judgement. ³ Observations plus AR6 projections. ⁴ Except two priors: Greenland's above-threshold discharge channel (SICOPOLIS) and temperature amplification (CMIP6). ⁵ Ice-sheet modules extrapolate the 2080–2100 rate or sample 21st-century projections; ProFSea's Greenland uses the FACTS implementation. ⁶ A 2100 model, extended to 2300 by extrapolation.</w:t>
+        <w:t xml:space="preserve">¹ Ice sheets start in 1990 (Greenland) and 2002 (Antarctica). ² Calibrated to process-model projections (ISMIP6, LARMIP, DeConto, SICOPOLIS, PISM, GlacierMIP2) or structured expert judgement. ³ Observations plus AR6 projections. ⁴ Except the above-threshold discharge channel (ISMIP6/SICOPOLIS) and the Antarctic amplification prior (CMIP6); the Greenland and glacier-region amplifications are fitted to observations. ⁵ Ice-sheet modules extrapolate the 2080–2100 rate or sample 21st-century projections; ProFSea's Greenland uses the FACTS implementation. ⁶ A 2100 model, extended to 2300 by extrapolation.</w:t>
       </w:r>
     </w:p>
     <w:p>
@@ -1931,7 +1931,7 @@
         <w:t xml:space="preserve"> </w:t>
       </w:r>
       <w:r>
-        <w:t xml:space="preserve">The ratio of Greenland warming to global warming is itself a function of temperature.</w:t>
+        <w:t xml:space="preserve">The ratio of Greenland warming to global warming is centred on its observed level (1.92, with a prior width taken from the CMIP6 spread) and falls with warming in proportion to the CMIP6 ratio, which declines from 1.50 to 1.28 over 0.75–2.75 K of global warming; holding it constant instead would raise Greenland by 1–9 cm depending on scenario and horizon.</w:t>
       </w:r>
     </w:p>
     <w:p>
@@ -1949,7 +1949,7 @@
         <w:t xml:space="preserve"> </w:t>
       </w:r>
       <w:r>
-        <w:t xml:space="preserve">A third discharge channel on the high basin, distinct from the slow channel above, carrying a post-2100 commitment above a threshold: V = 564 cm, τ = 800 yr, onset 4.69 K, two stages, whole-sheet. It does not open until temperatures exceed the onset. It cannot be calibrated on observations, so the parameters were informed by ISMIP6 at 2100 and SICOPOLIS at 2300 and 3001. It is included in every projection here, contributing 35.1 cm to the SSP5-8.5 total at 2300 on the joint arm this document reports throughout, and nothing at SSP1-2.6 (exactly zero) or SSP2-4.5 (+0.04 cm).</w:t>
+        <w:t xml:space="preserve">A third discharge channel on the high basin, distinct from the slow channel above, carrying a post-2100 commitment above a threshold: V = 564 cm, τ = 800 yr, onset 4.69 K, two stages, whole-sheet. It does not open until temperatures exceed the onset. It cannot be calibrated on observations, so the parameters were informed by ISMIP6 at 2100 and SICOPOLIS at 2300 and 3001. It is included in every projection here, contributing 35.1 cm to the SSP5-8.5 total at 2300 on the joint arm this document reports throughout, and nothing at SSP1-2.6 (exactly zero) or SSP2-4.5 (+0.04 cm). Without it, Greenland's SSP5-8.5 to SSP2-4.5 ratio at 2300 is 2.7, against 7.9–31.9 across the process-model literature.</w:t>
       </w:r>
     </w:p>
     <w:p>
@@ -2007,9 +2007,9 @@
         <w:tblLook w:firstRow="1" w:lastRow="0" w:firstColumn="0" w:lastColumn="0" w:noHBand="0" w:noVBand="0" w:val="0020"/>
       </w:tblPr>
       <w:tblGrid>
-        <w:gridCol w:w="1188"/>
-        <w:gridCol w:w="4276"/>
-        <w:gridCol w:w="2455"/>
+        <w:gridCol w:w="1108"/>
+        <w:gridCol w:w="4039"/>
+        <w:gridCol w:w="2772"/>
       </w:tblGrid>
       <w:tr>
         <w:trPr>
@@ -2459,7 +2459,7 @@
               <w:pStyle w:val="Compact"/>
             </w:pPr>
             <w:r>
-              <w:t xml:space="preserve">Priors on the per-block glacier amplification and on Antarctic amplification.</w:t>
+              <w:t xml:space="preserve">Prior on the Antarctic amplification; the warming-dependence and prior width of the Greenland amplification (its level is observed). The glacier-region amplifications are fitted to observations; the CMIP6 glacier panel served as a check only.</w:t>
             </w:r>
           </w:p>
         </w:tc>
@@ -2860,13 +2860,13 @@
           <w:b/>
           <w:bCs/>
         </w:rPr>
-        <w:t xml:space="preserve">Antarctic amplification is a key parameter.</w:t>
+        <w:t xml:space="preserve">Antarctic amplification is a key parameter, and no observation can set it.</w:t>
       </w:r>
       <w:r>
         <w:t xml:space="preserve"> </w:t>
       </w:r>
       <w:r>
-        <w:t xml:space="preserve">Stock DAIS hard-codes 1.196. Ladrillo samples it under N(1.09, 0.180), the measured CMIP6 between-model spread. The parameter is not strongly constrained by observation and its leverage is strongly scenario-dependent: across the posterior draws, a one-sigma change moves Antarctic sea level at 2300 by about 58 cm on SSP2-4.5 (roughly 23% of that scenario's total) but only about 24 cm on SSP5-8.5 (under 5%), because by SSP5-8.5 the Antarctic response is already past the thresholds where amplification matters.</w:t>
+        <w:t xml:space="preserve">DAIS maps global to Antarctic surface temperature through one ratio. Stock DAIS hard-codes 1.196, the inverted paleo regression — an equilibrium amplification applied to a multi-century transient. Ladrillo samples the transient ratio under N(1.09, 0.180), the CMIP6 between-model spread. The posterior returns the prior (posterior sd 0.95 of prior sd at either width tried): the parameter multiplies the temperature anomaly, so its footprint over the observed record is 0.08 °C against 0.46 °C at 2300, and a regression of the Antarctic temperature record on global temperature has a slope standard error of 0.27–0.54, wider than the CMIP6 spread. Its leverage is strongly scenario-dependent: a one-sigma change moves Antarctic sea level at 2300 by about 58 cm on SSP2-4.5 (roughly 23% of that scenario's total) but only about 24 cm on SSP5-8.5 (under 5%), because SSP5-8.5 is already past the thresholds where amplification matters. Reverting to DAIS's 1.196 on the shipped posterior adds 17 cm to the SSP2-4.5 total at 2100 and 42 cm at 2300 (9 and 19 cm on SSP5-8.5). The remaining exposure is which Antarctic temperature the ratio should describe: CMIP6 gives 0.92–0.98 for the polar cap including the Southern Ocean and 1.10–1.16 for land only, a span of 0.24 that is worth about 90 cm on SSP2-4.5 at 2300.</w:t>
       </w:r>
     </w:p>
     <w:p>
@@ -4257,7 +4257,7 @@
         <w:t xml:space="preserve"> </w:t>
       </w:r>
       <w:r>
-        <w:t xml:space="preserve">At the High marker the three models agree at 2100 (Ladrillo 72 cm, BRICK 2.0 82, MAGICC-SLR 62). By 2300 Ladrillo and BRICK 2.0 sit together (439 and 414 cm, median) well below MAGICC-SLR (570 cm), and the gap is Antarctica: 255 and 248 cm against MAGICC's 382. Driving both on MAGICC's own climate moves their totals by only 15–20 cm (to 425 and 393; FIG 11), so the difference is the ice-sheet modules, not the climate. Ladrillo's 2300 Antarctic spread is dominated by the prior for</w:t>
+        <w:t xml:space="preserve">For the High scenario, the three models are fairly similar at 2100 (Ladrillo 72 cm, BRICK 2.0 82, MAGICC-SLR 62). By 2300 Ladrillo and BRICK 2.0 sit together (439 and 414 cm, median) well below MAGICC-SLR (570 cm), and the gap is due to Antarctica: 255 and 248 cm against MAGICC's 382. Driving both on MAGICC's own climate actually decreases their totals by 15–20 cm mainly due to thermal expansion (to 425 and 393; FIG 11), so the difference is the ice-sheet modules, not the climate. Ladrillo's 2300 Antarctic spread is dominated by the prior for</w:t>
       </w:r>
       <w:r>
         <w:t xml:space="preserve"> </w:t>

</xml_diff>

<commit_message>
markers -> scenarios in five figures and the alt-texts; FACTS climate sentence corrected to the injected FaIR driver
Co-Authored-By: Claude Opus 5 <noreply@anthropic.com>
</commit_message>
<xml_diff>
--- a/deliverables/LadrilloUpdateDescription_L24.docx
+++ b/deliverables/LadrilloUpdateDescription_L24.docx
@@ -24,7 +24,7 @@
         <w:pStyle w:val="BodyText"/>
       </w:pPr>
       <w:r>
-        <w:t xml:space="preserve">Ladrillo occupies a distinct niche among current sea level emulators. Of the seven emulators in the SLEIP intercomparison, only three carry a hindcast of every component starting in 1900 or earlier: BRICK 2.0, SURFER, and MP25. Of these three, SURFER's historical total runs outside the observational range in SLEIP's own assessment, and MP25 is a statistical fit to the Frederikse reconstruction that projects only to 2100, leaving BRICK and Ladrillo as the two models which run 1900-2300 and match observations. MAGICC-SLR and FRISIA start their ice sheets in 1990 and 2002 and ProFSea starts in 2007, and the FACTS workflow starts in 2005. Some other limitations of other emulators are that FACTS's ice-sheet modules either extrapolate or sample from 21st-century projections and that MAGICC-SLR can only be run on MAGICC's own climate.</w:t>
+        <w:t xml:space="preserve">Ladrillo occupies a distinct niche among current sea level emulators. Of the seven emulators in the SLEIP intercomparison, only three carry a hindcast of every component starting in 1900 or earlier: BRICK 2.0, SURFER, and MP25. Of these three, SURFER's historical total runs outside the observational range in SLEIP's own assessment, and MP25 is a statistical fit to the Frederikse reconstruction that projects only to 2100, leaving BRICK as the only SLEIP models which both runs 1900-2300 and matches observed total sea level. MAGICC-SLR and FRISIA start their ice sheets in 1990 and 2002, ProFSea starts in 2007, and the FACTS workflow starts in 2005. Some other limitations of other emulators are that FACTS's ice-sheet modules either extrapolate or sample from 21st-century projections and that MAGICC-SLR can only be run on MAGICC's own climate.</w:t>
       </w:r>
     </w:p>
     <w:p>
@@ -848,7 +848,7 @@
         <w:pStyle w:val="BodyText"/>
       </w:pPr>
       <w:r>
-        <w:t xml:space="preserve">¹ Ice sheets start in 1990 (Greenland) and 2002 (Antarctica). ² Calibrated to process-model projections (ISMIP6, LARMIP, DeConto, SICOPOLIS, PISM, GlacierMIP2) or structured expert judgement. ³ Observations plus AR6 projections. ⁴ Except the above-threshold discharge channel (ISMIP6/SICOPOLIS) and the Antarctic amplification prior (CMIP6); the Greenland and glacier-region amplifications are fitted to observations. ⁵ Ice-sheet modules extrapolate the 2080–2100 rate or sample 21st-century projections; ProFSea's Greenland uses the FACTS implementation. ⁶ A 2100 model, extended to 2300 by extrapolation.</w:t>
+        <w:t xml:space="preserve">¹ Ice sheets start in 1990 (Greenland) and 2002 (Antarctica). ² Calibrated to process-model projections (ISMIP6, LARMIP, DeConto, SICOPOLIS, PISM, GlacierMIP2) or structured expert judgement. ³ Observations plus AR6 projections. ⁴ Except the above-threshold discharge channel (ISMIP6/SICOPOLIS) and the Antarctic amplification prior (CMIP6). ⁵ Ice-sheet modules extrapolate the 2080–2100 rate or sample 21st-century projections; ProFSea's Greenland uses the FACTS implementation. ⁶ A 2100 model, extended to 2300 by extrapolation.</w:t>
       </w:r>
     </w:p>
     <w:p>
@@ -1664,7 +1664,7 @@
         <w:pStyle w:val="BodyText"/>
       </w:pPr>
       <w:r>
-        <w:t xml:space="preserve">⁷ Calibrated initial volume 42 cm (5–95% 32–52) at the 1850 start (Wigley and Raper's assumed 40 ± 10), less BRICK's own 4.0 cm of melt to 2000 (0.7 cm of it before 1900). ⁸ Cumulative-melt cap from AR5 Table 4.2, less the Antarctic periphery. ⁹ Equilibrium curves reach 35.6–45.1 cm at 1850 across the 15 tunes, less MAGICC's own 9.4 cm (5–95% 4.7–13.2) of melt to 2000. ¹⁰ Farinotti 2019 on Ladrillo's scope, which excludes RGI 05 (3.4 cm, carried in the Greenland mask). ¹¹ Two channels (SMB, discharge) in each of two basins. ¹² AR5 (parametric), LARMIP (response functions), DeConto (sampled), Bamber (expert judgement).</w:t>
+        <w:t xml:space="preserve">⁷ Calibrated initial volume 42 cm (5–95% 32–52) at the 1850 start (Wigley and Raper's assumed 40 ± 10), less BRICK's own 4.0 cm of melt to 2000 (0.7 cm of it before 1900). ⁸ Cumulative-melt cap from AR5 Table 4.2, less the Antarctic periphery. ⁹ Equilibrium curves reach 35.6–45.1 cm at 1850 across the 15 tunes, less MAGICC's own 9.4 cm (5–95% 4.7–13.2) of melt to 2000. ¹⁰ Farinotti 2019 on Ladrillo's scope, which excludes RGI 05 (3.4 cm, included in the Greenland ice sheet). ¹¹ Two channels (SMB, discharge) in each of two basins. ¹² AR5 (parametric), LARMIP (response functions), DeConto (sampled), Bamber (expert judgement).</w:t>
       </w:r>
     </w:p>
     <w:p>
@@ -1682,7 +1682,7 @@
         <w:t xml:space="preserve"> </w:t>
       </w:r>
       <w:r>
-        <w:t xml:space="preserve">This document describes posterior L24. Units are cm. Two baseline windows are used: 1995-2005 for the hindcast section (FIG 1, the RMSE table, and the 2024 levels); and 1995-2014 for the projection sections. Model version FaIR 2.2.4 (fair-calibrate 1.6.0). Observational vintages are given in the calibration-data table below. Both hindcast arms are reproducible: every random seed is fixed and is recorded inside the output file read by each figure, so any number here can be regenerated from the artifact alone.</w:t>
+        <w:t xml:space="preserve">This document describes posterior L24. Units are cm. Two baseline windows are used: 1995-2005 for the hindcast section (FIG 1, the RMSE table, and the 2024 levels); and 1995-2014 for the projection sections. Model version FaIR 2.2.4 (fair-calibrate 1.6.0). Both hindcast arms are reproducible: every random seed is fixed and is recorded inside the output file read by each figure, so any number in this document can be regenerated precisely.</w:t>
       </w:r>
     </w:p>
     <w:bookmarkStart w:id="11" w:name="ladrillo-structural-updates"/>
@@ -1759,7 +1759,7 @@
         <w:t xml:space="preserve"> </w:t>
       </w:r>
       <w:r>
-        <w:t xml:space="preserve">Ice volume at 2000: 9.4 ± 2.4 cm SLE. Smaller, faster-responding bodies with a smaller amplification (prior 1.45). It equilibrates quickly enough that its committed volume is close to its realised volume through most of the record.</w:t>
+        <w:t xml:space="preserve">Ice volume at 2000: 9.4 ± 2.4 cm SLE. Smaller, faster-responding bodies with a smaller amplification (prior 1.45). This block equilibrates quickly enough that its committed volume is close to its realised volume through most of the record.</w:t>
       </w:r>
     </w:p>
     <w:p>
@@ -1785,7 +1785,7 @@
         <w:pStyle w:val="BodyText"/>
       </w:pPr>
       <w:r>
-        <w:t xml:space="preserve">These three blocks cover 18 of the 19 RGI regions; RGI 05, the Greenland Periphery, is excluded, as it is not included in Frederikse's glacier estimate and RGI 05 also falls inside the Greenland ice-sheet mask.</w:t>
+        <w:t xml:space="preserve">These three blocks cover 18 of the 19 RGI regions; RGI 05, the Greenland Periphery, is excluded, as it is not included in Frederikse's glacier estimate but it is included in the Greenland ice-sheet module.</w:t>
       </w:r>
     </w:p>
     <w:p>
@@ -1889,13 +1889,13 @@
           <w:b/>
           <w:bCs/>
         </w:rPr>
-        <w:t xml:space="preserve">Two channels (fast / slow).</w:t>
+        <w:t xml:space="preserve">Two channels (SMB / dynamic discharge).</w:t>
       </w:r>
       <w:r>
         <w:t xml:space="preserve"> </w:t>
       </w:r>
       <w:r>
-        <w:t xml:space="preserve">Greenland melt occurs through surface-mass-balance response (fast) and outlet/dynamic discharge (slow). Two channels allow for that partition. "Fast" names which physics the channel carries, not a short time constant — the surface-mass-balance channel drains a multi-millennial commitment, and at the optimum its response time is 86 years.</w:t>
+        <w:t xml:space="preserve">Greenland melt occurs through surface-mass-balance response (50 year relaxation and present-day temperatures) and outlet/dynamic discharge (170 year relaxation). Two channels allow for that partition.</w:t>
       </w:r>
     </w:p>
     <w:p>
@@ -1913,7 +1913,7 @@
         <w:t xml:space="preserve"> </w:t>
       </w:r>
       <w:r>
-        <w:t xml:space="preserve">The sheet is split into an active basin (SW+CW+CE+SE+NW) and a high basin (NO+NE), each carrying its own fast/slow channel pair, with sector shares scored against Mouginot.</w:t>
+        <w:t xml:space="preserve">The sheet is split into an active basin (SW+CW+CE+SE+NW) and a high basin (NO+NE), each carrying its own SMB/discharge channel pair, with sector shares scored against Mouginot.</w:t>
       </w:r>
     </w:p>
     <w:p>
@@ -1931,7 +1931,7 @@
         <w:t xml:space="preserve"> </w:t>
       </w:r>
       <w:r>
-        <w:t xml:space="preserve">The ratio of Greenland warming to global warming is centred on its observed level (1.92, with a prior width taken from the CMIP6 spread) and falls with warming in proportion to the CMIP6 ratio, which declines from 1.50 to 1.28 over 0.75–2.75 K of global warming; holding it constant instead would raise Greenland by 1–9 cm depending on scenario and horizon.</w:t>
+        <w:t xml:space="preserve">The ratio of Greenland warming to global warming is centred on its observed level (1.92, with a prior width taken from the CMIP6 spread) and falls with warming in proportion to the CMIP6 ratio, which declines from 1.50 to 1.28 over 0.75–2.75 K of global warming; holding it constant instead would raise Greenland by an additional 1–9 cm depending on scenario and horizon.</w:t>
       </w:r>
     </w:p>
     <w:p>
@@ -1949,7 +1949,7 @@
         <w:t xml:space="preserve"> </w:t>
       </w:r>
       <w:r>
-        <w:t xml:space="preserve">A third discharge channel on the high basin, distinct from the slow channel above, carrying a post-2100 commitment above a threshold: V = 564 cm, τ = 800 yr, onset 4.69 K, two stages, whole-sheet. It does not open until temperatures exceed the onset. It cannot be calibrated on observations, so the parameters were informed by ISMIP6 at 2100 and SICOPOLIS at 2300 and 3001. It is included in every projection here, contributing 35.1 cm to the SSP5-8.5 total at 2300 on the joint arm this document reports throughout, and nothing at SSP1-2.6 (exactly zero) or SSP2-4.5 (+0.04 cm). Without it, Greenland's SSP5-8.5 to SSP2-4.5 ratio at 2300 is 2.7, against 7.9–31.9 across the process-model literature.</w:t>
+        <w:t xml:space="preserve">A third discharge channel on the high basin, enabling another melt mechanism above a threshold temperature: V = 564 cm, τ = 800 yr, onset 4.69 K, two stages, whole-sheet. It has zero effect below the threshold. It cannot be calibrated on observations, so the parameters were informed by ISMIP6 at 2100 and SICOPOLIS at 2300 and 3001. It is included in every projection here, contributing 35.1 cm to the SSP5-8.5 total at 2300 on the joint arm this document reports throughout, and nothing at SSP1-2.6 (exactly zero) or SSP2-4.5 (+0.04 cm). Without it, Greenland's SSP5-8.5 to SSP2-4.5 ratio at 2300 is 2.7, against 7.9–31.9 across the process-model literature.</w:t>
       </w:r>
     </w:p>
     <w:p>
@@ -1967,7 +1967,7 @@
         <w:t xml:space="preserve"> </w:t>
       </w:r>
       <w:r>
-        <w:t xml:space="preserve">The observed Greenland contribution rises quickly from the 1930s to the 1960s, nearly stalls from the 1960s to 1990, then accelerates; BRICK 2.0's single-channel response to global temperature yields an almost uniform rate across the century (0.46–0.49 cm/decade in every 30-year period against an observed 0.67 then 0.23), so it runs about 1 cm low through the 1950s–60s and 0.2 cm low since 2010. Ladrillo reproduces the shape because its fast surface-mass-balance channel responds to Greenland's local warming of about 1.2 °C during 1920–45 (in contrast to 0.2 °C globally), then local cooling through 1990 while the globe warmed. Meanwhile, the slow discharge channel carries the long-term trend. MAGICC similarly splits Greenland into SMB and SID and parameterises against SICOPOLIS, but with 17 parameters between the two, of which 9 vary and each of those takes only 4 distinct values. MAGICC’s Greenland melt module starts in 1990, and underestimates melt relative to observations over the 1990-2026 period.</w:t>
+        <w:t xml:space="preserve">The observed Greenland contribution rises quickly from the 1930s to the 1960s, nearly stalls from the 1960s to 1990, then accelerates; BRICK 2.0's single-channel response to global temperature yields an almost uniform rate across the century (0.46–0.49 cm/decade in every 30-year period against an observed 0.67 then 0.23), so it runs about 1 cm low through the 1950s–60s and 0.2 cm low since 2010. Ladrillo reproduces the shape because its surface-mass-balance channel responds to Greenland's local warming of about 1.2 °C during 1920–45 (in contrast to 0.2 °C globally), then local cooling through 1990 while the globe warmed. Meanwhile, the discharge channel is a steadier source of melt. MAGICC similarly splits Greenland into SMB and SID and parameterises against SICOPOLIS. MAGICC’s Greenland melt module starts in 1990, and underestimates melt relative to observations over the 1990-2026 period.</w:t>
       </w:r>
     </w:p>
     <w:bookmarkEnd w:id="10"/>
@@ -2644,7 +2644,7 @@
         <w:t xml:space="preserve"> </w:t>
       </w:r>
       <w:r>
-        <w:t xml:space="preserve">FaIR 2.2.4 (fair-calibrate 1.6.0), driven by CMIP7 historical emissions 1750–2023 spliced at 2023.5 to MESSAGE-GLOBIOM SSP2-4.5 and harmonized per species. The calibration's fit window runs to 2026, so its last three years are driven by the scenario rather than by the historical emissions inventory — a difference bounded at about 0.002 W/m².</w:t>
+        <w:t xml:space="preserve">FaIR 2.2.4 (fair-calibrate 1.6.0), driven by CMIP7 historical emissions 1750–2023 spliced at 2023.5 to MESSAGE-GLOBIOM SSP2-4.5 and harmonized per species. The calibration's fit window runs to 2026, so its last three years are driven by the scenario rather than by the historical emissions inventory (an effect of only about 0.002 W/m²).</w:t>
       </w:r>
     </w:p>
     <w:p>
@@ -2779,7 +2779,7 @@
         <w:t xml:space="preserve">ais_c</w:t>
       </w:r>
       <w:r>
-        <w:t xml:space="preserve">) are freed under a joint paleo prior. Ladrillo's pre-1990 Antarctic hindcast is far closer to the record than BRICK 2.0's — 1920–1949 bias −0.01 cm against −1.93 cm, and 1950–1992 +0.003 cm against −0.71 cm. BRICK 2.0 also samples its DAIS geometry; a key difference is the constraint, since its Antarctic likelihood is IMBIE 1992–2017 while Ladrillo fits an Antarctic series from 1900.</w:t>
+        <w:t xml:space="preserve">) are freed under a joint paleo prior. Ladrillo's pre-1990 Antarctic hindcast is far closer to the record than BRICK 2.0's (see Figure 1 and Table 4). A key driver of differences between BRICK and Ladrillo is the observational constraint, since BRICK’s Antarctic likelihood is IMBIE 1992–2017 while Ladrillo fits an Antarctic series from 1900.</w:t>
       </w:r>
     </w:p>
     <w:p>
@@ -2860,13 +2860,13 @@
           <w:b/>
           <w:bCs/>
         </w:rPr>
-        <w:t xml:space="preserve">Antarctic amplification is a key parameter, and no observation can set it.</w:t>
+        <w:t xml:space="preserve">Antarctic amplification is a key parameter.</w:t>
       </w:r>
       <w:r>
         <w:t xml:space="preserve"> </w:t>
       </w:r>
       <w:r>
-        <w:t xml:space="preserve">DAIS maps global to Antarctic surface temperature through one ratio. Stock DAIS hard-codes 1.196, the inverted paleo regression — an equilibrium amplification applied to a multi-century transient. Ladrillo samples the transient ratio under N(1.09, 0.180), the CMIP6 between-model spread. The posterior returns the prior (posterior sd 0.95 of prior sd at either width tried): the parameter multiplies the temperature anomaly, so its footprint over the observed record is 0.08 °C against 0.46 °C at 2300, and a regression of the Antarctic temperature record on global temperature has a slope standard error of 0.27–0.54, wider than the CMIP6 spread. Its leverage is strongly scenario-dependent: a one-sigma change moves Antarctic sea level at 2300 by about 58 cm on SSP2-4.5 (roughly 23% of that scenario's total) but only about 24 cm on SSP5-8.5 (under 5%), because SSP5-8.5 is already past the thresholds where amplification matters. Reverting to DAIS's 1.196 on the shipped posterior adds 17 cm to the SSP2-4.5 total at 2100 and 42 cm at 2300 (9 and 19 cm on SSP5-8.5). The remaining exposure is which Antarctic temperature the ratio should describe: CMIP6 gives 0.92–0.98 for the polar cap including the Southern Ocean and 1.10–1.16 for land only, a span of 0.24 that is worth about 90 cm on SSP2-4.5 at 2300.</w:t>
+        <w:t xml:space="preserve">DAIS maps global to Antarctic surface temperature through one ratio. Stock DAIS hard-codes 1.196, the inverted paleo regression which is an equilibrium amplification factor. Ladrillo samples the transient ratio with a prior of N(1.09, 0.180), equal to the CMIP6 ratio and between-model spread. The parameter’s leverage is strongly scenario-dependent: a one-sigma change moves Antarctic sea level at 2300 by about 58 cm on SSP2-4.5 (roughly 23% of that scenario's total) but only about 24 cm on SSP5-8.5 (under 5%), because SSP5-8.5 is already past the thresholds where amplification matters. Reverting to DAIS's 1.196 on the shipped posterior adds 17 cm to the SSP2-4.5 total at 2100 and 42 cm at 2300 (9 and 19 cm on SSP5-8.5).</w:t>
       </w:r>
     </w:p>
     <w:p>
@@ -2959,7 +2959,7 @@
         <w:t xml:space="preserve"> </w:t>
       </w:r>
       <w:r>
-        <w:t xml:space="preserve">Component hindcasts against the observations, 1900–2026, in cm relative to a 1995–2005 baseline. Ladrillo L24 (solid, with its 5–95% band) and BRICK 2.0 (dashed) are both run starting in 1850, plotted from 1900, and driven by the same ssp245harm forcing. The Greenland panel also shows MAGICC-SLR (v7.5.3 + Nauels 2025, dotted, with its 5–95% band) from 1991, the first year its Greenland module is active; it runs on its own emissions-driven climate. The total panel also shows IGCC 2025-indicators GMSL, which is not a calibration target. On the thermal-expansion panel the hatched band above the observation is the most the ocean below 2000 m could add to a 0–2000 m observation (IGCC deep-ocean heat times the observed upper-ocean expansion coefficient; an upper bound). Land-water storage is observational — neither model predicts it, so panel (e) shows the observed series alone and both totals carry it.</w:t>
+        <w:t xml:space="preserve">Component hindcasts against the observations, 1900–2026, in cm relative to a 1995–2005 baseline. Ladrillo L24 (solid, with its 5–95% band) and BRICK 2.0 (dashed) are both run starting in 1850, plotted from 1900, and driven by the same ssp245harm forcing. The Greenland panel also shows MAGICC-SLR (v7.5.3 + Nauels 2025, dotted, with its 5–95% band) from 1991, the first year its Greenland module is active; it runs on its own emissions-driven climate. The total panel also shows IGCC 2025-indicators GMSL, which is not a calibration target. On the thermal-expansion panel the hatched band above the observation is the most the ocean below 2000 m could shift a 0–2000 m observation (IGCC deep-ocean heat times the observed upper-ocean expansion coefficient; an upper bound). Land-water storage is observational — neither model predicts it, so panel (e) shows the observed series alone and both totals include it.</w:t>
       </w:r>
     </w:p>
     <w:p>
@@ -3500,7 +3500,7 @@
         <w:pStyle w:val="BodyText"/>
       </w:pPr>
       <w:r>
-        <w:t xml:space="preserve">Ladrillo is closer to the observations than BRICK 2.0 on every ice component in every window except glaciers over 1950–1992, and the gains are largest in the early eras. Cumulative total sea level rise, comparing the 1900–1904 mean with the 2020–2024 mean: observed +21.00 cm, Ladrillo +19.84, BRICK 2.0 +21.34 — Ladrillo undershoots by 1.2 cm, BRICK overshoots by 0.3. Over the shorter, more recent window — the mean over 2022-2024 relative to the 1995–2005 baseline — both models still run high, but only slightly: observed +7.81 cm, Ladrillo +8.16 (+0.36) and BRICK 2.0 +8.34 (+0.54), with IGCC's independent GMSL estimate between them at +8.21. On the 2006–2025 rate of total sea level, the metric the SLEIP intercomparison reports, Ladrillo gives 0.374 cm/yr and BRICK 2.0 0.389 against 0.392 for the observational target and 0.399 for IGCC (same linear fit, same window).</w:t>
+        <w:t xml:space="preserve">Ladrillo is closer to the observations than BRICK 2.0 on every ice component in every window except glaciers over 1950–1992, and the gains are largest in the early eras. Cumulative total sea level rise, comparing the 1900–1904 mean with the 2020–2024 mean: observed +21.00 cm, Ladrillo +19.84, BRICK 2.0 +21.34 — Ladrillo undershoots by 1.2 cm, BRICK overshoots by 0.3. Over the shorter, more recent window — the mean over 2022-2024 relative to the 1995–2005 baseline — both models still run high, but only slightly: observed +7.81 cm, Ladrillo +8.16 (+0.36) and BRICK 2.0 +8.34 (+0.54), with IGCC's independent GMSL estimate between them at +8.21. On the 2006–2025 rate of total sea level, the metric the SLEIP intercomparison reports, Ladrillo yields 0.374 cm/yr and BRICK 2.0 0.389 against 0.392 for the observational target and 0.399 for IGCC (same linear fit, same window).</w:t>
       </w:r>
     </w:p>
     <w:p>
@@ -3512,13 +3512,13 @@
           <w:b/>
           <w:bCs/>
         </w:rPr>
-        <w:t xml:space="preserve">For thermal expansion Ladrillo overshoots, and the cause is the ocean heat it is given.</w:t>
+        <w:t xml:space="preserve">For thermal expansion Ladrillo overshoots, and the cause is FaIR’s ocean heat.</w:t>
       </w:r>
       <w:r>
         <w:t xml:space="preserve"> </w:t>
       </w:r>
       <w:r>
-        <w:t xml:space="preserve">In both Ladrillo and BRICK thermal expansion is exactly proportional to ocean heat, and the expansion coefficient is not the problem: Ladrillo's is within 3% of the value the observations themselves imply. On the FaIR driver both models overestimate the 1993–2026 thermal-expansion rate (Ladrillo 1.27×, BRICK 2.0 1.17×), because FaIR's ocean heat uptake over that period is 1.22–1.29× the observed 0–2000 m products the target is built from. That excess has two parts of similar size. FaIR's ocean heat is full-depth while the steric target is 0–2000 m, and IGCC's own accounting puts the ocean below 2000 m at 10% of the heat uptake, so a full-depth model is expected to run about 1.10× a 0–2000 m target; the hatched band on FIG 1 shows the most this could add to the observation (0.3 cm by 2024, against Ladrillo's 0.8 cm excess). The remaining 1.10× is FaIR's full-depth heat uptake exceeding IGCC's full-depth estimate — a climate-model question, not a sea-level one, which is why BRICK 2.0 misses by nearly the same amount. Driving Ladrillo with observed 0–2000 m ocean heat — the target's own scope — removes both parts and reproduces the steric record within 4% in every era.</w:t>
+        <w:t xml:space="preserve">In both Ladrillo and BRICK thermal expansion is exactly proportional to ocean heat, despite Ladrillo's expansion coefficient being within 3% of the value the observations imply. On the FaIR driver both models overestimate the 1993–2026 thermal-expansion rate (Ladrillo 1.27×, BRICK 2.0 1.17×), because FaIR's ocean heat uptake over that period is 1.22–1.29× the observed 0–2000 m products the target is built from. That excess has two parts of similar size. FaIR's ocean heat is full-depth while the steric target is 0–2000 m, and IGCC's own accounting puts the ocean below 2000 m at 10% of the heat uptake, so a full-depth model is expected to run about 1.10× a 0–2000 m target; the hatched band on FIG 1 shows the most this could add to the observation (0.3 cm by 2024, almost 40% of Ladrillo's 0.8 cm excess). The remaining 1.10× is FaIR's full-depth heat uptake exceeding IGCC's full-depth estimate. Driving Ladrillo with observed 0–2000 m ocean heat reproduces the steric record within 4% in every era.</w:t>
       </w:r>
     </w:p>
     <w:bookmarkEnd w:id="17"/>
@@ -3536,7 +3536,7 @@
         <w:pStyle w:val="FirstParagraph"/>
       </w:pPr>
       <w:r>
-        <w:t xml:space="preserve">The van Vuuren markers are the primary comparison; the SSPs are a secondary set and the control, being the only scenarios with a prior result to check the pipeline against. All Ladrillo bands are the joint (posterior × FaIR-forcing) arm, width-comparable to MAGICC and FACTS; BRICK 2.0's joint band uses the same cubes, splice pivot and pair seed. Bars are 17–83% (thick) and 5–95% (thin). All four sources carry climate uncertainty — Ladrillo from 841 FaIR configs, MAGICC-SLR from its 600-member AR6 drawnset, FACTS from its own internal ensembles — so the widths are the same kind of object and are comparable; they are not the same ensemble, and both joint arms are prior propagations rather than refits, since each posterior was calibrated under fixed forcing. FACTS is reported relative to baseyear 2005, treated as comparable to the 1995–2014 mean, which is the standing convention for this comparison. In the trajectory figure the two arms share cubes, splice pivot, re-reference and pairing seed, so their widths are directly comparable, but Ladrillo is thinned to 8000 draws against BRICK 2.0's 1000.</w:t>
+        <w:t xml:space="preserve">We report comparisons to both the van Vuuren scenarios and the SSPs. All Ladrillo bands are the joint (posterior × FaIR-forcing) arm, width-comparable to MAGICC and FACTS; BRICK 2.0's joint band uses the same cubes, splice pivot and pair seed. Bars are 17–83% (thick) and 5–95% (thin). All four sources carry climate uncertainty — Ladrillo and BRICK 2.0 from the 841 FaIR configs; FACTS from 200 of the same configs, injected as its climate file in place of its internal AR6-calibrated FaIR 1.6 ensemble, plus its modules' own sampling; MAGICC-SLR from its 600-member AR6 drawnset — so the widths are the same kind of object and are comparable; they are not the same ensemble, and both joint arms are prior propagations rather than refits, since each posterior was calibrated under fixed forcing. FACTS is reported relative to baseyear 2005, treated as comparable to the 1995–2014 mean, which is the standing convention for this comparison. In the trajectory figure the two arms share cubes, splice pivot, re-reference and pairing seed, so their widths are directly comparable, but Ladrillo is thinned to 8000 draws against BRICK 2.0's 1000.</w:t>
       </w:r>
     </w:p>
     <w:p>
@@ -3544,7 +3544,7 @@
         <w:pStyle w:val="BodyText"/>
       </w:pPr>
       <w:r>
-        <w:t xml:space="preserve">On glaciers, Ladrillo and MAGICC-SLR share the Nauels 2017 transient, so differences between Ladrillo and MAGICC reflect differences in reservoir count, driver and posterior; BRICK 2.0 and FACTS are independent there. At Greenland all four formulations differ. For Antarctica and thermal expansion Ladrillo and BRICK 2.0 share a formulation — DAIS for the ice sheet, and expansion proportional to ocean heat — and differ in calibration, while FACTS (LARMIP, DeConto, Bamber, AR5 and emulated ice-sheet modules; a two-layer expansion model) and MAGICC-SLR are separate on both.</w:t>
+        <w:t xml:space="preserve">On glaciers, Ladrillo and MAGICC-SLR share the Nauels 2017 transient, so differences between Ladrillo and MAGICC reflect differences in reservoir count, driver, and posterior; BRICK 2.0 and FACTS are independent there. At Greenland all four formulations differ. For Antarctica and thermal expansion Ladrillo and BRICK 2.0 share a formulation — DAIS for the ice sheet, and expansion proportional to ocean heat — and differ in calibration, while FACTS (LARMIP, DeConto, Bamber, AR5 and emulated ice-sheet modules; a two-layer expansion model) and MAGICC-SLR are separate on both.</w:t>
       </w:r>
     </w:p>
     <w:p>
@@ -3556,7 +3556,7 @@
           <wp:inline>
             <wp:extent cx="5334000" cy="2607733"/>
             <wp:effectExtent b="0" l="0" r="0" t="0"/>
-            <wp:docPr descr="van Vuuren markers by component, 2100" title="" id="19" name="Picture"/>
+            <wp:docPr descr="van Vuuren scenarios by component, 2100" title="" id="19" name="Picture"/>
             <a:graphic>
               <a:graphicData uri="http://schemas.openxmlformats.org/drawingml/2006/picture">
                 <pic:pic>
@@ -3609,7 +3609,7 @@
         <w:t xml:space="preserve"> </w:t>
       </w:r>
       <w:r>
-        <w:t xml:space="preserve">Ladrillo L24 compared against BRICK 2.0, FACTS and MAGICC-SLR across the seven van Vuuren markers at 2100, by component. FACTS is drawn per module; its four workflows differ only in the Antarctic module, so the Total panel shows them as one bracket spanning the workflow medians (thin line: the union of their 5–95%). At 2150 and 2300 (FIGs 3, 4 and 9) only FACTS's climate-driven modules are drawn.</w:t>
+        <w:t xml:space="preserve">Ladrillo L24 compared against BRICK 2.0, FACTS and MAGICC-SLR across the seven van Vuuren scenarios at 2100, by component. FACTS is drawn per module; its four workflows differ only in the Antarctic module, so the Total panel shows them as one bracket spanning the workflow medians (thin line: the union of their 5–95%). At 2150 and 2300 (FIGs 3, 4 and 9) only FACTS's climate-driven modules are drawn.</w:t>
       </w:r>
     </w:p>
     <w:p>
@@ -3621,7 +3621,7 @@
           <wp:inline>
             <wp:extent cx="5334000" cy="2607733"/>
             <wp:effectExtent b="0" l="0" r="0" t="0"/>
-            <wp:docPr descr="van Vuuren markers by component, 2150" title="" id="22" name="Picture"/>
+            <wp:docPr descr="van Vuuren scenarios by component, 2150" title="" id="22" name="Picture"/>
             <a:graphic>
               <a:graphicData uri="http://schemas.openxmlformats.org/drawingml/2006/picture">
                 <pic:pic>
@@ -3686,7 +3686,7 @@
           <wp:inline>
             <wp:extent cx="5334000" cy="2607733"/>
             <wp:effectExtent b="0" l="0" r="0" t="0"/>
-            <wp:docPr descr="van Vuuren markers by component, 2300" title="" id="25" name="Picture"/>
+            <wp:docPr descr="van Vuuren scenarios by component, 2300" title="" id="25" name="Picture"/>
             <a:graphic>
               <a:graphicData uri="http://schemas.openxmlformats.org/drawingml/2006/picture">
                 <pic:pic>
@@ -3804,7 +3804,7 @@
         <w:t xml:space="preserve"> </w:t>
       </w:r>
       <w:r>
-        <w:t xml:space="preserve">Component trajectories across the van Vuuren markers, joint band, Ladrillo relative to BRICK2.0.</w:t>
+        <w:t xml:space="preserve">Component trajectories across the van Vuuren scenarios, joint band, Ladrillo relative to BRICK2.0.</w:t>
       </w:r>
     </w:p>
     <w:p>
@@ -3814,9 +3814,9 @@
       <w:r>
         <w:drawing>
           <wp:inline>
-            <wp:extent cx="5334000" cy="5155273"/>
+            <wp:extent cx="5334000" cy="5090832"/>
             <wp:effectExtent b="0" l="0" r="0" t="0"/>
-            <wp:docPr descr="Glacier response on the declining markers" title="" id="31" name="Picture"/>
+            <wp:docPr descr="Glacier response on the declining scenarios" title="" id="31" name="Picture"/>
             <a:graphic>
               <a:graphicData uri="http://schemas.openxmlformats.org/drawingml/2006/picture">
                 <pic:pic>
@@ -3835,7 +3835,7 @@
                   <pic:spPr bwMode="auto">
                     <a:xfrm>
                       <a:off x="0" y="0"/>
-                      <a:ext cx="5334000" cy="5155273"/>
+                      <a:ext cx="5334000" cy="5090832"/>
                     </a:xfrm>
                     <a:prstGeom prst="rect">
                       <a:avLst/>
@@ -3869,7 +3869,7 @@
         <w:t xml:space="preserve"> </w:t>
       </w:r>
       <w:r>
-        <w:t xml:space="preserve">Ladrillo glacier contribution to 2300 across the seven van Vuuren markers: GMST forcing (a), cumulative glacier melt (b), and the melt rate on the peak-and-decline pathways (c). Regrowth appears when temperature declines below the reservoir equilibrium.</w:t>
+        <w:t xml:space="preserve">Ladrillo glacier contribution to 2300 across the seven van Vuuren scenarios: GMST forcing (a), cumulative glacier melt (b), and the melt rate on the peak-and-decline pathways (c). Regrowth appears when temperature declines below the reservoir equilibrium.</w:t>
       </w:r>
     </w:p>
     <w:p>
@@ -4229,7 +4229,7 @@
         <w:t xml:space="preserve"> </w:t>
       </w:r>
       <w:r>
-        <w:t xml:space="preserve">Ladrillo L24 and BRICK 2.0 at 2300 on the seven van Vuuren markers, each drawn twice — on the shared FaIR driver (filled) and on MAGICC's own 600-member climate (open), with the connector showing the swap — against MAGICC-SLR. Same posterior, above-threshold channel and draws on both climates; FACTS has no MAGICC-climate arm and is not drawn.</w:t>
+        <w:t xml:space="preserve">Ladrillo L24 and BRICK 2.0 at 2300 on the seven van Vuuren scenarios, each drawn twice — on the shared FaIR driver (filled) and on MAGICC's own 600-member climate (open), with the connector showing the swap — against MAGICC-SLR. Same posterior, above-threshold channel and draws on both climates; FACTS has no MAGICC-climate arm and is not drawn.</w:t>
       </w:r>
     </w:p>
     <w:bookmarkEnd w:id="49"/>
@@ -4305,7 +4305,7 @@
         <w:t xml:space="preserve"> </w:t>
       </w:r>
       <w:r>
-        <w:t xml:space="preserve">The glacier change is evident here because it allows regrowth, though on Ladrillo's own FaIR climate that regrowth is very small: measured from each marker's peak to 2300, it reaches only 0.18 cm at vvLN and 0.13 cm at vvML, and is essentially nil on the other markers. The capacity is larger than the realised amount — driven instead by MAGICC's colder climate, the same module regrows 2.2 cm at vvLN — so what limits regrowth here is how far the scenario cools, not the module's willingness to regrow.</w:t>
+        <w:t xml:space="preserve">The glacier change is evident here because it allows regrowth, though on Ladrillo's own FaIR climate that regrowth is very small: measured from each scenario’s peak to 2300, it reaches only 0.18 cm at vvLN and 0.13 cm at vvML, and is essentially nil on the other scenarios. The capacity is larger than the realised amount — driven instead by MAGICC's colder climate, the same module regrows 2.2 cm at vvLN — so what limits regrowth here is how far the scenario cools, not the module's willingness to regrow.</w:t>
       </w:r>
     </w:p>
     <w:p>

</xml_diff>

<commit_message>
FACTS emulandice on the seven van Vuuren scenarios (2100): 378 rows, FIGs 2/7; code-cleanliness pass (comments, labels, default tag L24; outputs byte-identical); document accuracy fixes
Co-Authored-By: Claude Opus 5 <noreply@anthropic.com>
</commit_message>
<xml_diff>
--- a/deliverables/LadrilloUpdateDescription_L24.docx
+++ b/deliverables/LadrilloUpdateDescription_L24.docx
@@ -16,7 +16,7 @@
         <w:pStyle w:val="FirstParagraph"/>
       </w:pPr>
       <w:r>
-        <w:t xml:space="preserve">Ladrillo is a derivative of Tony Wong's BRICK2.0 model. Ladrillo was developed by Marcus C Sarofim using the Claude model. The primary goals for Ladrillo were to add additional observational data, update the glacier module to better match observations and to halt melting for stabilization scenarios, update the Antarctic calibration approach to better match observations prior to 1980, and update the Greenland model to incorporate the different responses of surface melt balance and ice discharge.</w:t>
+        <w:t xml:space="preserve">Ladrillo is a derivative of Tony Wong's BRICK 2.0 model. Ladrillo was developed by Marcus C Sarofim using the Claude model. The primary goals for Ladrillo were to add additional observational data, update the glacier module to better match observations and to halt melting for stabilization scenarios, update the Antarctic calibration approach to better match observations prior to 1980, and update the Greenland model to incorporate the different responses of surface melt balance and ice discharge.</w:t>
       </w:r>
     </w:p>
     <w:p>
@@ -32,7 +32,7 @@
         <w:pStyle w:val="BodyText"/>
       </w:pPr>
       <w:r>
-        <w:t xml:space="preserve">As a derivative of BRICK, Ladrillo and BRICK do share a similar niche. However, while Ladrillo generally keeps to BRICK’s design philosophy of physically based components calibrated on the historical record, it does depart from that philosophy in one place that observations cannot inform, namely a Greenland commitment above a threshold, informed by SICOPOLIS. Ladrillo also extended some of BRICK’s observational constraints (an Antarctic likelihood from 1900 rather than IMBIE's 1992–2017; Dangendorf, GlaMBIE, GRACE and Mouginot added), updated the Antarctic global-to-local amplification from the paleo-equilibrium ratio to a CMIP6 based one, added global-to-local amplification for Greenland and the glacier regions, and is calibrated to a current version of FaIR (2.2.4, calibration 1.6.0, 841-member climate ensemble) rather than being coupled to SNEASY.</w:t>
+        <w:t xml:space="preserve">As a derivative of BRICK, Ladrillo and BRICK do share a similar niche. However, while Ladrillo generally keeps to BRICK’s design philosophy of physically based components calibrated on the historical record, it does depart from that philosophy in one place that observations cannot inform, namely a Greenland commitment above a threshold, informed by SICOPOLIS. Ladrillo also extended some of BRICK’s observational constraints (an Antarctic likelihood from 1900 rather than IMBIE's 1992–2017; Dangendorf, GlaMBIE, GRACE and Mouginot added), updated the Antarctic global-to-local amplification from the paleo-equilibrium ratio to a CMIP6 based one, added global-to-local amplification for Greenland and the glacier regions, and is calibrated to a current version of FaIR 2.2.4 (fair-calibrate 1.6.0, 841-member climate ensemble) rather than being coupled to SNEASY.</w:t>
       </w:r>
     </w:p>
     <w:p>
@@ -1931,7 +1931,7 @@
         <w:t xml:space="preserve"> </w:t>
       </w:r>
       <w:r>
-        <w:t xml:space="preserve">The ratio of Greenland warming to global warming is centred on its observed level (1.92, with a prior width taken from the CMIP6 spread) and falls with warming in proportion to the CMIP6 ratio, which declines from 1.50 to 1.28 over 0.75–2.75 K of global warming; holding it constant instead would raise Greenland by an additional 1–9 cm depending on scenario and horizon.</w:t>
+        <w:t xml:space="preserve">The ratio of Greenland warming to global warming is centred on its observed level (1.92, with a prior width taken from the CMIP6 spread) and falls with warming in proportion to the CMIP6 ratio, which declines from 1.50 to 1.28 over 0.75–2.75 K of global warming; holding it constant instead would raise Greenland by an additional 1 cm (SSP1-2.6, 2300) to 9 cm (SSP5-8.5, 2300) on the fixed-driver arm.</w:t>
       </w:r>
     </w:p>
     <w:p>
@@ -1949,7 +1949,7 @@
         <w:t xml:space="preserve"> </w:t>
       </w:r>
       <w:r>
-        <w:t xml:space="preserve">A third discharge channel on the high basin, enabling another melt mechanism above a threshold temperature: V = 564 cm, τ = 800 yr, onset 4.69 K, two stages, whole-sheet. It has zero effect below the threshold. It cannot be calibrated on observations, so the parameters were informed by ISMIP6 at 2100 and SICOPOLIS at 2300 and 3001. It is included in every projection here, contributing 35.1 cm to the SSP5-8.5 total at 2300 on the joint arm this document reports throughout, and nothing at SSP1-2.6 (exactly zero) or SSP2-4.5 (+0.04 cm). Without it, Greenland's SSP5-8.5 to SSP2-4.5 ratio at 2300 is 2.7, against 7.9–31.9 across the process-model literature.</w:t>
+        <w:t xml:space="preserve">A third discharge channel on the high basin, enabling another melt mechanism above a threshold temperature: V = 564 cm, τ = 800 yr, onset 4.69 K, two stages, whole-sheet. It has zero effect below the threshold. It cannot be calibrated on observations, so the parameters were informed by ISMIP6 at 2100 and SICOPOLIS at 2300 and 3001. It is included in every projection here, contributing 35.1 cm to the SSP5-8.5 total at 2300 on the joint arm this document reports throughout, and nothing at SSP1-2.6 (exactly zero) or SSP2-4.5 (+0.04 cm). Without it, Greenland's SSP5-8.5 to SSP2-4.5 ratio at 2300 is 2.6, against 7.9–31.9 across the process-model literature.</w:t>
       </w:r>
     </w:p>
     <w:p>
@@ -2866,7 +2866,7 @@
         <w:t xml:space="preserve"> </w:t>
       </w:r>
       <w:r>
-        <w:t xml:space="preserve">DAIS maps global to Antarctic surface temperature through one ratio. Stock DAIS hard-codes 1.196, the inverted paleo regression which is an equilibrium amplification factor. Ladrillo samples the transient ratio with a prior of N(1.09, 0.180), equal to the CMIP6 ratio and between-model spread. The parameter’s leverage is strongly scenario-dependent: a one-sigma change moves Antarctic sea level at 2300 by about 58 cm on SSP2-4.5 (roughly 23% of that scenario's total) but only about 24 cm on SSP5-8.5 (under 5%), because SSP5-8.5 is already past the thresholds where amplification matters. Reverting to DAIS's 1.196 on the shipped posterior adds 17 cm to the SSP2-4.5 total at 2100 and 42 cm at 2300 (9 and 19 cm on SSP5-8.5).</w:t>
+        <w:t xml:space="preserve">DAIS maps global to Antarctic surface temperature through one ratio. Stock DAIS hard-codes 1.196, the inverted paleo regression which is an equilibrium amplification factor. Ladrillo samples the transient ratio with a prior of N(1.09, 0.180), equal to the CMIP6 ratio and between-model spread. The parameter’s leverage is strongly scenario-dependent: a one-sigma change moves Antarctic sea level at 2300 by about 58 cm on SSP2-4.5 (roughly 23% of that scenario's total) but only about 24 cm on SSP5-8.5 (under 5%), because SSP5-8.5 is already past the thresholds where amplification matters. Reverting to DAIS's 1.196 on the shipped posterior (fixed-driver arm) adds 17 cm to the SSP2-4.5 total at 2100 and 42 cm at 2300 (9 and 22 cm on SSP5-8.5).</w:t>
       </w:r>
     </w:p>
     <w:p>
@@ -2959,7 +2959,7 @@
         <w:t xml:space="preserve"> </w:t>
       </w:r>
       <w:r>
-        <w:t xml:space="preserve">Component hindcasts against the observations, 1900–2026, in cm relative to a 1995–2005 baseline. Ladrillo L24 (solid, with its 5–95% band) and BRICK 2.0 (dashed) are both run starting in 1850, plotted from 1900, and driven by the same ssp245harm forcing. The Greenland panel also shows MAGICC-SLR (v7.5.3 + Nauels 2025, dotted, with its 5–95% band) from 1991, the first year its Greenland module is active; it runs on its own emissions-driven climate. The total panel also shows IGCC 2025-indicators GMSL, which is not a calibration target. On the thermal-expansion panel the hatched band above the observation is the most the ocean below 2000 m could shift a 0–2000 m observation (IGCC deep-ocean heat times the observed upper-ocean expansion coefficient; an upper bound). Land-water storage is observational — neither model predicts it, so panel (e) shows the observed series alone and both totals include it.</w:t>
+        <w:t xml:space="preserve">Component hindcasts against the observations, 1900–2026, in cm relative to a 1995–2005 baseline. Ladrillo L24 (solid, with its 5–95% band) and BRICK 2.0 (dashed) are both run starting in 1850, plotted from 1900, and driven by the same ssp245harm forcing. The Greenland panel also shows MAGICC-SLR (v7.5.3 + Nauels 2025, dotted, with its 5–95% band) from 1991, the first year its Greenland module is active; it runs on its own emissions-driven climate. The total panel also shows IGCC 2025-indicators GMSL, which is not a calibration target. On the thermal-expansion panel the hatched band above the observation is the most the ocean below 2000 m could shift a 0–2000 m observation (IGCC deep-ocean heat times the observed upper-ocean expansion coefficient; an upper bound). Land-water storage is observational — neither model predicts it, so the land-water panel shows the observed series alone and both totals include it.</w:t>
       </w:r>
     </w:p>
     <w:p>
@@ -3536,7 +3536,7 @@
         <w:pStyle w:val="FirstParagraph"/>
       </w:pPr>
       <w:r>
-        <w:t xml:space="preserve">We report comparisons to both the van Vuuren scenarios and the SSPs. All Ladrillo bands are the joint (posterior × FaIR-forcing) arm, width-comparable to MAGICC and FACTS; BRICK 2.0's joint band uses the same cubes, splice pivot and pair seed. Bars are 17–83% (thick) and 5–95% (thin). All four sources carry climate uncertainty — Ladrillo and BRICK 2.0 from the 841 FaIR configs; FACTS from 200 of the same configs, injected as its climate file in place of its internal AR6-calibrated FaIR 1.6 ensemble, plus its modules' own sampling; MAGICC-SLR from its 600-member AR6 drawnset — so the widths are the same kind of object and are comparable; they are not the same ensemble, and both joint arms are prior propagations rather than refits, since each posterior was calibrated under fixed forcing. FACTS is reported relative to baseyear 2005, treated as comparable to the 1995–2014 mean, which is the standing convention for this comparison. In the trajectory figure the two arms share cubes, splice pivot, re-reference and pairing seed, so their widths are directly comparable, but Ladrillo is thinned to 8000 draws against BRICK 2.0's 1000.</w:t>
+        <w:t xml:space="preserve">We report comparisons to both the van Vuuren scenarios and the SSPs. All Ladrillo bands are the joint (posterior × FaIR-forcing) arm. Bars are 17–83% (thick) and 5–95% (thin). Ladrillo, BRICK, and FACTS have the same source of climate uncertainty (Ladrillo and BRICK 2.0 from the 841 FaIR configs with the same cubes, splice pivot, and pair seed; FACTS from 200 of the same configs, plus its modules' own sampling) whereas MAGICC-SLR relies on its own 600-member AR6 ensemble. FACTS is reported relative to base year 2005, treated as comparable to the 1995–2014 mean. FACTS's three emulandice workflows (Gaussian-process emulators of ISMIP6 and GlacierMIP2 output) end in 2100 by construction, so they appear only at that horizon on both scenario sets; its four other workflows run to 2300.</w:t>
       </w:r>
     </w:p>
     <w:p>
@@ -3544,7 +3544,7 @@
         <w:pStyle w:val="BodyText"/>
       </w:pPr>
       <w:r>
-        <w:t xml:space="preserve">On glaciers, Ladrillo and MAGICC-SLR share the Nauels 2017 transient, so differences between Ladrillo and MAGICC reflect differences in reservoir count, driver, and posterior; BRICK 2.0 and FACTS are independent there. At Greenland all four formulations differ. For Antarctica and thermal expansion Ladrillo and BRICK 2.0 share a formulation — DAIS for the ice sheet, and expansion proportional to ocean heat — and differ in calibration, while FACTS (LARMIP, DeConto, Bamber, AR5 and emulated ice-sheet modules; a two-layer expansion model) and MAGICC-SLR are separate on both.</w:t>
+        <w:t xml:space="preserve">On glaciers, Ladrillo and MAGICC-SLR share the Nauels 2017 transient, so differences between Ladrillo and MAGICC reflect differences in reservoir count, driver, and posterior; BRICK 2.0 and FACTS have independent modules. For Greenland all four formulations differ. For Antarctica Ladrillo and BRICK 2.0 share DAIS for the ice sheet though with different calibration sets, while FACTS (LARMIP, DeConto, Bamber, AR5 and emulated ice-sheet modules) and MAGICC-SLR differ. Ladrillo and BRICK 2.0 both use a proportional relationship between thermal expansion and ocean heat while FACTS uses a two-layer expansion model and MAGICC-SLR uses a 40-layer approach.</w:t>
       </w:r>
     </w:p>
     <w:p>
@@ -3609,7 +3609,7 @@
         <w:t xml:space="preserve"> </w:t>
       </w:r>
       <w:r>
-        <w:t xml:space="preserve">Ladrillo L24 compared against BRICK 2.0, FACTS and MAGICC-SLR across the seven van Vuuren scenarios at 2100, by component. FACTS is drawn per module; its four workflows differ only in the Antarctic module, so the Total panel shows them as one bracket spanning the workflow medians (thin line: the union of their 5–95%). At 2150 and 2300 (FIGs 3, 4 and 9) only FACTS's climate-driven modules are drawn.</w:t>
+        <w:t xml:space="preserve">Ladrillo L24 compared against BRICK 2.0, FACTS and MAGICC-SLR across the seven van Vuuren scenarios at 2100, by component. Each of FACTS's unique modules is shown; the Total panel shows its seven workflow totals as one bracket spanning their medians (thin line: the union of their 5–95%). The three emulandice workflows end at 2100; the other four differ only in the Antarctic module. At 2150 and 2300 (FIGs 3, 4 and 9) only FACTS's climate-driven modules are drawn.</w:t>
       </w:r>
     </w:p>
     <w:p>
@@ -3804,7 +3804,7 @@
         <w:t xml:space="preserve"> </w:t>
       </w:r>
       <w:r>
-        <w:t xml:space="preserve">Component trajectories across the van Vuuren scenarios, joint band, Ladrillo relative to BRICK2.0.</w:t>
+        <w:t xml:space="preserve">Component trajectories across the van Vuuren scenarios, joint band, Ladrillo relative to BRICK 2.0.</w:t>
       </w:r>
     </w:p>
     <w:p>
@@ -4257,7 +4257,7 @@
         <w:t xml:space="preserve"> </w:t>
       </w:r>
       <w:r>
-        <w:t xml:space="preserve">For the High scenario, the three models are fairly similar at 2100 (Ladrillo 72 cm, BRICK 2.0 82, MAGICC-SLR 62). By 2300 Ladrillo and BRICK 2.0 sit together (439 and 414 cm, median) well below MAGICC-SLR (570 cm), and the gap is due to Antarctica: 255 and 248 cm against MAGICC's 382. Driving both on MAGICC's own climate actually decreases their totals by 15–20 cm mainly due to thermal expansion (to 425 and 393; FIG 11), so the difference is the ice-sheet modules, not the climate. Ladrillo's 2300 Antarctic spread is dominated by the prior for</w:t>
+        <w:t xml:space="preserve">For the High scenario, the three models are fairly similar at 2100 (Ladrillo 72 cm, BRICK 2.0 82, MAGICC-SLR 62). By 2300 Ladrillo and BRICK 2.0 sit together (439 and 414 cm, median) well below MAGICC-SLR (570 cm), and the gap is due to Antarctica: 255 and 248 cm against MAGICC's 382. Driving both on MAGICC's own climate actually decreases their totals by 15–22 cm mainly due to thermal expansion (to 425 and 393; FIG 11), so the difference is the ice-sheet modules, not the climate. Ladrillo's 2300 Antarctic spread is dominated by the prior for</w:t>
       </w:r>
       <w:r>
         <w:t xml:space="preserve"> </w:t>
@@ -4269,7 +4269,7 @@
         <w:t xml:space="preserve">antarctic_lambda</w:t>
       </w:r>
       <w:r>
-        <w:t xml:space="preserve">, the DAIS fast-dynamics rate; BRICK 2.0 samples the same parameter from the same fast-dynamics ensemble (mean 0.0104, sd 0.0036 in both), which is why the two Antarctic spreads are alike (5–95% widths of 329 and 405 cm at SSP5-8.5 in 2300).</w:t>
+        <w:t xml:space="preserve">, the DAIS fast-dynamics rate; BRICK 2.0 samples the same parameter from the same fast-dynamics ensemble (mean 0.0105, sd 0.0033 in Ladrillo; 0.0104, 0.0036 in BRICK 2.0), which is why the two Antarctic spreads are alike (5–95% widths of 329 and 405 cm at SSP5-8.5 in 2300).</w:t>
       </w:r>
     </w:p>
     <w:p>

</xml_diff>

<commit_message>
Document: emulandice comparison subsection + FIG 12 (gsic_blocks_vs_emulandice_L24.png); sync FIGS list and build step extended
Co-Authored-By: Claude Opus 5 <noreply@anthropic.com>
</commit_message>
<xml_diff>
--- a/deliverables/LadrilloUpdateDescription_L24.docx
+++ b/deliverables/LadrilloUpdateDescription_L24.docx
@@ -2,7 +2,7 @@
 <file path=word/document.xml><?xml version="1.0" encoding="utf-8"?>
 <w:document xmlns:w="http://schemas.openxmlformats.org/wordprocessingml/2006/main" xmlns:m="http://schemas.openxmlformats.org/officeDocument/2006/math" xmlns:r="http://schemas.openxmlformats.org/officeDocument/2006/relationships" xmlns:o="urn:schemas-microsoft-com:office:office" xmlns:v="urn:schemas-microsoft-com:vml" xmlns:w10="urn:schemas-microsoft-com:office:word" xmlns:a="http://schemas.openxmlformats.org/drawingml/2006/main" xmlns:pic="http://schemas.openxmlformats.org/drawingml/2006/picture" xmlns:wp="http://schemas.openxmlformats.org/drawingml/2006/wordprocessingDrawing">
   <w:body>
-    <w:bookmarkStart w:id="52" w:name="ladrillo-sea-level-rise-emulator"/>
+    <w:bookmarkStart w:id="56" w:name="ladrillo-sea-level-rise-emulator"/>
     <w:p>
       <w:pPr>
         <w:pStyle w:val="Heading1"/>
@@ -3819,7 +3819,7 @@
       </w:r>
     </w:p>
     <w:bookmarkEnd w:id="17"/>
-    <w:bookmarkStart w:id="51" w:name="ladrillo-projection-comparison"/>
+    <w:bookmarkStart w:id="55" w:name="ladrillo-projection-comparison"/>
     <w:p>
       <w:pPr>
         <w:pStyle w:val="Heading2"/>
@@ -4562,69 +4562,134 @@
       </w:r>
     </w:p>
     <w:bookmarkEnd w:id="49"/>
-    <w:bookmarkStart w:id="50" w:name="Xb1f1a1c0c28d67f2c08db4461f961e4b25b61a7"/>
+    <w:bookmarkStart w:id="53" w:name="X27c46f1d5c2d31159d02dda307a152000721bb1"/>
     <w:p>
       <w:pPr>
         <w:pStyle w:val="Heading3"/>
       </w:pPr>
       <w:r>
-        <w:t xml:space="preserve">Physical intuition — how Ladrillo behaves by scenario class</w:t>
+        <w:t xml:space="preserve">Ladrillo's glaciers against emulandice on the same climate</w:t>
       </w:r>
     </w:p>
     <w:p>
       <w:pPr>
         <w:pStyle w:val="FirstParagraph"/>
+      </w:pPr>
+      <w:r>
+        <w:t xml:space="preserve">FACTS's emulandice glacier module (Gaussian-process emulators of the GlacierMIP2 transient runs, one per RGI region, GSAT-driven, 2015–2100) was run on the same 200 FaIR configurations as Ladrillo, so the two can be compared sample by sample, with its regions summed to Ladrillo's blocks and RGI 05 excluded (FIG 12). At 2100 Ladrillo's glacier melt since 2005 is 13% below emulandice on every scenario (SSP2-4.5: 9.9 vs 11.3 cm); the deficit is confined to SLOWG (0.74×) and RGI 19 (0.45×) while FASTG runs 1.13×; the two agree at 2020 and diverge thereafter; and every paired 5–95% range spans zero. Replacing Ladrillo's fitted amplifications with the CMIP6 regional ratios does not close the gap (SLOWG falls to 0.60×, RGI 19 rises only to 0.61×), so it lies in the block dynamics rather than the driver. Aggregation is not the cause either: GlacierMIP3's per-region response times put the single-timescale bias at 8% for SLOWG and zero for RGI 19, which is a single region. What remains is the source of the timescales (GlacierMIP3's equilibrium anchors against GlacierMIP2's transients) and the inventory basis (emulandice reports the GlacierMIP2 models' own volumes), which have not been separated.</w:t>
+      </w:r>
+    </w:p>
+    <w:p>
+      <w:pPr>
+        <w:pStyle w:val="BodyText"/>
+      </w:pPr>
+      <w:r>
+        <w:drawing>
+          <wp:inline>
+            <wp:extent cx="5334000" cy="3437466"/>
+            <wp:effectExtent b="0" l="0" r="0" t="0"/>
+            <wp:docPr descr="Ladrillo glacier blocks vs emulandice on the same 200 FaIR configs" title="" id="51" name="Picture"/>
+            <a:graphic>
+              <a:graphicData uri="http://schemas.openxmlformats.org/drawingml/2006/picture">
+                <pic:pic>
+                  <pic:nvPicPr>
+                    <pic:cNvPr descr="figures/gsic_blocks_vs_emulandice_L24.png" id="52" name="Picture"/>
+                    <pic:cNvPicPr>
+                      <a:picLocks noChangeArrowheads="1" noChangeAspect="1"/>
+                    </pic:cNvPicPr>
+                  </pic:nvPicPr>
+                  <pic:blipFill>
+                    <a:blip r:embed="rId50"/>
+                    <a:stretch>
+                      <a:fillRect/>
+                    </a:stretch>
+                  </pic:blipFill>
+                  <pic:spPr bwMode="auto">
+                    <a:xfrm>
+                      <a:off x="0" y="0"/>
+                      <a:ext cx="5334000" cy="3437466"/>
+                    </a:xfrm>
+                    <a:prstGeom prst="rect">
+                      <a:avLst/>
+                    </a:prstGeom>
+                    <a:noFill/>
+                    <a:ln w="9525">
+                      <a:noFill/>
+                      <a:headEnd/>
+                      <a:tailEnd/>
+                    </a:ln>
+                  </pic:spPr>
+                </pic:pic>
+              </a:graphicData>
+            </a:graphic>
+          </wp:inline>
+        </w:drawing>
+      </w:r>
+    </w:p>
+    <w:p>
+      <w:pPr>
+        <w:pStyle w:val="BodyText"/>
       </w:pPr>
       <w:r>
         <w:rPr>
           <w:b/>
           <w:bCs/>
         </w:rPr>
-        <w:t xml:space="preserve">High scenarios.</w:t>
-      </w:r>
-      <w:r>
-        <w:t xml:space="preserve"> </w:t>
-      </w:r>
-      <w:r>
-        <w:t xml:space="preserve">For the High scenario, the three models are fairly similar at 2100 (Ladrillo 72 cm, BRICK 2.0 82, MAGICC-SLR 62). By 2300 Ladrillo and BRICK 2.0 sit together (439 and 414 cm, median) well below MAGICC-SLR (570 cm), and the gap is due to Antarctica: 255 and 248 cm against MAGICC's 382. Driving both on MAGICC's own climate actually decreases their totals by 15–22 cm mainly due to thermal expansion (to 425 and 393; FIG 11), so the difference is the ice-sheet modules, not the climate.</w:t>
-      </w:r>
-    </w:p>
-    <w:p>
-      <w:pPr>
-        <w:pStyle w:val="BodyText"/>
-      </w:pPr>
-      <w:r>
-        <w:t xml:space="preserve">Ladrillo's 2300 Antarctic spread is dominated by the prior for</w:t>
-      </w:r>
-      <w:r>
-        <w:t xml:space="preserve"> </w:t>
-      </w:r>
-      <w:r>
-        <w:rPr>
-          <w:rStyle w:val="VerbatimChar"/>
-        </w:rPr>
-        <w:t xml:space="preserve">antarctic_lambda</w:t>
-      </w:r>
-      <w:r>
-        <w:t xml:space="preserve">, the DAIS fast-dynamics rate; BRICK 2.0 samples the same parameter from the same fast-dynamics ensemble (mean 0.0105, sd 0.0033 in Ladrillo; 0.0104, 0.0036 in BRICK 2.0), which is why the two Antarctic spreads are alike (5–95% widths of 329 and 405 cm at SSP5-8.5 in 2300).</w:t>
-      </w:r>
-    </w:p>
-    <w:p>
-      <w:pPr>
-        <w:pStyle w:val="BodyText"/>
+        <w:t xml:space="preserve">FIG 12.</w:t>
+      </w:r>
+      <w:r>
+        <w:t xml:space="preserve"> </w:t>
+      </w:r>
+      <w:r>
+        <w:t xml:space="preserve">Glacier melt since 2005 by block, Ladrillo L24 (posterior draw k on shared configuration k) against FACTS emulandice on the same 200 FaIR configurations: median and 5–95% over the matched samples, 2020–2100, on the three SSPs and the two van Vuuren extremes. emulandice's per-region outputs are summed to Ladrillo's blocks; RGI 05 is dropped from emulandice because Ladrillo carries it in the Greenland ice sheet.</w:t>
+      </w:r>
+    </w:p>
+    <w:bookmarkEnd w:id="53"/>
+    <w:bookmarkStart w:id="54" w:name="Xb1f1a1c0c28d67f2c08db4461f961e4b25b61a7"/>
+    <w:p>
+      <w:pPr>
+        <w:pStyle w:val="Heading3"/>
+      </w:pPr>
+      <w:r>
+        <w:t xml:space="preserve">Physical intuition — how Ladrillo behaves by scenario class</w:t>
+      </w:r>
+    </w:p>
+    <w:p>
+      <w:pPr>
+        <w:pStyle w:val="FirstParagraph"/>
       </w:pPr>
       <w:r>
         <w:rPr>
           <w:b/>
           <w:bCs/>
         </w:rPr>
-        <w:t xml:space="preserve">Low scenarios.</w:t>
-      </w:r>
-      <w:r>
-        <w:t xml:space="preserve"> </w:t>
-      </w:r>
-      <w:r>
-        <w:t xml:space="preserve">Ladrillo sits at the low end of the comparison set on level — at vvVL its 2300 total median is 58 cm, above only MAGICC-SLR's 46 cm and below BRICK 2.0's 81. On spread it is narrower than BRICK 2.0 on every component and narrower than the FACTS glacier and thermal-expansion modules (the only FACTS modules drawn at 2300); MAGICC-SLR is the narrow outlier throughout (2300 total 5–95% width 67 cm against Ladrillo's 163 and BRICK 2.0's 182).</w:t>
+        <w:t xml:space="preserve">High scenarios.</w:t>
+      </w:r>
+      <w:r>
+        <w:t xml:space="preserve"> </w:t>
+      </w:r>
+      <w:r>
+        <w:t xml:space="preserve">For the High scenario, the three models are fairly similar at 2100 (Ladrillo 72 cm, BRICK 2.0 82, MAGICC-SLR 62). By 2300 Ladrillo and BRICK 2.0 sit together (439 and 414 cm, median) well below MAGICC-SLR (570 cm), and the gap is due to Antarctica: 255 and 248 cm against MAGICC's 382. Driving both on MAGICC's own climate actually decreases their totals by 15–22 cm mainly due to thermal expansion (to 425 and 393; FIG 11), so the difference is the ice-sheet modules, not the climate.</w:t>
+      </w:r>
+    </w:p>
+    <w:p>
+      <w:pPr>
+        <w:pStyle w:val="BodyText"/>
+      </w:pPr>
+      <w:r>
+        <w:t xml:space="preserve">Ladrillo's 2300 Antarctic spread is dominated by the prior for</w:t>
+      </w:r>
+      <w:r>
+        <w:t xml:space="preserve"> </w:t>
+      </w:r>
+      <w:r>
+        <w:rPr>
+          <w:rStyle w:val="VerbatimChar"/>
+        </w:rPr>
+        <w:t xml:space="preserve">antarctic_lambda</w:t>
+      </w:r>
+      <w:r>
+        <w:t xml:space="preserve">, the DAIS fast-dynamics rate; BRICK 2.0 samples the same parameter from the same fast-dynamics ensemble (mean 0.0105, sd 0.0033 in Ladrillo; 0.0104, 0.0036 in BRICK 2.0), which is why the two Antarctic spreads are alike (5–95% widths of 329 and 405 cm at SSP5-8.5 in 2300).</w:t>
       </w:r>
     </w:p>
     <w:p>
@@ -4636,13 +4701,13 @@
           <w:b/>
           <w:bCs/>
         </w:rPr>
-        <w:t xml:space="preserve">Peak-and-decline scenarios.</w:t>
-      </w:r>
-      <w:r>
-        <w:t xml:space="preserve"> </w:t>
-      </w:r>
-      <w:r>
-        <w:t xml:space="preserve">The glacier change is evident here because it allows regrowth, though on Ladrillo's own FaIR climate that regrowth is very small: measured from each scenario’s peak to 2300, it reaches only 0.18 cm at vvLN and 0.13 cm at vvML, and is essentially nil on the other scenarios. The capacity is larger than the realised amount — driven instead by MAGICC's colder climate, the same module regrows 2.2 cm at vvLN — so what limits regrowth here is how far the scenario cools, not the module's willingness to regrow.</w:t>
+        <w:t xml:space="preserve">Low scenarios.</w:t>
+      </w:r>
+      <w:r>
+        <w:t xml:space="preserve"> </w:t>
+      </w:r>
+      <w:r>
+        <w:t xml:space="preserve">Ladrillo sits at the low end of the comparison set on level — at vvVL its 2300 total median is 58 cm, above only MAGICC-SLR's 46 cm and below BRICK 2.0's 81. On spread it is narrower than BRICK 2.0 on every component and narrower than the FACTS glacier and thermal-expansion modules (the only FACTS modules drawn at 2300); MAGICC-SLR is the narrow outlier throughout (2300 total 5–95% width 67 cm against Ladrillo's 163 and BRICK 2.0's 182).</w:t>
       </w:r>
     </w:p>
     <w:p>
@@ -4654,6 +4719,24 @@
           <w:b/>
           <w:bCs/>
         </w:rPr>
+        <w:t xml:space="preserve">Peak-and-decline scenarios.</w:t>
+      </w:r>
+      <w:r>
+        <w:t xml:space="preserve"> </w:t>
+      </w:r>
+      <w:r>
+        <w:t xml:space="preserve">The glacier change is evident here because it allows regrowth, though on Ladrillo's own FaIR climate that regrowth is very small: measured from each scenario’s peak to 2300, it reaches only 0.18 cm at vvLN and 0.13 cm at vvML, and is essentially nil on the other scenarios. The capacity is larger than the realised amount — driven instead by MAGICC's colder climate, the same module regrows 2.2 cm at vvLN — so what limits regrowth here is how far the scenario cools, not the module's willingness to regrow.</w:t>
+      </w:r>
+    </w:p>
+    <w:p>
+      <w:pPr>
+        <w:pStyle w:val="BodyText"/>
+      </w:pPr>
+      <w:r>
+        <w:rPr>
+          <w:b/>
+          <w:bCs/>
+        </w:rPr>
         <w:t xml:space="preserve">MAGICC regrows substantially more than Ladrillo.</w:t>
       </w:r>
       <w:r>
@@ -4671,9 +4754,9 @@
         <w:t xml:space="preserve">When driving the two models with MAGICC’s own temperature, Ladrillo’s committed equilibrium regrowth is also somewhat less than MAGICC’s, but MAGICC reaches its regrowth limits in the two coldest van Vuuren scenarios. So while the gap with MAGICC is mainly a rate effect (at 1.5 K the SLOWG and RGI 19 regions have median response times of ~270 yr and ~470 yr, the latter very poorly constrained at 80–3200 yr across the posterior; all three blocks respond about three times faster at 3 K) this rate effect is compounded by an equilibrium effect.</w:t>
       </w:r>
     </w:p>
-    <w:bookmarkEnd w:id="50"/>
-    <w:bookmarkEnd w:id="51"/>
-    <w:bookmarkEnd w:id="52"/>
+    <w:bookmarkEnd w:id="54"/>
+    <w:bookmarkEnd w:id="55"/>
+    <w:bookmarkEnd w:id="56"/>
     <w:sectPr>
       <w:footnotePr>
         <w:numRestart w:val="eachSect"/>

</xml_diff>